<commit_message>
added my observations for september from checking both the reports and the sheet
</commit_message>
<xml_diff>
--- a/data/notes/observation notes.docx
+++ b/data/notes/observation notes.docx
@@ -24,6 +24,41 @@
           <w:szCs w:val="32"/>
         </w:rPr>
         <w:t>FAAC_SEPT_24</w:t>
+      </w:r>
+      <w:r>
+        <w:rPr>
+          <w:rFonts w:ascii="Times New Roman" w:hAnsi="Times New Roman" w:cs="Times New Roman"/>
+          <w:b/>
+          <w:bCs/>
+          <w:color w:val="auto"/>
+          <w:sz w:val="32"/>
+          <w:szCs w:val="32"/>
+        </w:rPr>
+        <w:t xml:space="preserve"> REPORT</w:t>
+      </w:r>
+    </w:p>
+    <w:p>
+      <w:pPr>
+        <w:pStyle w:val="Default"/>
+        <w:rPr>
+          <w:rFonts w:ascii="Times New Roman" w:hAnsi="Times New Roman" w:cs="Times New Roman"/>
+          <w:b/>
+          <w:bCs/>
+          <w:color w:val="auto"/>
+          <w:sz w:val="32"/>
+          <w:szCs w:val="32"/>
+        </w:rPr>
+      </w:pPr>
+      <w:r>
+        <w:rPr>
+          <w:rFonts w:ascii="Times New Roman" w:hAnsi="Times New Roman" w:cs="Times New Roman"/>
+          <w:b/>
+          <w:bCs/>
+          <w:color w:val="auto"/>
+          <w:sz w:val="32"/>
+          <w:szCs w:val="32"/>
+        </w:rPr>
+        <w:t>PDF</w:t>
       </w:r>
       <w:r>
         <w:rPr>
@@ -329,7 +364,6 @@
                 <w:sz w:val="12"/>
                 <w:szCs w:val="12"/>
               </w:rPr>
-              <w:lastRenderedPageBreak/>
               <w:t xml:space="preserve">Summary of Gross Revenue Allocation by Federation Account Allocation Committee for the Month of August, 2024 Shared in September, 2024 </w:t>
             </w:r>
           </w:p>
@@ -14730,9 +14764,612 @@
     <w:p/>
     <w:p/>
     <w:p>
+      <w:pPr>
+        <w:pStyle w:val="Default"/>
+        <w:rPr>
+          <w:rFonts w:ascii="Times New Roman" w:hAnsi="Times New Roman" w:cs="Times New Roman"/>
+          <w:b/>
+          <w:bCs/>
+          <w:color w:val="auto"/>
+          <w:sz w:val="32"/>
+          <w:szCs w:val="32"/>
+        </w:rPr>
+      </w:pPr>
+      <w:r>
+        <w:rPr>
+          <w:rFonts w:ascii="Times New Roman" w:hAnsi="Times New Roman" w:cs="Times New Roman"/>
+          <w:b/>
+          <w:bCs/>
+          <w:color w:val="auto"/>
+          <w:sz w:val="32"/>
+          <w:szCs w:val="32"/>
+        </w:rPr>
+        <w:lastRenderedPageBreak/>
+        <w:t>Disbursement September 2024</w:t>
+      </w:r>
+    </w:p>
+    <w:p>
+      <w:pPr>
+        <w:pStyle w:val="Default"/>
+        <w:rPr>
+          <w:rFonts w:ascii="Times New Roman" w:hAnsi="Times New Roman" w:cs="Times New Roman"/>
+          <w:b/>
+          <w:bCs/>
+          <w:color w:val="auto"/>
+          <w:sz w:val="32"/>
+          <w:szCs w:val="32"/>
+        </w:rPr>
+      </w:pPr>
+      <w:r>
+        <w:rPr>
+          <w:rFonts w:ascii="Times New Roman" w:hAnsi="Times New Roman" w:cs="Times New Roman"/>
+          <w:b/>
+          <w:bCs/>
+          <w:color w:val="auto"/>
+          <w:sz w:val="32"/>
+          <w:szCs w:val="32"/>
+        </w:rPr>
+        <w:t>Excel spreadsheet</w:t>
+      </w:r>
+      <w:r>
+        <w:rPr>
+          <w:rFonts w:ascii="Times New Roman" w:hAnsi="Times New Roman" w:cs="Times New Roman"/>
+          <w:b/>
+          <w:bCs/>
+          <w:color w:val="auto"/>
+          <w:sz w:val="32"/>
+          <w:szCs w:val="32"/>
+        </w:rPr>
+        <w:br/>
+      </w:r>
+    </w:p>
+    <w:p>
+      <w:pPr>
+        <w:pStyle w:val="Default"/>
+        <w:rPr>
+          <w:rFonts w:ascii="Times New Roman" w:hAnsi="Times New Roman" w:cs="Times New Roman"/>
+          <w:b/>
+          <w:bCs/>
+          <w:color w:val="auto"/>
+          <w:sz w:val="32"/>
+          <w:szCs w:val="32"/>
+        </w:rPr>
+      </w:pPr>
+      <w:r>
+        <w:rPr>
+          <w:rFonts w:ascii="Times New Roman" w:hAnsi="Times New Roman" w:cs="Times New Roman"/>
+          <w:b/>
+          <w:bCs/>
+          <w:color w:val="auto"/>
+          <w:sz w:val="32"/>
+          <w:szCs w:val="32"/>
+        </w:rPr>
+        <w:t>Sheet 1 – Sum &amp; FG</w:t>
+      </w:r>
+    </w:p>
+    <w:p>
+      <w:pPr>
+        <w:pStyle w:val="Default"/>
+        <w:rPr>
+          <w:rFonts w:ascii="Times New Roman" w:hAnsi="Times New Roman" w:cs="Times New Roman"/>
+          <w:bCs/>
+          <w:color w:val="auto"/>
+        </w:rPr>
+      </w:pPr>
+      <w:r>
+        <w:rPr>
+          <w:rFonts w:ascii="Times New Roman" w:hAnsi="Times New Roman" w:cs="Times New Roman"/>
+          <w:bCs/>
+          <w:color w:val="auto"/>
+        </w:rPr>
+        <w:t xml:space="preserve">This sheet contains the summary of gross revenue allocation by federation account allocation </w:t>
+      </w:r>
+      <w:proofErr w:type="gramStart"/>
+      <w:r>
+        <w:rPr>
+          <w:rFonts w:ascii="Times New Roman" w:hAnsi="Times New Roman" w:cs="Times New Roman"/>
+          <w:bCs/>
+          <w:color w:val="auto"/>
+        </w:rPr>
+        <w:t>committee(</w:t>
+      </w:r>
+      <w:proofErr w:type="gramEnd"/>
+      <w:r>
+        <w:rPr>
+          <w:rFonts w:ascii="Times New Roman" w:hAnsi="Times New Roman" w:cs="Times New Roman"/>
+          <w:bCs/>
+          <w:color w:val="auto"/>
+        </w:rPr>
+        <w:t>for the money gotten in august shared in September)</w:t>
+      </w:r>
+    </w:p>
+    <w:p>
+      <w:pPr>
+        <w:pStyle w:val="Default"/>
+        <w:rPr>
+          <w:rFonts w:ascii="Times New Roman" w:hAnsi="Times New Roman" w:cs="Times New Roman"/>
+          <w:bCs/>
+          <w:color w:val="auto"/>
+        </w:rPr>
+      </w:pPr>
+    </w:p>
+    <w:p>
+      <w:pPr>
+        <w:pStyle w:val="Default"/>
+        <w:rPr>
+          <w:rFonts w:ascii="Times New Roman" w:hAnsi="Times New Roman" w:cs="Times New Roman"/>
+          <w:bCs/>
+          <w:color w:val="auto"/>
+        </w:rPr>
+      </w:pPr>
+      <w:r>
+        <w:rPr>
+          <w:rFonts w:ascii="Times New Roman" w:hAnsi="Times New Roman" w:cs="Times New Roman"/>
+          <w:bCs/>
+          <w:color w:val="auto"/>
+        </w:rPr>
+        <w:t>TABLE 1</w:t>
+      </w:r>
+    </w:p>
+    <w:p>
+      <w:pPr>
+        <w:pStyle w:val="Default"/>
+        <w:rPr>
+          <w:rFonts w:ascii="Times New Roman" w:hAnsi="Times New Roman" w:cs="Times New Roman"/>
+          <w:bCs/>
+          <w:color w:val="auto"/>
+        </w:rPr>
+      </w:pPr>
+    </w:p>
+    <w:p>
+      <w:pPr>
+        <w:spacing w:line="240" w:lineRule="auto"/>
+        <w:rPr>
+          <w:rFonts w:ascii="Times New Roman" w:eastAsia="Times New Roman" w:hAnsi="Times New Roman" w:cs="Times New Roman"/>
+          <w:bCs/>
+          <w:sz w:val="24"/>
+          <w:szCs w:val="24"/>
+        </w:rPr>
+      </w:pPr>
+      <w:r>
+        <w:rPr>
+          <w:rFonts w:ascii="Times New Roman" w:hAnsi="Times New Roman" w:cs="Times New Roman"/>
+          <w:bCs/>
+        </w:rPr>
+        <w:t xml:space="preserve">It states that Federal government </w:t>
+      </w:r>
+      <w:r>
+        <w:rPr>
+          <w:rFonts w:ascii="Times New Roman" w:hAnsi="Times New Roman" w:cs="Times New Roman"/>
+          <w:bCs/>
+          <w:sz w:val="24"/>
+          <w:szCs w:val="24"/>
+        </w:rPr>
+        <w:t xml:space="preserve">got </w:t>
+      </w:r>
+      <w:proofErr w:type="gramStart"/>
+      <w:r>
+        <w:rPr>
+          <w:rFonts w:ascii="Times New Roman" w:eastAsia="Times New Roman" w:hAnsi="Times New Roman" w:cs="Times New Roman"/>
+          <w:bCs/>
+          <w:sz w:val="24"/>
+          <w:szCs w:val="24"/>
+        </w:rPr>
+        <w:t>2,252,589,356.67</w:t>
+      </w:r>
+      <w:r>
+        <w:rPr>
+          <w:rFonts w:ascii="Times New Roman" w:eastAsia="Times New Roman" w:hAnsi="Times New Roman" w:cs="Times New Roman"/>
+          <w:b/>
+          <w:bCs/>
+          <w:sz w:val="32"/>
+          <w:szCs w:val="32"/>
+        </w:rPr>
+        <w:t xml:space="preserve"> </w:t>
+      </w:r>
+      <w:r>
+        <w:rPr>
+          <w:rFonts w:ascii="Times New Roman" w:eastAsia="Times New Roman" w:hAnsi="Times New Roman" w:cs="Times New Roman"/>
+          <w:bCs/>
+          <w:sz w:val="24"/>
+          <w:szCs w:val="24"/>
+        </w:rPr>
+        <w:t xml:space="preserve"> N</w:t>
+      </w:r>
+      <w:r>
+        <w:rPr>
+          <w:rFonts w:ascii="Times New Roman" w:eastAsia="Times New Roman" w:hAnsi="Times New Roman" w:cs="Times New Roman"/>
+          <w:bCs/>
+          <w:sz w:val="24"/>
+          <w:szCs w:val="24"/>
+        </w:rPr>
+        <w:t>aira</w:t>
+      </w:r>
+      <w:proofErr w:type="gramEnd"/>
+      <w:r>
+        <w:rPr>
+          <w:rFonts w:ascii="Times New Roman" w:eastAsia="Times New Roman" w:hAnsi="Times New Roman" w:cs="Times New Roman"/>
+          <w:bCs/>
+          <w:sz w:val="24"/>
+          <w:szCs w:val="24"/>
+        </w:rPr>
+        <w:t xml:space="preserve"> from what was gotten from EMTL</w:t>
+      </w:r>
+    </w:p>
+    <w:p>
+      <w:pPr>
+        <w:spacing w:line="240" w:lineRule="auto"/>
+        <w:rPr>
+          <w:rFonts w:ascii="Times New Roman" w:eastAsia="Times New Roman" w:hAnsi="Times New Roman" w:cs="Times New Roman"/>
+          <w:bCs/>
+          <w:sz w:val="24"/>
+          <w:szCs w:val="24"/>
+        </w:rPr>
+      </w:pPr>
+      <w:r>
+        <w:rPr>
+          <w:rFonts w:ascii="Times New Roman" w:eastAsia="Times New Roman" w:hAnsi="Times New Roman" w:cs="Times New Roman"/>
+          <w:bCs/>
+          <w:sz w:val="24"/>
+          <w:szCs w:val="24"/>
+        </w:rPr>
+        <w:t xml:space="preserve">State got </w:t>
+      </w:r>
+      <w:r>
+        <w:rPr>
+          <w:rFonts w:ascii="Times New Roman" w:eastAsia="Times New Roman" w:hAnsi="Times New Roman" w:cs="Times New Roman"/>
+          <w:bCs/>
+          <w:sz w:val="24"/>
+          <w:szCs w:val="24"/>
+        </w:rPr>
+        <w:t>7508631188.89</w:t>
+      </w:r>
+    </w:p>
+    <w:p>
+      <w:pPr>
+        <w:spacing w:line="240" w:lineRule="auto"/>
+        <w:rPr>
+          <w:rFonts w:ascii="Times New Roman" w:eastAsia="Times New Roman" w:hAnsi="Times New Roman" w:cs="Times New Roman"/>
+          <w:bCs/>
+          <w:sz w:val="24"/>
+          <w:szCs w:val="24"/>
+        </w:rPr>
+      </w:pPr>
+      <w:r>
+        <w:rPr>
+          <w:rFonts w:ascii="Times New Roman" w:eastAsia="Times New Roman" w:hAnsi="Times New Roman" w:cs="Times New Roman"/>
+          <w:bCs/>
+          <w:sz w:val="24"/>
+          <w:szCs w:val="24"/>
+        </w:rPr>
+        <w:t>LGCs Local government got</w:t>
+      </w:r>
+      <w:r>
+        <w:rPr>
+          <w:rFonts w:ascii="Times New Roman" w:eastAsia="Times New Roman" w:hAnsi="Times New Roman" w:cs="Times New Roman"/>
+          <w:b/>
+          <w:bCs/>
+          <w:sz w:val="32"/>
+          <w:szCs w:val="32"/>
+        </w:rPr>
+        <w:t xml:space="preserve"> </w:t>
+      </w:r>
+      <w:r>
+        <w:rPr>
+          <w:rFonts w:ascii="Times New Roman" w:eastAsia="Times New Roman" w:hAnsi="Times New Roman" w:cs="Times New Roman"/>
+          <w:bCs/>
+          <w:sz w:val="24"/>
+          <w:szCs w:val="24"/>
+        </w:rPr>
+        <w:t xml:space="preserve">5,256,041,832.22 </w:t>
+      </w:r>
+    </w:p>
+    <w:p>
+      <w:pPr>
+        <w:spacing w:line="240" w:lineRule="auto"/>
+        <w:rPr>
+          <w:rFonts w:ascii="Times New Roman" w:eastAsia="Times New Roman" w:hAnsi="Times New Roman" w:cs="Times New Roman"/>
+          <w:bCs/>
+          <w:sz w:val="24"/>
+          <w:szCs w:val="24"/>
+        </w:rPr>
+      </w:pPr>
+      <w:r>
+        <w:rPr>
+          <w:rFonts w:ascii="Times New Roman" w:eastAsia="Times New Roman" w:hAnsi="Times New Roman" w:cs="Times New Roman"/>
+          <w:bCs/>
+          <w:sz w:val="24"/>
+          <w:szCs w:val="24"/>
+        </w:rPr>
+        <w:t xml:space="preserve">Cost of Collections </w:t>
+      </w:r>
+      <w:r>
+        <w:rPr>
+          <w:rFonts w:ascii="Times New Roman" w:eastAsia="Times New Roman" w:hAnsi="Times New Roman" w:cs="Times New Roman"/>
+          <w:bCs/>
+          <w:sz w:val="24"/>
+          <w:szCs w:val="24"/>
+        </w:rPr>
+        <w:t>–</w:t>
+      </w:r>
+      <w:r>
+        <w:rPr>
+          <w:rFonts w:ascii="Times New Roman" w:eastAsia="Times New Roman" w:hAnsi="Times New Roman" w:cs="Times New Roman"/>
+          <w:bCs/>
+          <w:sz w:val="24"/>
+          <w:szCs w:val="24"/>
+        </w:rPr>
+        <w:t xml:space="preserve"> FIRS</w:t>
+      </w:r>
+      <w:r>
+        <w:rPr>
+          <w:rFonts w:ascii="Times New Roman" w:eastAsia="Times New Roman" w:hAnsi="Times New Roman" w:cs="Times New Roman"/>
+          <w:bCs/>
+          <w:sz w:val="24"/>
+          <w:szCs w:val="24"/>
+        </w:rPr>
+        <w:t xml:space="preserve"> was </w:t>
+      </w:r>
+      <w:r>
+        <w:rPr>
+          <w:rFonts w:ascii="Times New Roman" w:eastAsia="Times New Roman" w:hAnsi="Times New Roman" w:cs="Times New Roman"/>
+          <w:bCs/>
+          <w:sz w:val="24"/>
+          <w:szCs w:val="24"/>
+        </w:rPr>
+        <w:t>625719265.74</w:t>
+      </w:r>
+    </w:p>
+    <w:p>
+      <w:pPr>
+        <w:spacing w:line="240" w:lineRule="auto"/>
+        <w:rPr>
+          <w:rFonts w:ascii="Times New Roman" w:eastAsia="Times New Roman" w:hAnsi="Times New Roman" w:cs="Times New Roman"/>
+          <w:b/>
+          <w:bCs/>
+          <w:sz w:val="32"/>
+          <w:szCs w:val="32"/>
+        </w:rPr>
+      </w:pPr>
+      <w:r>
+        <w:rPr>
+          <w:rFonts w:ascii="Times New Roman" w:eastAsia="Times New Roman" w:hAnsi="Times New Roman" w:cs="Times New Roman"/>
+          <w:bCs/>
+          <w:sz w:val="24"/>
+          <w:szCs w:val="24"/>
+        </w:rPr>
+        <w:t>The total was</w:t>
+      </w:r>
+      <w:r>
+        <w:rPr>
+          <w:rFonts w:ascii="Times New Roman" w:eastAsia="Times New Roman" w:hAnsi="Times New Roman" w:cs="Times New Roman"/>
+          <w:b/>
+          <w:bCs/>
+          <w:sz w:val="32"/>
+          <w:szCs w:val="32"/>
+        </w:rPr>
+        <w:t xml:space="preserve"> </w:t>
+      </w:r>
+      <w:r>
+        <w:rPr>
+          <w:rFonts w:ascii="Times New Roman" w:eastAsia="Times New Roman" w:hAnsi="Times New Roman" w:cs="Times New Roman"/>
+          <w:bCs/>
+          <w:sz w:val="24"/>
+          <w:szCs w:val="24"/>
+        </w:rPr>
+        <w:t>15,642,981,643.52</w:t>
+      </w:r>
+      <w:r>
+        <w:rPr>
+          <w:rFonts w:ascii="Times New Roman" w:eastAsia="Times New Roman" w:hAnsi="Times New Roman" w:cs="Times New Roman"/>
+          <w:b/>
+          <w:bCs/>
+          <w:sz w:val="32"/>
+          <w:szCs w:val="32"/>
+        </w:rPr>
+        <w:t xml:space="preserve"> </w:t>
+      </w:r>
+    </w:p>
+    <w:p>
+      <w:pPr>
+        <w:spacing w:line="240" w:lineRule="auto"/>
+        <w:rPr>
+          <w:rFonts w:ascii="Times New Roman" w:eastAsia="Times New Roman" w:hAnsi="Times New Roman" w:cs="Times New Roman"/>
+          <w:bCs/>
+          <w:sz w:val="24"/>
+          <w:szCs w:val="24"/>
+        </w:rPr>
+      </w:pPr>
+    </w:p>
+    <w:p>
+      <w:pPr>
+        <w:spacing w:line="240" w:lineRule="auto"/>
+        <w:rPr>
+          <w:rFonts w:ascii="Times New Roman" w:eastAsia="Times New Roman" w:hAnsi="Times New Roman" w:cs="Times New Roman"/>
+          <w:bCs/>
+          <w:sz w:val="24"/>
+          <w:szCs w:val="24"/>
+        </w:rPr>
+      </w:pPr>
+      <w:r>
+        <w:rPr>
+          <w:rFonts w:ascii="Times New Roman" w:eastAsia="Times New Roman" w:hAnsi="Times New Roman" w:cs="Times New Roman"/>
+          <w:bCs/>
+          <w:sz w:val="24"/>
+          <w:szCs w:val="24"/>
+        </w:rPr>
+        <w:t xml:space="preserve">TABLE 2 </w:t>
+      </w:r>
+    </w:p>
+    <w:p>
+      <w:pPr>
+        <w:spacing w:line="240" w:lineRule="auto"/>
+        <w:rPr>
+          <w:rFonts w:ascii="Times New Roman" w:eastAsia="Times New Roman" w:hAnsi="Times New Roman" w:cs="Times New Roman"/>
+          <w:bCs/>
+          <w:sz w:val="24"/>
+          <w:szCs w:val="24"/>
+        </w:rPr>
+      </w:pPr>
+      <w:r>
+        <w:rPr>
+          <w:rFonts w:ascii="Times New Roman" w:eastAsia="Times New Roman" w:hAnsi="Times New Roman" w:cs="Times New Roman"/>
+          <w:bCs/>
+          <w:sz w:val="24"/>
+          <w:szCs w:val="24"/>
+        </w:rPr>
+        <w:t xml:space="preserve">The FGC allocation, included </w:t>
+      </w:r>
+      <w:proofErr w:type="gramStart"/>
+      <w:r>
+        <w:rPr>
+          <w:rFonts w:ascii="Times New Roman" w:eastAsia="Times New Roman" w:hAnsi="Times New Roman" w:cs="Times New Roman"/>
+          <w:bCs/>
+          <w:sz w:val="24"/>
+          <w:szCs w:val="24"/>
+        </w:rPr>
+        <w:t>FGN(</w:t>
+      </w:r>
+      <w:proofErr w:type="spellStart"/>
+      <w:proofErr w:type="gramEnd"/>
+      <w:r>
+        <w:rPr>
+          <w:rFonts w:ascii="Times New Roman" w:eastAsia="Times New Roman" w:hAnsi="Times New Roman" w:cs="Times New Roman"/>
+          <w:bCs/>
+          <w:sz w:val="24"/>
+          <w:szCs w:val="24"/>
+        </w:rPr>
+        <w:t>crf</w:t>
+      </w:r>
+      <w:proofErr w:type="spellEnd"/>
+      <w:r>
+        <w:rPr>
+          <w:rFonts w:ascii="Times New Roman" w:eastAsia="Times New Roman" w:hAnsi="Times New Roman" w:cs="Times New Roman"/>
+          <w:bCs/>
+          <w:sz w:val="24"/>
+          <w:szCs w:val="24"/>
+        </w:rPr>
+        <w:t xml:space="preserve"> account).Share of derivation and ecology, stabilization, development of natural resources, then </w:t>
+      </w:r>
+      <w:proofErr w:type="spellStart"/>
+      <w:r>
+        <w:rPr>
+          <w:rFonts w:ascii="Times New Roman" w:eastAsia="Times New Roman" w:hAnsi="Times New Roman" w:cs="Times New Roman"/>
+          <w:bCs/>
+          <w:sz w:val="24"/>
+          <w:szCs w:val="24"/>
+        </w:rPr>
+        <w:t>fct</w:t>
+      </w:r>
+      <w:proofErr w:type="spellEnd"/>
+      <w:r>
+        <w:rPr>
+          <w:rFonts w:ascii="Times New Roman" w:eastAsia="Times New Roman" w:hAnsi="Times New Roman" w:cs="Times New Roman"/>
+          <w:bCs/>
+          <w:sz w:val="24"/>
+          <w:szCs w:val="24"/>
+        </w:rPr>
+        <w:t xml:space="preserve"> Abuja</w:t>
+      </w:r>
+    </w:p>
+    <w:p>
+      <w:pPr>
+        <w:spacing w:line="240" w:lineRule="auto"/>
+        <w:rPr>
+          <w:rFonts w:ascii="Times New Roman" w:eastAsia="Times New Roman" w:hAnsi="Times New Roman" w:cs="Times New Roman"/>
+          <w:bCs/>
+          <w:sz w:val="24"/>
+          <w:szCs w:val="24"/>
+        </w:rPr>
+      </w:pPr>
+      <w:r>
+        <w:rPr>
+          <w:rFonts w:ascii="Times New Roman" w:eastAsia="Times New Roman" w:hAnsi="Times New Roman" w:cs="Times New Roman"/>
+          <w:bCs/>
+          <w:sz w:val="24"/>
+          <w:szCs w:val="24"/>
+        </w:rPr>
+        <w:t xml:space="preserve">The EMTL was only allocated to </w:t>
+      </w:r>
+      <w:proofErr w:type="gramStart"/>
+      <w:r>
+        <w:rPr>
+          <w:rFonts w:ascii="Times New Roman" w:eastAsia="Times New Roman" w:hAnsi="Times New Roman" w:cs="Times New Roman"/>
+          <w:bCs/>
+          <w:sz w:val="24"/>
+          <w:szCs w:val="24"/>
+        </w:rPr>
+        <w:t>FGN(</w:t>
+      </w:r>
+      <w:proofErr w:type="gramEnd"/>
+      <w:r>
+        <w:rPr>
+          <w:rFonts w:ascii="Times New Roman" w:eastAsia="Times New Roman" w:hAnsi="Times New Roman" w:cs="Times New Roman"/>
+          <w:bCs/>
+          <w:sz w:val="24"/>
+          <w:szCs w:val="24"/>
+        </w:rPr>
+        <w:t>CRF account) and FCT ABUJA</w:t>
+      </w:r>
+    </w:p>
+    <w:p>
+      <w:pPr>
+        <w:spacing w:line="240" w:lineRule="auto"/>
+        <w:rPr>
+          <w:rFonts w:ascii="Times New Roman" w:eastAsia="Times New Roman" w:hAnsi="Times New Roman" w:cs="Times New Roman"/>
+          <w:b/>
+          <w:bCs/>
+          <w:sz w:val="24"/>
+          <w:szCs w:val="24"/>
+        </w:rPr>
+      </w:pPr>
+      <w:r>
+        <w:rPr>
+          <w:rFonts w:ascii="Times New Roman" w:eastAsia="Times New Roman" w:hAnsi="Times New Roman" w:cs="Times New Roman"/>
+          <w:b/>
+          <w:bCs/>
+          <w:sz w:val="24"/>
+          <w:szCs w:val="24"/>
+        </w:rPr>
+        <w:t>The total value correlate with the table 2 and it correlates with what was in the report</w:t>
+      </w:r>
+    </w:p>
+    <w:p>
+      <w:pPr>
+        <w:spacing w:line="240" w:lineRule="auto"/>
+        <w:rPr>
+          <w:rFonts w:ascii="Times New Roman" w:eastAsia="Times New Roman" w:hAnsi="Times New Roman" w:cs="Times New Roman"/>
+          <w:b/>
+          <w:bCs/>
+          <w:sz w:val="24"/>
+          <w:szCs w:val="24"/>
+        </w:rPr>
+      </w:pPr>
+    </w:p>
+    <w:p>
+      <w:pPr>
+        <w:spacing w:line="240" w:lineRule="auto"/>
+        <w:rPr>
+          <w:rFonts w:ascii="Times New Roman" w:eastAsia="Times New Roman" w:hAnsi="Times New Roman" w:cs="Times New Roman"/>
+          <w:bCs/>
+          <w:sz w:val="24"/>
+          <w:szCs w:val="24"/>
+        </w:rPr>
+      </w:pPr>
       <w:bookmarkStart w:id="0" w:name="_GoBack"/>
       <w:bookmarkEnd w:id="0"/>
     </w:p>
+    <w:p>
+      <w:pPr>
+        <w:pStyle w:val="Default"/>
+        <w:rPr>
+          <w:rFonts w:ascii="Times New Roman" w:hAnsi="Times New Roman" w:cs="Times New Roman"/>
+          <w:bCs/>
+          <w:color w:val="auto"/>
+        </w:rPr>
+      </w:pPr>
+    </w:p>
+    <w:p/>
     <w:sectPr>
       <w:pgSz w:w="12240" w:h="15840"/>
       <w:pgMar w:top="1440" w:right="1440" w:bottom="1440" w:left="1440" w:header="708" w:footer="708" w:gutter="0"/>

</xml_diff>

<commit_message>
compare the reports with the Excel Sheets for september and August and recorded my observations
</commit_message>
<xml_diff>
--- a/data/notes/observation notes.docx
+++ b/data/notes/observation notes.docx
@@ -153,17 +153,7 @@
           <w:sz w:val="24"/>
           <w:szCs w:val="24"/>
         </w:rPr>
-        <w:t>₦15.64 billion from Electronic Money Transfer Levy (EMT</w:t>
-      </w:r>
-      <w:bookmarkStart w:id="0" w:name="_GoBack"/>
-      <w:bookmarkEnd w:id="0"/>
-      <w:r>
-        <w:rPr>
-          <w:rFonts w:ascii="Times New Roman" w:hAnsi="Times New Roman" w:cs="Times New Roman"/>
-          <w:sz w:val="24"/>
-          <w:szCs w:val="24"/>
-        </w:rPr>
-        <w:t xml:space="preserve">L), </w:t>
+        <w:t xml:space="preserve">₦15.64 billion from Electronic Money Transfer Levy (EMTL), </w:t>
       </w:r>
     </w:p>
     <w:p/>
@@ -1010,38 +1000,925 @@
         </w:rPr>
       </w:pPr>
       <w:r>
+        <w:t>It all correlated</w:t>
+      </w:r>
+    </w:p>
+    <w:p>
+      <w:pPr>
+        <w:pStyle w:val="Default"/>
+        <w:rPr>
+          <w:rFonts w:ascii="Times New Roman" w:hAnsi="Times New Roman" w:cs="Times New Roman"/>
+          <w:b/>
+          <w:bCs/>
+          <w:color w:val="auto"/>
+          <w:sz w:val="32"/>
+          <w:szCs w:val="32"/>
+        </w:rPr>
+      </w:pPr>
+      <w:r>
+        <w:rPr>
+          <w:rFonts w:ascii="Times New Roman" w:hAnsi="Times New Roman" w:cs="Times New Roman"/>
+          <w:b/>
+          <w:bCs/>
+          <w:color w:val="auto"/>
+          <w:sz w:val="32"/>
+          <w:szCs w:val="32"/>
+        </w:rPr>
         <w:lastRenderedPageBreak/>
-        <w:t xml:space="preserve">Local Government value does not tally (may be deduction?) The grand total and even the grand totals. </w:t>
-      </w:r>
-      <w:r>
-        <w:rPr>
-          <w:b/>
-        </w:rPr>
-        <w:t xml:space="preserve">What happened to the values, </w:t>
+        <w:t>FAAC_AUGUST</w:t>
+      </w:r>
+      <w:r>
+        <w:rPr>
+          <w:rFonts w:ascii="Times New Roman" w:hAnsi="Times New Roman" w:cs="Times New Roman"/>
+          <w:b/>
+          <w:bCs/>
+          <w:color w:val="auto"/>
+          <w:sz w:val="32"/>
+          <w:szCs w:val="32"/>
+        </w:rPr>
+        <w:t>_</w:t>
+      </w:r>
+      <w:r>
+        <w:rPr>
+          <w:rFonts w:ascii="Times New Roman" w:hAnsi="Times New Roman" w:cs="Times New Roman"/>
+          <w:b/>
+          <w:bCs/>
+          <w:color w:val="auto"/>
+          <w:sz w:val="32"/>
+          <w:szCs w:val="32"/>
+        </w:rPr>
+        <w:t>20</w:t>
+      </w:r>
+      <w:r>
+        <w:rPr>
+          <w:rFonts w:ascii="Times New Roman" w:hAnsi="Times New Roman" w:cs="Times New Roman"/>
+          <w:b/>
+          <w:bCs/>
+          <w:color w:val="auto"/>
+          <w:sz w:val="32"/>
+          <w:szCs w:val="32"/>
+        </w:rPr>
+        <w:t>24 REPORT</w:t>
+      </w:r>
+    </w:p>
+    <w:p>
+      <w:r>
+        <w:t>PDF</w:t>
+      </w:r>
+    </w:p>
+    <w:p>
+      <w:r>
+        <w:t>Page 4</w:t>
+      </w:r>
+    </w:p>
+    <w:p>
+      <w:r>
+        <w:t xml:space="preserve">From the revenue generated in July 2024 </w:t>
+      </w:r>
+      <w:r>
+        <w:t>The amount disbursed comprised:</w:t>
+      </w:r>
+      <w:r>
+        <w:t xml:space="preserve"> </w:t>
+      </w:r>
+      <w:r>
+        <w:t>₦19.60 billion from Electronic Money Transfer Levy (EMTL),</w:t>
+      </w:r>
+    </w:p>
+    <w:p/>
+    <w:p>
+      <w:r>
+        <w:t xml:space="preserve">In </w:t>
+      </w:r>
+      <w:r>
+        <w:t>Summary of Gross Revenue Allocation by Federation Account Allocation Committee for the Month of July, 2024 Shared in August, 2024</w:t>
+      </w:r>
+      <w:r>
+        <w:t xml:space="preserve"> Table in Appendixes</w:t>
+      </w:r>
+      <w:r>
+        <w:t xml:space="preserve"> PAGE 17;</w:t>
+      </w:r>
+    </w:p>
+    <w:p>
+      <w:pPr>
+        <w:pStyle w:val="Default"/>
+        <w:rPr>
+          <w:rFonts w:ascii="Times New Roman" w:hAnsi="Times New Roman" w:cs="Times New Roman"/>
+        </w:rPr>
+      </w:pPr>
+      <w:r>
+        <w:t>FGN (see Table II)</w:t>
+      </w:r>
+      <w:r>
+        <w:t xml:space="preserve"> received </w:t>
+      </w:r>
+      <w:r>
+        <w:rPr>
+          <w:rFonts w:ascii="Times New Roman" w:hAnsi="Times New Roman" w:cs="Times New Roman"/>
+        </w:rPr>
+        <w:t>2</w:t>
+      </w:r>
+      <w:r>
+        <w:rPr>
+          <w:rFonts w:ascii="Times New Roman" w:hAnsi="Times New Roman" w:cs="Times New Roman"/>
+        </w:rPr>
+        <w:t>822,698,918.94</w:t>
+      </w:r>
+    </w:p>
+    <w:p>
+      <w:pPr>
+        <w:pStyle w:val="Default"/>
+      </w:pPr>
+      <w:r>
+        <w:rPr>
+          <w:rFonts w:ascii="Times New Roman" w:hAnsi="Times New Roman" w:cs="Times New Roman"/>
+        </w:rPr>
+        <w:t>State (see Table III)</w:t>
+      </w:r>
+      <w:r>
+        <w:rPr>
+          <w:rFonts w:ascii="Times New Roman" w:hAnsi="Times New Roman" w:cs="Times New Roman"/>
+        </w:rPr>
+        <w:t xml:space="preserve"> </w:t>
+      </w:r>
+      <w:r>
+        <w:t>9,408,996,396.48</w:t>
+      </w:r>
+    </w:p>
+    <w:p>
+      <w:pPr>
+        <w:pStyle w:val="Default"/>
+        <w:rPr>
+          <w:rFonts w:ascii="Times New Roman" w:hAnsi="Times New Roman" w:cs="Times New Roman"/>
+        </w:rPr>
+      </w:pPr>
+      <w:r>
+        <w:rPr>
+          <w:rFonts w:ascii="Times New Roman" w:hAnsi="Times New Roman" w:cs="Times New Roman"/>
+        </w:rPr>
+        <w:t>LGCs (see Table IV)</w:t>
+      </w:r>
+      <w:r>
+        <w:rPr>
+          <w:rFonts w:ascii="Times New Roman" w:hAnsi="Times New Roman" w:cs="Times New Roman"/>
+        </w:rPr>
+        <w:t xml:space="preserve"> </w:t>
+      </w:r>
+      <w:r>
+        <w:rPr>
+          <w:rFonts w:ascii="Times New Roman" w:hAnsi="Times New Roman" w:cs="Times New Roman"/>
+        </w:rPr>
+        <w:t>6,586,297,477.54</w:t>
+      </w:r>
+    </w:p>
+    <w:p>
+      <w:pPr>
+        <w:pStyle w:val="Default"/>
+        <w:rPr>
+          <w:rFonts w:ascii="Times New Roman" w:hAnsi="Times New Roman" w:cs="Times New Roman"/>
+        </w:rPr>
+      </w:pPr>
+      <w:r>
+        <w:rPr>
+          <w:rFonts w:ascii="Times New Roman" w:hAnsi="Times New Roman" w:cs="Times New Roman"/>
+        </w:rPr>
+        <w:t xml:space="preserve">Cost of Collections </w:t>
+      </w:r>
+      <w:r>
+        <w:rPr>
+          <w:rFonts w:ascii="Times New Roman" w:hAnsi="Times New Roman" w:cs="Times New Roman"/>
+        </w:rPr>
+        <w:t>–</w:t>
+      </w:r>
+      <w:r>
+        <w:rPr>
+          <w:rFonts w:ascii="Times New Roman" w:hAnsi="Times New Roman" w:cs="Times New Roman"/>
+        </w:rPr>
+        <w:t xml:space="preserve"> FIRS</w:t>
+      </w:r>
+      <w:r>
+        <w:rPr>
+          <w:rFonts w:ascii="Times New Roman" w:hAnsi="Times New Roman" w:cs="Times New Roman"/>
+        </w:rPr>
+        <w:t xml:space="preserve"> </w:t>
+      </w:r>
+      <w:r>
+        <w:rPr>
+          <w:rFonts w:ascii="Times New Roman" w:hAnsi="Times New Roman" w:cs="Times New Roman"/>
+        </w:rPr>
+        <w:t>784,083,033.04</w:t>
+      </w:r>
+    </w:p>
+    <w:p>
+      <w:pPr>
+        <w:pStyle w:val="Default"/>
+        <w:rPr>
+          <w:rFonts w:ascii="Times New Roman" w:hAnsi="Times New Roman" w:cs="Times New Roman"/>
+        </w:rPr>
+      </w:pPr>
+    </w:p>
+    <w:p>
+      <w:pPr>
+        <w:pStyle w:val="Default"/>
+        <w:rPr>
+          <w:rFonts w:ascii="Times New Roman" w:hAnsi="Times New Roman" w:cs="Times New Roman"/>
+        </w:rPr>
+      </w:pPr>
+      <w:r>
+        <w:rPr>
+          <w:rFonts w:ascii="Times New Roman" w:hAnsi="Times New Roman" w:cs="Times New Roman"/>
+        </w:rPr>
+        <w:t xml:space="preserve">TOTAL is </w:t>
+      </w:r>
+      <w:r>
+        <w:rPr>
+          <w:rFonts w:ascii="Times New Roman" w:hAnsi="Times New Roman" w:cs="Times New Roman"/>
+        </w:rPr>
+        <w:t>19,602,075,826.00</w:t>
+      </w:r>
+    </w:p>
+    <w:p>
+      <w:pPr>
+        <w:pStyle w:val="Default"/>
+        <w:rPr>
+          <w:rFonts w:ascii="Times New Roman" w:hAnsi="Times New Roman" w:cs="Times New Roman"/>
+        </w:rPr>
+      </w:pPr>
+    </w:p>
+    <w:p>
+      <w:pPr>
+        <w:pStyle w:val="Default"/>
+        <w:rPr>
+          <w:rFonts w:ascii="Times New Roman" w:hAnsi="Times New Roman" w:cs="Times New Roman"/>
+          <w:sz w:val="23"/>
+          <w:szCs w:val="23"/>
+        </w:rPr>
+      </w:pPr>
+      <w:r>
+        <w:rPr>
+          <w:rFonts w:ascii="Times New Roman" w:hAnsi="Times New Roman" w:cs="Times New Roman"/>
+        </w:rPr>
+        <w:t xml:space="preserve">PAGE 18 contained a table that is about </w:t>
+      </w:r>
+      <w:r>
+        <w:rPr>
+          <w:rFonts w:ascii="Times New Roman" w:hAnsi="Times New Roman" w:cs="Times New Roman"/>
+          <w:b/>
+          <w:bCs/>
+          <w:sz w:val="23"/>
+          <w:szCs w:val="23"/>
+        </w:rPr>
+        <w:t xml:space="preserve">Distribution of Revenue Allocation to FGN </w:t>
+      </w:r>
+    </w:p>
+    <w:p>
+      <w:pPr>
+        <w:pStyle w:val="Default"/>
+        <w:rPr>
+          <w:rFonts w:ascii="Times New Roman" w:hAnsi="Times New Roman" w:cs="Times New Roman"/>
+        </w:rPr>
+      </w:pPr>
+    </w:p>
+    <w:p>
+      <w:pPr>
+        <w:pStyle w:val="Default"/>
+        <w:rPr>
+          <w:rFonts w:ascii="Times New Roman" w:hAnsi="Times New Roman" w:cs="Times New Roman"/>
+        </w:rPr>
+      </w:pPr>
+      <w:r>
+        <w:rPr>
+          <w:rFonts w:ascii="Times New Roman" w:hAnsi="Times New Roman" w:cs="Times New Roman"/>
+        </w:rPr>
+        <w:t>T</w:t>
+      </w:r>
+      <w:r>
+        <w:rPr>
+          <w:rFonts w:ascii="Times New Roman" w:hAnsi="Times New Roman" w:cs="Times New Roman"/>
+        </w:rPr>
+        <w:t xml:space="preserve">he money allocated to FGN through EMTL was </w:t>
+      </w:r>
+      <w:r>
+        <w:rPr>
+          <w:rFonts w:ascii="Times New Roman" w:hAnsi="Times New Roman" w:cs="Times New Roman"/>
+        </w:rPr>
+        <w:t>2</w:t>
+      </w:r>
+      <w:r>
+        <w:rPr>
+          <w:rFonts w:ascii="Times New Roman" w:hAnsi="Times New Roman" w:cs="Times New Roman"/>
+        </w:rPr>
+        <w:t>822,698,918.94</w:t>
+      </w:r>
+      <w:r>
+        <w:rPr>
+          <w:rFonts w:ascii="Times New Roman" w:hAnsi="Times New Roman" w:cs="Times New Roman"/>
+        </w:rPr>
+        <w:t xml:space="preserve"> in the table in page 17 only </w:t>
+      </w:r>
+      <w:r>
+        <w:rPr>
+          <w:rFonts w:ascii="Times New Roman" w:hAnsi="Times New Roman" w:cs="Times New Roman"/>
+        </w:rPr>
+        <w:t>2,822,698,918.94</w:t>
+      </w:r>
+      <w:r>
+        <w:rPr>
+          <w:rFonts w:ascii="Times New Roman" w:hAnsi="Times New Roman" w:cs="Times New Roman"/>
+        </w:rPr>
+        <w:t xml:space="preserve"> (same amount was allocated to different </w:t>
+      </w:r>
+      <w:proofErr w:type="gramStart"/>
+      <w:r>
+        <w:rPr>
+          <w:rFonts w:ascii="Times New Roman" w:hAnsi="Times New Roman" w:cs="Times New Roman"/>
+        </w:rPr>
+        <w:t>sectors,</w:t>
+      </w:r>
+      <w:proofErr w:type="gramEnd"/>
+      <w:r>
+        <w:rPr>
+          <w:rFonts w:ascii="Times New Roman" w:hAnsi="Times New Roman" w:cs="Times New Roman"/>
+        </w:rPr>
+        <w:t xml:space="preserve"> those sectors are:</w:t>
+      </w:r>
+    </w:p>
+    <w:p>
+      <w:pPr>
+        <w:pStyle w:val="Default"/>
+        <w:rPr>
+          <w:rFonts w:ascii="Times New Roman" w:hAnsi="Times New Roman" w:cs="Times New Roman"/>
+        </w:rPr>
+      </w:pPr>
+      <w:r>
+        <w:rPr>
+          <w:rFonts w:ascii="Times New Roman" w:hAnsi="Times New Roman" w:cs="Times New Roman"/>
+        </w:rPr>
+        <w:t>FGN (CRF Account)</w:t>
+      </w:r>
+      <w:r>
+        <w:rPr>
+          <w:rFonts w:ascii="Times New Roman" w:hAnsi="Times New Roman" w:cs="Times New Roman"/>
+        </w:rPr>
+        <w:t xml:space="preserve"> and FCT ABUJA</w:t>
+      </w:r>
+    </w:p>
+    <w:p>
+      <w:pPr>
+        <w:pStyle w:val="Default"/>
+        <w:rPr>
+          <w:rFonts w:ascii="Times New Roman" w:hAnsi="Times New Roman" w:cs="Times New Roman"/>
+        </w:rPr>
+      </w:pPr>
+    </w:p>
+    <w:p>
+      <w:pPr>
+        <w:pStyle w:val="Default"/>
+        <w:rPr>
+          <w:rFonts w:ascii="Times New Roman" w:hAnsi="Times New Roman" w:cs="Times New Roman"/>
+        </w:rPr>
+      </w:pPr>
+      <w:r>
+        <w:rPr>
+          <w:rFonts w:ascii="Times New Roman" w:hAnsi="Times New Roman" w:cs="Times New Roman"/>
+        </w:rPr>
+        <w:t xml:space="preserve">In page 17, the amount allocated to STATES in total was </w:t>
+      </w:r>
+      <w:r>
+        <w:rPr>
+          <w:rFonts w:ascii="Times New Roman" w:hAnsi="Times New Roman" w:cs="Times New Roman"/>
+        </w:rPr>
+        <w:t>9,408,996,396.48</w:t>
+      </w:r>
+      <w:r>
+        <w:rPr>
+          <w:rFonts w:ascii="Times New Roman" w:hAnsi="Times New Roman" w:cs="Times New Roman"/>
+        </w:rPr>
+        <w:t xml:space="preserve">, in Page 19 with table that described the </w:t>
+      </w:r>
+      <w:r>
+        <w:rPr>
+          <w:rFonts w:ascii="Times New Roman" w:hAnsi="Times New Roman" w:cs="Times New Roman"/>
+        </w:rPr>
+        <w:t>Distribution of Revenue Allocation to State Governments</w:t>
+      </w:r>
+      <w:r>
+        <w:rPr>
+          <w:rFonts w:ascii="Times New Roman" w:hAnsi="Times New Roman" w:cs="Times New Roman"/>
+        </w:rPr>
+        <w:t xml:space="preserve"> the total allocated to states </w:t>
       </w:r>
       <w:proofErr w:type="spellStart"/>
       <w:r>
         <w:rPr>
-          <w:b/>
-        </w:rPr>
-        <w:t>Corrouption</w:t>
+          <w:rFonts w:ascii="Times New Roman" w:hAnsi="Times New Roman" w:cs="Times New Roman"/>
+        </w:rPr>
+        <w:t>fro</w:t>
       </w:r>
       <w:proofErr w:type="spellEnd"/>
       <w:r>
         <w:rPr>
-          <w:b/>
-        </w:rPr>
-        <w:t>?</w:t>
-      </w:r>
-    </w:p>
-    <w:p>
-      <w:pPr>
-        <w:rPr>
-          <w:b/>
-        </w:rPr>
-      </w:pPr>
-    </w:p>
-    <w:p/>
+          <w:rFonts w:ascii="Times New Roman" w:hAnsi="Times New Roman" w:cs="Times New Roman"/>
+        </w:rPr>
+        <w:t xml:space="preserve"> EMTL was </w:t>
+      </w:r>
+      <w:r>
+        <w:rPr>
+          <w:rFonts w:ascii="Times New Roman" w:hAnsi="Times New Roman" w:cs="Times New Roman"/>
+        </w:rPr>
+        <w:t>9,408,996,396.48</w:t>
+      </w:r>
+      <w:r>
+        <w:rPr>
+          <w:rFonts w:ascii="Times New Roman" w:hAnsi="Times New Roman" w:cs="Times New Roman"/>
+        </w:rPr>
+        <w:t xml:space="preserve"> it tallied</w:t>
+      </w:r>
+    </w:p>
+    <w:p>
+      <w:pPr>
+        <w:pStyle w:val="Default"/>
+        <w:rPr>
+          <w:rFonts w:ascii="Times New Roman" w:hAnsi="Times New Roman" w:cs="Times New Roman"/>
+        </w:rPr>
+      </w:pPr>
+    </w:p>
+    <w:p>
+      <w:pPr>
+        <w:pStyle w:val="Default"/>
+        <w:rPr>
+          <w:rFonts w:ascii="Times New Roman" w:hAnsi="Times New Roman" w:cs="Times New Roman"/>
+        </w:rPr>
+      </w:pPr>
+      <w:r>
+        <w:rPr>
+          <w:rFonts w:ascii="Times New Roman" w:hAnsi="Times New Roman" w:cs="Times New Roman"/>
+        </w:rPr>
+        <w:t>COMPARING THE PDF TO THE SHEETS</w:t>
+      </w:r>
+    </w:p>
+    <w:p>
+      <w:pPr>
+        <w:pStyle w:val="Default"/>
+        <w:rPr>
+          <w:rFonts w:ascii="Times New Roman" w:hAnsi="Times New Roman" w:cs="Times New Roman"/>
+        </w:rPr>
+      </w:pPr>
+      <w:r>
+        <w:rPr>
+          <w:rFonts w:ascii="Times New Roman" w:hAnsi="Times New Roman" w:cs="Times New Roman"/>
+        </w:rPr>
+        <w:t>In the Sum and FG sheet TABLE 1</w:t>
+      </w:r>
+    </w:p>
+    <w:p>
+      <w:pPr>
+        <w:pStyle w:val="Default"/>
+        <w:rPr>
+          <w:rFonts w:ascii="Times New Roman" w:hAnsi="Times New Roman" w:cs="Times New Roman"/>
+        </w:rPr>
+      </w:pPr>
+    </w:p>
+    <w:p>
+      <w:pPr>
+        <w:pStyle w:val="Default"/>
+        <w:rPr>
+          <w:rFonts w:ascii="Times New Roman" w:hAnsi="Times New Roman" w:cs="Times New Roman"/>
+        </w:rPr>
+      </w:pPr>
+      <w:r>
+        <w:rPr>
+          <w:rFonts w:ascii="Times New Roman" w:hAnsi="Times New Roman" w:cs="Times New Roman"/>
+        </w:rPr>
+        <w:t>FGN (see Table II)</w:t>
+      </w:r>
+      <w:r>
+        <w:rPr>
+          <w:rFonts w:ascii="Times New Roman" w:hAnsi="Times New Roman" w:cs="Times New Roman"/>
+        </w:rPr>
+        <w:t xml:space="preserve">   </w:t>
+      </w:r>
+      <w:r>
+        <w:rPr>
+          <w:rFonts w:ascii="Times New Roman" w:hAnsi="Times New Roman" w:cs="Times New Roman"/>
+        </w:rPr>
+        <w:t xml:space="preserve"> 2,822,698,918.94 </w:t>
+      </w:r>
+    </w:p>
+    <w:p>
+      <w:pPr>
+        <w:pStyle w:val="Default"/>
+        <w:rPr>
+          <w:rFonts w:ascii="Times New Roman" w:hAnsi="Times New Roman" w:cs="Times New Roman"/>
+        </w:rPr>
+      </w:pPr>
+      <w:r>
+        <w:rPr>
+          <w:rFonts w:ascii="Times New Roman" w:hAnsi="Times New Roman" w:cs="Times New Roman"/>
+        </w:rPr>
+        <w:t>State (see Table III)</w:t>
+      </w:r>
+      <w:r>
+        <w:rPr>
+          <w:rFonts w:ascii="Times New Roman" w:hAnsi="Times New Roman" w:cs="Times New Roman"/>
+        </w:rPr>
+        <w:t xml:space="preserve">   </w:t>
+      </w:r>
+      <w:r>
+        <w:rPr>
+          <w:rFonts w:ascii="Times New Roman" w:hAnsi="Times New Roman" w:cs="Times New Roman"/>
+        </w:rPr>
+        <w:t xml:space="preserve"> 9,408,996,396.48 </w:t>
+      </w:r>
+    </w:p>
+    <w:p>
+      <w:pPr>
+        <w:pStyle w:val="Default"/>
+        <w:rPr>
+          <w:rFonts w:ascii="Times New Roman" w:hAnsi="Times New Roman" w:cs="Times New Roman"/>
+        </w:rPr>
+      </w:pPr>
+      <w:r>
+        <w:rPr>
+          <w:rFonts w:ascii="Times New Roman" w:hAnsi="Times New Roman" w:cs="Times New Roman"/>
+        </w:rPr>
+        <w:t>LGCs (see Table IV)</w:t>
+      </w:r>
+      <w:r>
+        <w:rPr>
+          <w:rFonts w:ascii="Times New Roman" w:hAnsi="Times New Roman" w:cs="Times New Roman"/>
+        </w:rPr>
+        <w:t xml:space="preserve">  </w:t>
+      </w:r>
+      <w:r>
+        <w:rPr>
+          <w:rFonts w:ascii="Times New Roman" w:hAnsi="Times New Roman" w:cs="Times New Roman"/>
+        </w:rPr>
+        <w:t xml:space="preserve"> 6,586,297,477.54 </w:t>
+      </w:r>
+    </w:p>
+    <w:p>
+      <w:pPr>
+        <w:pStyle w:val="Default"/>
+        <w:rPr>
+          <w:rFonts w:ascii="Times New Roman" w:hAnsi="Times New Roman" w:cs="Times New Roman"/>
+        </w:rPr>
+      </w:pPr>
+      <w:r>
+        <w:rPr>
+          <w:rFonts w:ascii="Times New Roman" w:hAnsi="Times New Roman" w:cs="Times New Roman"/>
+        </w:rPr>
+        <w:t xml:space="preserve">Cost of Collections </w:t>
+      </w:r>
+      <w:r>
+        <w:rPr>
+          <w:rFonts w:ascii="Times New Roman" w:hAnsi="Times New Roman" w:cs="Times New Roman"/>
+        </w:rPr>
+        <w:t>–</w:t>
+      </w:r>
+      <w:r>
+        <w:rPr>
+          <w:rFonts w:ascii="Times New Roman" w:hAnsi="Times New Roman" w:cs="Times New Roman"/>
+        </w:rPr>
+        <w:t xml:space="preserve"> FIRS</w:t>
+      </w:r>
+      <w:r>
+        <w:rPr>
+          <w:rFonts w:ascii="Times New Roman" w:hAnsi="Times New Roman" w:cs="Times New Roman"/>
+        </w:rPr>
+        <w:t xml:space="preserve">  </w:t>
+      </w:r>
+      <w:r>
+        <w:rPr>
+          <w:rFonts w:ascii="Times New Roman" w:hAnsi="Times New Roman" w:cs="Times New Roman"/>
+        </w:rPr>
+        <w:t xml:space="preserve"> 784,083,033.04</w:t>
+      </w:r>
+    </w:p>
+    <w:p>
+      <w:pPr>
+        <w:pStyle w:val="Default"/>
+        <w:rPr>
+          <w:rFonts w:ascii="Times New Roman" w:hAnsi="Times New Roman" w:cs="Times New Roman"/>
+        </w:rPr>
+      </w:pPr>
+      <w:r>
+        <w:rPr>
+          <w:rFonts w:ascii="Times New Roman" w:hAnsi="Times New Roman" w:cs="Times New Roman"/>
+        </w:rPr>
+        <w:t xml:space="preserve"> </w:t>
+      </w:r>
+      <w:proofErr w:type="gramStart"/>
+      <w:r>
+        <w:rPr>
+          <w:rFonts w:ascii="Times New Roman" w:hAnsi="Times New Roman" w:cs="Times New Roman"/>
+        </w:rPr>
+        <w:t xml:space="preserve">TOTAL </w:t>
+      </w:r>
+      <w:r>
+        <w:rPr>
+          <w:rFonts w:ascii="Times New Roman" w:hAnsi="Times New Roman" w:cs="Times New Roman"/>
+        </w:rPr>
+        <w:t xml:space="preserve"> 19,602,075,826.00</w:t>
+      </w:r>
+      <w:proofErr w:type="gramEnd"/>
+      <w:r>
+        <w:rPr>
+          <w:rFonts w:ascii="Times New Roman" w:hAnsi="Times New Roman" w:cs="Times New Roman"/>
+        </w:rPr>
+        <w:t xml:space="preserve"> </w:t>
+      </w:r>
+    </w:p>
+    <w:p>
+      <w:pPr>
+        <w:pStyle w:val="Default"/>
+        <w:rPr>
+          <w:rFonts w:ascii="Times New Roman" w:hAnsi="Times New Roman" w:cs="Times New Roman"/>
+        </w:rPr>
+      </w:pPr>
+      <w:r>
+        <w:rPr>
+          <w:rFonts w:ascii="Times New Roman" w:hAnsi="Times New Roman" w:cs="Times New Roman"/>
+        </w:rPr>
+        <w:t>THEY ARE ALL CORRECT</w:t>
+      </w:r>
+    </w:p>
+    <w:p>
+      <w:pPr>
+        <w:pStyle w:val="Default"/>
+        <w:rPr>
+          <w:rFonts w:ascii="Times New Roman" w:hAnsi="Times New Roman" w:cs="Times New Roman"/>
+        </w:rPr>
+      </w:pPr>
+    </w:p>
+    <w:p>
+      <w:pPr>
+        <w:pStyle w:val="Default"/>
+        <w:rPr>
+          <w:rFonts w:ascii="Times New Roman" w:hAnsi="Times New Roman" w:cs="Times New Roman"/>
+        </w:rPr>
+      </w:pPr>
+      <w:r>
+        <w:rPr>
+          <w:rFonts w:ascii="Times New Roman" w:hAnsi="Times New Roman" w:cs="Times New Roman"/>
+        </w:rPr>
+        <w:t xml:space="preserve">TABLE II </w:t>
+      </w:r>
+      <w:r>
+        <w:rPr>
+          <w:rFonts w:ascii="Times New Roman" w:hAnsi="Times New Roman" w:cs="Times New Roman"/>
+        </w:rPr>
+        <w:t>Distribution of Revenue Allocation to FGN by Federation Account Allocation Committee for the Month of July, 2024 Shared in August, 2024</w:t>
+      </w:r>
+      <w:r>
+        <w:rPr>
+          <w:rFonts w:ascii="Times New Roman" w:hAnsi="Times New Roman" w:cs="Times New Roman"/>
+        </w:rPr>
+        <w:tab/>
+      </w:r>
+    </w:p>
+    <w:p>
+      <w:pPr>
+        <w:pStyle w:val="Default"/>
+        <w:rPr>
+          <w:rFonts w:ascii="Times New Roman" w:hAnsi="Times New Roman" w:cs="Times New Roman"/>
+        </w:rPr>
+      </w:pPr>
+    </w:p>
+    <w:p>
+      <w:pPr>
+        <w:pStyle w:val="Default"/>
+        <w:rPr>
+          <w:rFonts w:ascii="Times New Roman" w:hAnsi="Times New Roman" w:cs="Times New Roman"/>
+        </w:rPr>
+      </w:pPr>
+      <w:r>
+        <w:rPr>
+          <w:rFonts w:ascii="Times New Roman" w:hAnsi="Times New Roman" w:cs="Times New Roman"/>
+        </w:rPr>
+        <w:t>Same amounts as before were allocated</w:t>
+      </w:r>
+    </w:p>
+    <w:p>
+      <w:pPr>
+        <w:pStyle w:val="Default"/>
+        <w:rPr>
+          <w:rFonts w:ascii="Times New Roman" w:hAnsi="Times New Roman" w:cs="Times New Roman"/>
+        </w:rPr>
+      </w:pPr>
+    </w:p>
+    <w:p>
+      <w:pPr>
+        <w:pStyle w:val="Default"/>
+        <w:rPr>
+          <w:rFonts w:ascii="Times New Roman" w:hAnsi="Times New Roman" w:cs="Times New Roman"/>
+        </w:rPr>
+      </w:pPr>
+      <w:r>
+        <w:rPr>
+          <w:rFonts w:ascii="Times New Roman" w:hAnsi="Times New Roman" w:cs="Times New Roman"/>
+        </w:rPr>
+        <w:t xml:space="preserve">TABLE III </w:t>
+      </w:r>
+      <w:r>
+        <w:rPr>
+          <w:rFonts w:ascii="Times New Roman" w:hAnsi="Times New Roman" w:cs="Times New Roman"/>
+        </w:rPr>
+        <w:t xml:space="preserve">Distribution of Revenue Allocation to State Governments by Federation Account Allocation Committee for the month of July, 2024 shared in </w:t>
+      </w:r>
+      <w:r>
+        <w:rPr>
+          <w:rFonts w:ascii="Times New Roman" w:hAnsi="Times New Roman" w:cs="Times New Roman"/>
+        </w:rPr>
+        <w:t>August, 2024</w:t>
+      </w:r>
+      <w:r>
+        <w:rPr>
+          <w:rFonts w:ascii="Times New Roman" w:hAnsi="Times New Roman" w:cs="Times New Roman"/>
+        </w:rPr>
+        <w:tab/>
+      </w:r>
+      <w:r>
+        <w:rPr>
+          <w:rFonts w:ascii="Times New Roman" w:hAnsi="Times New Roman" w:cs="Times New Roman"/>
+        </w:rPr>
+        <w:tab/>
+      </w:r>
+      <w:r>
+        <w:rPr>
+          <w:rFonts w:ascii="Times New Roman" w:hAnsi="Times New Roman" w:cs="Times New Roman"/>
+        </w:rPr>
+        <w:tab/>
+      </w:r>
+      <w:r>
+        <w:rPr>
+          <w:rFonts w:ascii="Times New Roman" w:hAnsi="Times New Roman" w:cs="Times New Roman"/>
+        </w:rPr>
+        <w:tab/>
+      </w:r>
+    </w:p>
+    <w:p>
+      <w:pPr>
+        <w:pStyle w:val="Default"/>
+        <w:rPr>
+          <w:rFonts w:ascii="Times New Roman" w:hAnsi="Times New Roman" w:cs="Times New Roman"/>
+        </w:rPr>
+      </w:pPr>
+      <w:r>
+        <w:rPr>
+          <w:rFonts w:ascii="Times New Roman" w:hAnsi="Times New Roman" w:cs="Times New Roman"/>
+        </w:rPr>
+        <w:lastRenderedPageBreak/>
+        <w:t>Same amounts as in the reports</w:t>
+      </w:r>
+    </w:p>
+    <w:p>
+      <w:pPr>
+        <w:pStyle w:val="Default"/>
+        <w:rPr>
+          <w:rFonts w:ascii="Times New Roman" w:hAnsi="Times New Roman" w:cs="Times New Roman"/>
+        </w:rPr>
+      </w:pPr>
+    </w:p>
+    <w:p>
+      <w:pPr>
+        <w:pStyle w:val="Default"/>
+        <w:rPr>
+          <w:rFonts w:ascii="Times New Roman" w:hAnsi="Times New Roman" w:cs="Times New Roman"/>
+        </w:rPr>
+      </w:pPr>
+      <w:r>
+        <w:rPr>
+          <w:rFonts w:ascii="Times New Roman" w:hAnsi="Times New Roman" w:cs="Times New Roman"/>
+        </w:rPr>
+        <w:t>TABLE IV</w:t>
+      </w:r>
+    </w:p>
+    <w:p>
+      <w:pPr>
+        <w:pStyle w:val="Default"/>
+        <w:rPr>
+          <w:rFonts w:ascii="Times New Roman" w:hAnsi="Times New Roman" w:cs="Times New Roman"/>
+        </w:rPr>
+      </w:pPr>
+      <w:r>
+        <w:rPr>
+          <w:rFonts w:ascii="Times New Roman" w:hAnsi="Times New Roman" w:cs="Times New Roman"/>
+        </w:rPr>
+        <w:t xml:space="preserve">Local Government </w:t>
+      </w:r>
+      <w:proofErr w:type="gramStart"/>
+      <w:r>
+        <w:rPr>
+          <w:rFonts w:ascii="Times New Roman" w:hAnsi="Times New Roman" w:cs="Times New Roman"/>
+        </w:rPr>
+        <w:t>councils</w:t>
+      </w:r>
+      <w:proofErr w:type="gramEnd"/>
+      <w:r>
+        <w:rPr>
+          <w:rFonts w:ascii="Times New Roman" w:hAnsi="Times New Roman" w:cs="Times New Roman"/>
+        </w:rPr>
+        <w:t xml:space="preserve"> allocation in Sheet 3</w:t>
+      </w:r>
+    </w:p>
+    <w:p>
+      <w:pPr>
+        <w:pStyle w:val="Default"/>
+        <w:rPr>
+          <w:rFonts w:ascii="Times New Roman" w:hAnsi="Times New Roman" w:cs="Times New Roman"/>
+        </w:rPr>
+      </w:pPr>
+      <w:r>
+        <w:rPr>
+          <w:rFonts w:ascii="Times New Roman" w:hAnsi="Times New Roman" w:cs="Times New Roman"/>
+        </w:rPr>
+        <w:t>The grand total is same as the report</w:t>
+      </w:r>
+    </w:p>
+    <w:p>
+      <w:pPr>
+        <w:pStyle w:val="Default"/>
+        <w:rPr>
+          <w:rFonts w:ascii="Times New Roman" w:hAnsi="Times New Roman" w:cs="Times New Roman"/>
+        </w:rPr>
+      </w:pPr>
+    </w:p>
+    <w:p>
+      <w:pPr>
+        <w:pStyle w:val="Default"/>
+        <w:rPr>
+          <w:rFonts w:ascii="Times New Roman" w:hAnsi="Times New Roman" w:cs="Times New Roman"/>
+        </w:rPr>
+      </w:pPr>
+      <w:bookmarkStart w:id="0" w:name="_GoBack"/>
+      <w:bookmarkEnd w:id="0"/>
+    </w:p>
+    <w:p>
+      <w:pPr>
+        <w:pStyle w:val="Default"/>
+        <w:rPr>
+          <w:rFonts w:ascii="Times New Roman" w:hAnsi="Times New Roman" w:cs="Times New Roman"/>
+        </w:rPr>
+      </w:pPr>
+    </w:p>
+    <w:p>
+      <w:pPr>
+        <w:pStyle w:val="Default"/>
+        <w:rPr>
+          <w:rFonts w:ascii="Times New Roman" w:hAnsi="Times New Roman" w:cs="Times New Roman"/>
+        </w:rPr>
+      </w:pPr>
+      <w:r>
+        <w:rPr>
+          <w:rFonts w:ascii="Times New Roman" w:hAnsi="Times New Roman" w:cs="Times New Roman"/>
+        </w:rPr>
+        <w:tab/>
+      </w:r>
+      <w:r>
+        <w:rPr>
+          <w:rFonts w:ascii="Times New Roman" w:hAnsi="Times New Roman" w:cs="Times New Roman"/>
+        </w:rPr>
+        <w:tab/>
+      </w:r>
+      <w:r>
+        <w:rPr>
+          <w:rFonts w:ascii="Times New Roman" w:hAnsi="Times New Roman" w:cs="Times New Roman"/>
+        </w:rPr>
+        <w:tab/>
+      </w:r>
+      <w:r>
+        <w:rPr>
+          <w:rFonts w:ascii="Times New Roman" w:hAnsi="Times New Roman" w:cs="Times New Roman"/>
+        </w:rPr>
+        <w:tab/>
+      </w:r>
+      <w:r>
+        <w:rPr>
+          <w:rFonts w:ascii="Times New Roman" w:hAnsi="Times New Roman" w:cs="Times New Roman"/>
+        </w:rPr>
+        <w:tab/>
+      </w:r>
+      <w:r>
+        <w:rPr>
+          <w:rFonts w:ascii="Times New Roman" w:hAnsi="Times New Roman" w:cs="Times New Roman"/>
+        </w:rPr>
+        <w:tab/>
+      </w:r>
+      <w:r>
+        <w:rPr>
+          <w:rFonts w:ascii="Times New Roman" w:hAnsi="Times New Roman" w:cs="Times New Roman"/>
+        </w:rPr>
+        <w:tab/>
+      </w:r>
+      <w:r>
+        <w:rPr>
+          <w:rFonts w:ascii="Times New Roman" w:hAnsi="Times New Roman" w:cs="Times New Roman"/>
+        </w:rPr>
+        <w:tab/>
+      </w:r>
+    </w:p>
     <w:sectPr>
       <w:pgSz w:w="12240" w:h="15840"/>
       <w:pgMar w:top="1440" w:right="1440" w:bottom="1440" w:left="1440" w:header="708" w:footer="708" w:gutter="0"/>

</xml_diff>

<commit_message>
added my observations for december and november
</commit_message>
<xml_diff>
--- a/data/notes/observation notes.docx
+++ b/data/notes/observation notes.docx
@@ -1025,9 +1025,800 @@
           <w:szCs w:val="32"/>
         </w:rPr>
         <w:lastRenderedPageBreak/>
-        <w:t>FAAC_AUGUST</w:t>
-      </w:r>
-      <w:r>
+        <w:t>FAAC_AUGUST_2024 REPORT</w:t>
+      </w:r>
+    </w:p>
+    <w:p>
+      <w:r>
+        <w:t>PDF</w:t>
+      </w:r>
+    </w:p>
+    <w:p>
+      <w:r>
+        <w:t>Page 4</w:t>
+      </w:r>
+    </w:p>
+    <w:p>
+      <w:r>
+        <w:t xml:space="preserve">From the revenue generated in July 2024 </w:t>
+      </w:r>
+      <w:r>
+        <w:t>The amount disbursed comprised:</w:t>
+      </w:r>
+      <w:r>
+        <w:t xml:space="preserve"> </w:t>
+      </w:r>
+      <w:r>
+        <w:t>₦19.60 billion from Electronic Money Transfer Levy (EMTL),</w:t>
+      </w:r>
+    </w:p>
+    <w:p/>
+    <w:p>
+      <w:r>
+        <w:t xml:space="preserve">In </w:t>
+      </w:r>
+      <w:r>
+        <w:t>Summary of Gross Revenue Allocation by Federation Account Allocation Committee for the Month of July, 2024 Shared in August, 2024</w:t>
+      </w:r>
+      <w:r>
+        <w:t xml:space="preserve"> Table in Appendixes</w:t>
+      </w:r>
+      <w:r>
+        <w:t xml:space="preserve"> PAGE 17;</w:t>
+      </w:r>
+    </w:p>
+    <w:p>
+      <w:pPr>
+        <w:pStyle w:val="Default"/>
+        <w:rPr>
+          <w:rFonts w:ascii="Times New Roman" w:hAnsi="Times New Roman" w:cs="Times New Roman"/>
+        </w:rPr>
+      </w:pPr>
+      <w:r>
+        <w:t>FGN (see Table II)</w:t>
+      </w:r>
+      <w:r>
+        <w:t xml:space="preserve"> received </w:t>
+      </w:r>
+      <w:r>
+        <w:rPr>
+          <w:rFonts w:ascii="Times New Roman" w:hAnsi="Times New Roman" w:cs="Times New Roman"/>
+        </w:rPr>
+        <w:t>2</w:t>
+      </w:r>
+      <w:r>
+        <w:rPr>
+          <w:rFonts w:ascii="Times New Roman" w:hAnsi="Times New Roman" w:cs="Times New Roman"/>
+        </w:rPr>
+        <w:t>822,698,918.94</w:t>
+      </w:r>
+    </w:p>
+    <w:p>
+      <w:pPr>
+        <w:pStyle w:val="Default"/>
+      </w:pPr>
+      <w:r>
+        <w:rPr>
+          <w:rFonts w:ascii="Times New Roman" w:hAnsi="Times New Roman" w:cs="Times New Roman"/>
+        </w:rPr>
+        <w:t>State (see Table III)</w:t>
+      </w:r>
+      <w:r>
+        <w:rPr>
+          <w:rFonts w:ascii="Times New Roman" w:hAnsi="Times New Roman" w:cs="Times New Roman"/>
+        </w:rPr>
+        <w:t xml:space="preserve"> </w:t>
+      </w:r>
+      <w:r>
+        <w:t>9,408,996,396.48</w:t>
+      </w:r>
+    </w:p>
+    <w:p>
+      <w:pPr>
+        <w:pStyle w:val="Default"/>
+        <w:rPr>
+          <w:rFonts w:ascii="Times New Roman" w:hAnsi="Times New Roman" w:cs="Times New Roman"/>
+        </w:rPr>
+      </w:pPr>
+      <w:r>
+        <w:rPr>
+          <w:rFonts w:ascii="Times New Roman" w:hAnsi="Times New Roman" w:cs="Times New Roman"/>
+        </w:rPr>
+        <w:t>LGCs (see Table IV)</w:t>
+      </w:r>
+      <w:r>
+        <w:rPr>
+          <w:rFonts w:ascii="Times New Roman" w:hAnsi="Times New Roman" w:cs="Times New Roman"/>
+        </w:rPr>
+        <w:t xml:space="preserve"> </w:t>
+      </w:r>
+      <w:r>
+        <w:rPr>
+          <w:rFonts w:ascii="Times New Roman" w:hAnsi="Times New Roman" w:cs="Times New Roman"/>
+        </w:rPr>
+        <w:t>6,586,297,477.54</w:t>
+      </w:r>
+    </w:p>
+    <w:p>
+      <w:pPr>
+        <w:pStyle w:val="Default"/>
+        <w:rPr>
+          <w:rFonts w:ascii="Times New Roman" w:hAnsi="Times New Roman" w:cs="Times New Roman"/>
+        </w:rPr>
+      </w:pPr>
+      <w:r>
+        <w:rPr>
+          <w:rFonts w:ascii="Times New Roman" w:hAnsi="Times New Roman" w:cs="Times New Roman"/>
+        </w:rPr>
+        <w:t xml:space="preserve">Cost of Collections </w:t>
+      </w:r>
+      <w:r>
+        <w:rPr>
+          <w:rFonts w:ascii="Times New Roman" w:hAnsi="Times New Roman" w:cs="Times New Roman"/>
+        </w:rPr>
+        <w:t>–</w:t>
+      </w:r>
+      <w:r>
+        <w:rPr>
+          <w:rFonts w:ascii="Times New Roman" w:hAnsi="Times New Roman" w:cs="Times New Roman"/>
+        </w:rPr>
+        <w:t xml:space="preserve"> FIRS</w:t>
+      </w:r>
+      <w:r>
+        <w:rPr>
+          <w:rFonts w:ascii="Times New Roman" w:hAnsi="Times New Roman" w:cs="Times New Roman"/>
+        </w:rPr>
+        <w:t xml:space="preserve"> </w:t>
+      </w:r>
+      <w:r>
+        <w:rPr>
+          <w:rFonts w:ascii="Times New Roman" w:hAnsi="Times New Roman" w:cs="Times New Roman"/>
+        </w:rPr>
+        <w:t>784,083,033.04</w:t>
+      </w:r>
+    </w:p>
+    <w:p>
+      <w:pPr>
+        <w:pStyle w:val="Default"/>
+        <w:rPr>
+          <w:rFonts w:ascii="Times New Roman" w:hAnsi="Times New Roman" w:cs="Times New Roman"/>
+        </w:rPr>
+      </w:pPr>
+    </w:p>
+    <w:p>
+      <w:pPr>
+        <w:pStyle w:val="Default"/>
+        <w:rPr>
+          <w:rFonts w:ascii="Times New Roman" w:hAnsi="Times New Roman" w:cs="Times New Roman"/>
+        </w:rPr>
+      </w:pPr>
+      <w:r>
+        <w:rPr>
+          <w:rFonts w:ascii="Times New Roman" w:hAnsi="Times New Roman" w:cs="Times New Roman"/>
+        </w:rPr>
+        <w:t xml:space="preserve">TOTAL is </w:t>
+      </w:r>
+      <w:r>
+        <w:rPr>
+          <w:rFonts w:ascii="Times New Roman" w:hAnsi="Times New Roman" w:cs="Times New Roman"/>
+        </w:rPr>
+        <w:t>19,602,075,826.00</w:t>
+      </w:r>
+    </w:p>
+    <w:p>
+      <w:pPr>
+        <w:pStyle w:val="Default"/>
+        <w:rPr>
+          <w:rFonts w:ascii="Times New Roman" w:hAnsi="Times New Roman" w:cs="Times New Roman"/>
+        </w:rPr>
+      </w:pPr>
+    </w:p>
+    <w:p>
+      <w:pPr>
+        <w:pStyle w:val="Default"/>
+        <w:rPr>
+          <w:rFonts w:ascii="Times New Roman" w:hAnsi="Times New Roman" w:cs="Times New Roman"/>
+          <w:sz w:val="23"/>
+          <w:szCs w:val="23"/>
+        </w:rPr>
+      </w:pPr>
+      <w:r>
+        <w:rPr>
+          <w:rFonts w:ascii="Times New Roman" w:hAnsi="Times New Roman" w:cs="Times New Roman"/>
+        </w:rPr>
+        <w:t xml:space="preserve">PAGE 18 contained a table that is about </w:t>
+      </w:r>
+      <w:r>
+        <w:rPr>
+          <w:rFonts w:ascii="Times New Roman" w:hAnsi="Times New Roman" w:cs="Times New Roman"/>
+          <w:b/>
+          <w:bCs/>
+          <w:sz w:val="23"/>
+          <w:szCs w:val="23"/>
+        </w:rPr>
+        <w:t xml:space="preserve">Distribution of Revenue Allocation to FGN </w:t>
+      </w:r>
+    </w:p>
+    <w:p>
+      <w:pPr>
+        <w:pStyle w:val="Default"/>
+        <w:rPr>
+          <w:rFonts w:ascii="Times New Roman" w:hAnsi="Times New Roman" w:cs="Times New Roman"/>
+        </w:rPr>
+      </w:pPr>
+    </w:p>
+    <w:p>
+      <w:pPr>
+        <w:pStyle w:val="Default"/>
+        <w:rPr>
+          <w:rFonts w:ascii="Times New Roman" w:hAnsi="Times New Roman" w:cs="Times New Roman"/>
+        </w:rPr>
+      </w:pPr>
+      <w:r>
+        <w:rPr>
+          <w:rFonts w:ascii="Times New Roman" w:hAnsi="Times New Roman" w:cs="Times New Roman"/>
+        </w:rPr>
+        <w:t>T</w:t>
+      </w:r>
+      <w:r>
+        <w:rPr>
+          <w:rFonts w:ascii="Times New Roman" w:hAnsi="Times New Roman" w:cs="Times New Roman"/>
+        </w:rPr>
+        <w:t xml:space="preserve">he money allocated to FGN through EMTL was </w:t>
+      </w:r>
+      <w:r>
+        <w:rPr>
+          <w:rFonts w:ascii="Times New Roman" w:hAnsi="Times New Roman" w:cs="Times New Roman"/>
+        </w:rPr>
+        <w:t>2</w:t>
+      </w:r>
+      <w:r>
+        <w:rPr>
+          <w:rFonts w:ascii="Times New Roman" w:hAnsi="Times New Roman" w:cs="Times New Roman"/>
+        </w:rPr>
+        <w:t xml:space="preserve">822,698,918.94 in the table in page 17 only </w:t>
+      </w:r>
+      <w:r>
+        <w:rPr>
+          <w:rFonts w:ascii="Times New Roman" w:hAnsi="Times New Roman" w:cs="Times New Roman"/>
+        </w:rPr>
+        <w:t>2,822,698,918.94</w:t>
+      </w:r>
+      <w:r>
+        <w:rPr>
+          <w:rFonts w:ascii="Times New Roman" w:hAnsi="Times New Roman" w:cs="Times New Roman"/>
+        </w:rPr>
+        <w:t xml:space="preserve"> (same amount was allocated to different </w:t>
+      </w:r>
+      <w:proofErr w:type="gramStart"/>
+      <w:r>
+        <w:rPr>
+          <w:rFonts w:ascii="Times New Roman" w:hAnsi="Times New Roman" w:cs="Times New Roman"/>
+        </w:rPr>
+        <w:t>sectors,</w:t>
+      </w:r>
+      <w:proofErr w:type="gramEnd"/>
+      <w:r>
+        <w:rPr>
+          <w:rFonts w:ascii="Times New Roman" w:hAnsi="Times New Roman" w:cs="Times New Roman"/>
+        </w:rPr>
+        <w:t xml:space="preserve"> those sectors are:</w:t>
+      </w:r>
+    </w:p>
+    <w:p>
+      <w:pPr>
+        <w:pStyle w:val="Default"/>
+        <w:rPr>
+          <w:rFonts w:ascii="Times New Roman" w:hAnsi="Times New Roman" w:cs="Times New Roman"/>
+        </w:rPr>
+      </w:pPr>
+      <w:r>
+        <w:rPr>
+          <w:rFonts w:ascii="Times New Roman" w:hAnsi="Times New Roman" w:cs="Times New Roman"/>
+        </w:rPr>
+        <w:t>FGN (CRF Account)</w:t>
+      </w:r>
+      <w:r>
+        <w:rPr>
+          <w:rFonts w:ascii="Times New Roman" w:hAnsi="Times New Roman" w:cs="Times New Roman"/>
+        </w:rPr>
+        <w:t xml:space="preserve"> and FCT ABUJA</w:t>
+      </w:r>
+    </w:p>
+    <w:p>
+      <w:pPr>
+        <w:pStyle w:val="Default"/>
+        <w:rPr>
+          <w:rFonts w:ascii="Times New Roman" w:hAnsi="Times New Roman" w:cs="Times New Roman"/>
+        </w:rPr>
+      </w:pPr>
+    </w:p>
+    <w:p>
+      <w:pPr>
+        <w:pStyle w:val="Default"/>
+        <w:rPr>
+          <w:rFonts w:ascii="Times New Roman" w:hAnsi="Times New Roman" w:cs="Times New Roman"/>
+        </w:rPr>
+      </w:pPr>
+      <w:r>
+        <w:rPr>
+          <w:rFonts w:ascii="Times New Roman" w:hAnsi="Times New Roman" w:cs="Times New Roman"/>
+        </w:rPr>
+        <w:t xml:space="preserve">In page 17, the amount allocated to STATES in total was </w:t>
+      </w:r>
+      <w:r>
+        <w:rPr>
+          <w:rFonts w:ascii="Times New Roman" w:hAnsi="Times New Roman" w:cs="Times New Roman"/>
+        </w:rPr>
+        <w:t>9,408,996,396.48</w:t>
+      </w:r>
+      <w:r>
+        <w:rPr>
+          <w:rFonts w:ascii="Times New Roman" w:hAnsi="Times New Roman" w:cs="Times New Roman"/>
+        </w:rPr>
+        <w:t xml:space="preserve">, in Page 19 with table that described the </w:t>
+      </w:r>
+      <w:r>
+        <w:rPr>
+          <w:rFonts w:ascii="Times New Roman" w:hAnsi="Times New Roman" w:cs="Times New Roman"/>
+        </w:rPr>
+        <w:t>Distribution of Revenue Allocation to State Governments</w:t>
+      </w:r>
+      <w:r>
+        <w:rPr>
+          <w:rFonts w:ascii="Times New Roman" w:hAnsi="Times New Roman" w:cs="Times New Roman"/>
+        </w:rPr>
+        <w:t xml:space="preserve"> the total allocated to states </w:t>
+      </w:r>
+      <w:proofErr w:type="spellStart"/>
+      <w:r>
+        <w:rPr>
+          <w:rFonts w:ascii="Times New Roman" w:hAnsi="Times New Roman" w:cs="Times New Roman"/>
+        </w:rPr>
+        <w:t>fro</w:t>
+      </w:r>
+      <w:proofErr w:type="spellEnd"/>
+      <w:r>
+        <w:rPr>
+          <w:rFonts w:ascii="Times New Roman" w:hAnsi="Times New Roman" w:cs="Times New Roman"/>
+        </w:rPr>
+        <w:t xml:space="preserve"> EMTL was </w:t>
+      </w:r>
+      <w:r>
+        <w:rPr>
+          <w:rFonts w:ascii="Times New Roman" w:hAnsi="Times New Roman" w:cs="Times New Roman"/>
+        </w:rPr>
+        <w:t>9,408,996,396.48</w:t>
+      </w:r>
+      <w:r>
+        <w:rPr>
+          <w:rFonts w:ascii="Times New Roman" w:hAnsi="Times New Roman" w:cs="Times New Roman"/>
+        </w:rPr>
+        <w:t xml:space="preserve"> it tallied</w:t>
+      </w:r>
+    </w:p>
+    <w:p>
+      <w:pPr>
+        <w:pStyle w:val="Default"/>
+        <w:rPr>
+          <w:rFonts w:ascii="Times New Roman" w:hAnsi="Times New Roman" w:cs="Times New Roman"/>
+        </w:rPr>
+      </w:pPr>
+    </w:p>
+    <w:p>
+      <w:pPr>
+        <w:pStyle w:val="Default"/>
+        <w:rPr>
+          <w:rFonts w:ascii="Times New Roman" w:hAnsi="Times New Roman" w:cs="Times New Roman"/>
+        </w:rPr>
+      </w:pPr>
+      <w:r>
+        <w:rPr>
+          <w:rFonts w:ascii="Times New Roman" w:hAnsi="Times New Roman" w:cs="Times New Roman"/>
+        </w:rPr>
+        <w:t>COMPARING THE PDF TO THE SHEETS</w:t>
+      </w:r>
+    </w:p>
+    <w:p>
+      <w:pPr>
+        <w:pStyle w:val="Default"/>
+        <w:rPr>
+          <w:rFonts w:ascii="Times New Roman" w:hAnsi="Times New Roman" w:cs="Times New Roman"/>
+        </w:rPr>
+      </w:pPr>
+      <w:r>
+        <w:rPr>
+          <w:rFonts w:ascii="Times New Roman" w:hAnsi="Times New Roman" w:cs="Times New Roman"/>
+        </w:rPr>
+        <w:t>In the Sum and FG sheet TABLE 1</w:t>
+      </w:r>
+    </w:p>
+    <w:p>
+      <w:pPr>
+        <w:pStyle w:val="Default"/>
+        <w:rPr>
+          <w:rFonts w:ascii="Times New Roman" w:hAnsi="Times New Roman" w:cs="Times New Roman"/>
+        </w:rPr>
+      </w:pPr>
+    </w:p>
+    <w:p>
+      <w:pPr>
+        <w:pStyle w:val="Default"/>
+        <w:rPr>
+          <w:rFonts w:ascii="Times New Roman" w:hAnsi="Times New Roman" w:cs="Times New Roman"/>
+        </w:rPr>
+      </w:pPr>
+      <w:r>
+        <w:rPr>
+          <w:rFonts w:ascii="Times New Roman" w:hAnsi="Times New Roman" w:cs="Times New Roman"/>
+        </w:rPr>
+        <w:t>FGN (see Table II)</w:t>
+      </w:r>
+      <w:r>
+        <w:rPr>
+          <w:rFonts w:ascii="Times New Roman" w:hAnsi="Times New Roman" w:cs="Times New Roman"/>
+        </w:rPr>
+        <w:t xml:space="preserve">   </w:t>
+      </w:r>
+      <w:r>
+        <w:rPr>
+          <w:rFonts w:ascii="Times New Roman" w:hAnsi="Times New Roman" w:cs="Times New Roman"/>
+        </w:rPr>
+        <w:t xml:space="preserve"> 2,822,698,918.94 </w:t>
+      </w:r>
+    </w:p>
+    <w:p>
+      <w:pPr>
+        <w:pStyle w:val="Default"/>
+        <w:rPr>
+          <w:rFonts w:ascii="Times New Roman" w:hAnsi="Times New Roman" w:cs="Times New Roman"/>
+        </w:rPr>
+      </w:pPr>
+      <w:r>
+        <w:rPr>
+          <w:rFonts w:ascii="Times New Roman" w:hAnsi="Times New Roman" w:cs="Times New Roman"/>
+        </w:rPr>
+        <w:t>State (see Table III)</w:t>
+      </w:r>
+      <w:r>
+        <w:rPr>
+          <w:rFonts w:ascii="Times New Roman" w:hAnsi="Times New Roman" w:cs="Times New Roman"/>
+        </w:rPr>
+        <w:t xml:space="preserve">   </w:t>
+      </w:r>
+      <w:r>
+        <w:rPr>
+          <w:rFonts w:ascii="Times New Roman" w:hAnsi="Times New Roman" w:cs="Times New Roman"/>
+        </w:rPr>
+        <w:t xml:space="preserve"> 9,408,996,396.48 </w:t>
+      </w:r>
+    </w:p>
+    <w:p>
+      <w:pPr>
+        <w:pStyle w:val="Default"/>
+        <w:rPr>
+          <w:rFonts w:ascii="Times New Roman" w:hAnsi="Times New Roman" w:cs="Times New Roman"/>
+        </w:rPr>
+      </w:pPr>
+      <w:r>
+        <w:rPr>
+          <w:rFonts w:ascii="Times New Roman" w:hAnsi="Times New Roman" w:cs="Times New Roman"/>
+        </w:rPr>
+        <w:t>LGCs (see Table IV)</w:t>
+      </w:r>
+      <w:r>
+        <w:rPr>
+          <w:rFonts w:ascii="Times New Roman" w:hAnsi="Times New Roman" w:cs="Times New Roman"/>
+        </w:rPr>
+        <w:t xml:space="preserve">  </w:t>
+      </w:r>
+      <w:r>
+        <w:rPr>
+          <w:rFonts w:ascii="Times New Roman" w:hAnsi="Times New Roman" w:cs="Times New Roman"/>
+        </w:rPr>
+        <w:t xml:space="preserve"> 6,586,297,477.54 </w:t>
+      </w:r>
+    </w:p>
+    <w:p>
+      <w:pPr>
+        <w:pStyle w:val="Default"/>
+        <w:rPr>
+          <w:rFonts w:ascii="Times New Roman" w:hAnsi="Times New Roman" w:cs="Times New Roman"/>
+        </w:rPr>
+      </w:pPr>
+      <w:r>
+        <w:rPr>
+          <w:rFonts w:ascii="Times New Roman" w:hAnsi="Times New Roman" w:cs="Times New Roman"/>
+        </w:rPr>
+        <w:t xml:space="preserve">Cost of Collections </w:t>
+      </w:r>
+      <w:r>
+        <w:rPr>
+          <w:rFonts w:ascii="Times New Roman" w:hAnsi="Times New Roman" w:cs="Times New Roman"/>
+        </w:rPr>
+        <w:t>–</w:t>
+      </w:r>
+      <w:r>
+        <w:rPr>
+          <w:rFonts w:ascii="Times New Roman" w:hAnsi="Times New Roman" w:cs="Times New Roman"/>
+        </w:rPr>
+        <w:t xml:space="preserve"> FIRS</w:t>
+      </w:r>
+      <w:r>
+        <w:rPr>
+          <w:rFonts w:ascii="Times New Roman" w:hAnsi="Times New Roman" w:cs="Times New Roman"/>
+        </w:rPr>
+        <w:t xml:space="preserve">  </w:t>
+      </w:r>
+      <w:r>
+        <w:rPr>
+          <w:rFonts w:ascii="Times New Roman" w:hAnsi="Times New Roman" w:cs="Times New Roman"/>
+        </w:rPr>
+        <w:t xml:space="preserve"> 784,083,033.04</w:t>
+      </w:r>
+    </w:p>
+    <w:p>
+      <w:pPr>
+        <w:pStyle w:val="Default"/>
+        <w:rPr>
+          <w:rFonts w:ascii="Times New Roman" w:hAnsi="Times New Roman" w:cs="Times New Roman"/>
+        </w:rPr>
+      </w:pPr>
+      <w:r>
+        <w:rPr>
+          <w:rFonts w:ascii="Times New Roman" w:hAnsi="Times New Roman" w:cs="Times New Roman"/>
+        </w:rPr>
+        <w:t xml:space="preserve"> </w:t>
+      </w:r>
+      <w:proofErr w:type="gramStart"/>
+      <w:r>
+        <w:rPr>
+          <w:rFonts w:ascii="Times New Roman" w:hAnsi="Times New Roman" w:cs="Times New Roman"/>
+        </w:rPr>
+        <w:t xml:space="preserve">TOTAL </w:t>
+      </w:r>
+      <w:r>
+        <w:rPr>
+          <w:rFonts w:ascii="Times New Roman" w:hAnsi="Times New Roman" w:cs="Times New Roman"/>
+        </w:rPr>
+        <w:t xml:space="preserve"> 19,602,075,826.00</w:t>
+      </w:r>
+      <w:proofErr w:type="gramEnd"/>
+      <w:r>
+        <w:rPr>
+          <w:rFonts w:ascii="Times New Roman" w:hAnsi="Times New Roman" w:cs="Times New Roman"/>
+        </w:rPr>
+        <w:t xml:space="preserve"> </w:t>
+      </w:r>
+    </w:p>
+    <w:p>
+      <w:pPr>
+        <w:pStyle w:val="Default"/>
+        <w:rPr>
+          <w:rFonts w:ascii="Times New Roman" w:hAnsi="Times New Roman" w:cs="Times New Roman"/>
+        </w:rPr>
+      </w:pPr>
+      <w:r>
+        <w:rPr>
+          <w:rFonts w:ascii="Times New Roman" w:hAnsi="Times New Roman" w:cs="Times New Roman"/>
+        </w:rPr>
+        <w:t>THEY ARE ALL CORRECT</w:t>
+      </w:r>
+    </w:p>
+    <w:p>
+      <w:pPr>
+        <w:pStyle w:val="Default"/>
+        <w:rPr>
+          <w:rFonts w:ascii="Times New Roman" w:hAnsi="Times New Roman" w:cs="Times New Roman"/>
+        </w:rPr>
+      </w:pPr>
+    </w:p>
+    <w:p>
+      <w:pPr>
+        <w:pStyle w:val="Default"/>
+        <w:rPr>
+          <w:rFonts w:ascii="Times New Roman" w:hAnsi="Times New Roman" w:cs="Times New Roman"/>
+        </w:rPr>
+      </w:pPr>
+      <w:r>
+        <w:rPr>
+          <w:rFonts w:ascii="Times New Roman" w:hAnsi="Times New Roman" w:cs="Times New Roman"/>
+        </w:rPr>
+        <w:t xml:space="preserve">TABLE II </w:t>
+      </w:r>
+      <w:r>
+        <w:rPr>
+          <w:rFonts w:ascii="Times New Roman" w:hAnsi="Times New Roman" w:cs="Times New Roman"/>
+        </w:rPr>
+        <w:t>Distribution of Revenue Allocation to FGN by Federation Account Allocation Committee for the Month of July, 2024 Shared in August, 2024</w:t>
+      </w:r>
+      <w:r>
+        <w:rPr>
+          <w:rFonts w:ascii="Times New Roman" w:hAnsi="Times New Roman" w:cs="Times New Roman"/>
+        </w:rPr>
+        <w:tab/>
+      </w:r>
+    </w:p>
+    <w:p>
+      <w:pPr>
+        <w:pStyle w:val="Default"/>
+        <w:rPr>
+          <w:rFonts w:ascii="Times New Roman" w:hAnsi="Times New Roman" w:cs="Times New Roman"/>
+        </w:rPr>
+      </w:pPr>
+    </w:p>
+    <w:p>
+      <w:pPr>
+        <w:pStyle w:val="Default"/>
+        <w:rPr>
+          <w:rFonts w:ascii="Times New Roman" w:hAnsi="Times New Roman" w:cs="Times New Roman"/>
+        </w:rPr>
+      </w:pPr>
+      <w:r>
+        <w:rPr>
+          <w:rFonts w:ascii="Times New Roman" w:hAnsi="Times New Roman" w:cs="Times New Roman"/>
+        </w:rPr>
+        <w:t>Same amounts as before were allocated</w:t>
+      </w:r>
+    </w:p>
+    <w:p>
+      <w:pPr>
+        <w:pStyle w:val="Default"/>
+        <w:rPr>
+          <w:rFonts w:ascii="Times New Roman" w:hAnsi="Times New Roman" w:cs="Times New Roman"/>
+        </w:rPr>
+      </w:pPr>
+    </w:p>
+    <w:p>
+      <w:pPr>
+        <w:pStyle w:val="Default"/>
+        <w:rPr>
+          <w:rFonts w:ascii="Times New Roman" w:hAnsi="Times New Roman" w:cs="Times New Roman"/>
+        </w:rPr>
+      </w:pPr>
+      <w:r>
+        <w:rPr>
+          <w:rFonts w:ascii="Times New Roman" w:hAnsi="Times New Roman" w:cs="Times New Roman"/>
+        </w:rPr>
+        <w:t xml:space="preserve">TABLE III </w:t>
+      </w:r>
+      <w:r>
+        <w:rPr>
+          <w:rFonts w:ascii="Times New Roman" w:hAnsi="Times New Roman" w:cs="Times New Roman"/>
+        </w:rPr>
+        <w:t xml:space="preserve">Distribution of Revenue Allocation to State Governments by Federation Account Allocation Committee for the month of July, 2024 shared in </w:t>
+      </w:r>
+      <w:r>
+        <w:rPr>
+          <w:rFonts w:ascii="Times New Roman" w:hAnsi="Times New Roman" w:cs="Times New Roman"/>
+        </w:rPr>
+        <w:t>August, 2024</w:t>
+      </w:r>
+      <w:r>
+        <w:rPr>
+          <w:rFonts w:ascii="Times New Roman" w:hAnsi="Times New Roman" w:cs="Times New Roman"/>
+        </w:rPr>
+        <w:tab/>
+      </w:r>
+      <w:r>
+        <w:rPr>
+          <w:rFonts w:ascii="Times New Roman" w:hAnsi="Times New Roman" w:cs="Times New Roman"/>
+        </w:rPr>
+        <w:tab/>
+      </w:r>
+      <w:r>
+        <w:rPr>
+          <w:rFonts w:ascii="Times New Roman" w:hAnsi="Times New Roman" w:cs="Times New Roman"/>
+        </w:rPr>
+        <w:tab/>
+      </w:r>
+      <w:r>
+        <w:rPr>
+          <w:rFonts w:ascii="Times New Roman" w:hAnsi="Times New Roman" w:cs="Times New Roman"/>
+        </w:rPr>
+        <w:tab/>
+      </w:r>
+    </w:p>
+    <w:p>
+      <w:pPr>
+        <w:pStyle w:val="Default"/>
+        <w:rPr>
+          <w:rFonts w:ascii="Times New Roman" w:hAnsi="Times New Roman" w:cs="Times New Roman"/>
+        </w:rPr>
+      </w:pPr>
+      <w:r>
+        <w:rPr>
+          <w:rFonts w:ascii="Times New Roman" w:hAnsi="Times New Roman" w:cs="Times New Roman"/>
+        </w:rPr>
+        <w:lastRenderedPageBreak/>
+        <w:t>Same amounts as in the reports</w:t>
+      </w:r>
+    </w:p>
+    <w:p>
+      <w:pPr>
+        <w:pStyle w:val="Default"/>
+        <w:rPr>
+          <w:rFonts w:ascii="Times New Roman" w:hAnsi="Times New Roman" w:cs="Times New Roman"/>
+        </w:rPr>
+      </w:pPr>
+    </w:p>
+    <w:p>
+      <w:pPr>
+        <w:pStyle w:val="Default"/>
+        <w:rPr>
+          <w:rFonts w:ascii="Times New Roman" w:hAnsi="Times New Roman" w:cs="Times New Roman"/>
+        </w:rPr>
+      </w:pPr>
+      <w:r>
+        <w:rPr>
+          <w:rFonts w:ascii="Times New Roman" w:hAnsi="Times New Roman" w:cs="Times New Roman"/>
+        </w:rPr>
+        <w:t>TABLE IV</w:t>
+      </w:r>
+    </w:p>
+    <w:p>
+      <w:pPr>
+        <w:pStyle w:val="Default"/>
+        <w:rPr>
+          <w:rFonts w:ascii="Times New Roman" w:hAnsi="Times New Roman" w:cs="Times New Roman"/>
+        </w:rPr>
+      </w:pPr>
+      <w:r>
+        <w:rPr>
+          <w:rFonts w:ascii="Times New Roman" w:hAnsi="Times New Roman" w:cs="Times New Roman"/>
+        </w:rPr>
+        <w:t xml:space="preserve">Local Government </w:t>
+      </w:r>
+      <w:proofErr w:type="gramStart"/>
+      <w:r>
+        <w:rPr>
+          <w:rFonts w:ascii="Times New Roman" w:hAnsi="Times New Roman" w:cs="Times New Roman"/>
+        </w:rPr>
+        <w:t>councils</w:t>
+      </w:r>
+      <w:proofErr w:type="gramEnd"/>
+      <w:r>
+        <w:rPr>
+          <w:rFonts w:ascii="Times New Roman" w:hAnsi="Times New Roman" w:cs="Times New Roman"/>
+        </w:rPr>
+        <w:t xml:space="preserve"> allocation in Sheet 3</w:t>
+      </w:r>
+      <w:bookmarkStart w:id="0" w:name="_GoBack"/>
+      <w:bookmarkEnd w:id="0"/>
+    </w:p>
+    <w:p>
+      <w:pPr>
+        <w:pStyle w:val="Default"/>
+        <w:rPr>
+          <w:rFonts w:ascii="Times New Roman" w:hAnsi="Times New Roman" w:cs="Times New Roman"/>
+        </w:rPr>
+      </w:pPr>
+      <w:r>
+        <w:rPr>
+          <w:rFonts w:ascii="Times New Roman" w:hAnsi="Times New Roman" w:cs="Times New Roman"/>
+        </w:rPr>
+        <w:t>The grand total is same as the report</w:t>
+      </w:r>
+    </w:p>
+    <w:p>
+      <w:pPr>
+        <w:pStyle w:val="Default"/>
+        <w:rPr>
+          <w:rFonts w:ascii="Times New Roman" w:hAnsi="Times New Roman" w:cs="Times New Roman"/>
+        </w:rPr>
+      </w:pPr>
+    </w:p>
+    <w:p>
+      <w:pPr>
+        <w:pStyle w:val="Default"/>
+        <w:rPr>
+          <w:rFonts w:ascii="Times New Roman" w:hAnsi="Times New Roman" w:cs="Times New Roman"/>
+        </w:rPr>
+      </w:pPr>
+    </w:p>
+    <w:p>
+      <w:pPr>
+        <w:pStyle w:val="Default"/>
         <w:rPr>
           <w:rFonts w:ascii="Times New Roman" w:hAnsi="Times New Roman" w:cs="Times New Roman"/>
           <w:b/>
@@ -1036,8 +1827,7 @@
           <w:sz w:val="32"/>
           <w:szCs w:val="32"/>
         </w:rPr>
-        <w:t>_</w:t>
-      </w:r>
+      </w:pPr>
       <w:r>
         <w:rPr>
           <w:rFonts w:ascii="Times New Roman" w:hAnsi="Times New Roman" w:cs="Times New Roman"/>
@@ -1047,7 +1837,7 @@
           <w:sz w:val="32"/>
           <w:szCs w:val="32"/>
         </w:rPr>
-        <w:t>20</w:t>
+        <w:t>FAAC_November</w:t>
       </w:r>
       <w:r>
         <w:rPr>
@@ -1058,802 +1848,52 @@
           <w:sz w:val="32"/>
           <w:szCs w:val="32"/>
         </w:rPr>
-        <w:t>24 REPORT</w:t>
-      </w:r>
-    </w:p>
-    <w:p>
-      <w:r>
-        <w:t>PDF</w:t>
-      </w:r>
-    </w:p>
-    <w:p>
-      <w:r>
-        <w:t>Page 4</w:t>
-      </w:r>
-    </w:p>
-    <w:p>
-      <w:r>
-        <w:t xml:space="preserve">From the revenue generated in July 2024 </w:t>
-      </w:r>
-      <w:r>
-        <w:t>The amount disbursed comprised:</w:t>
-      </w:r>
-      <w:r>
-        <w:t xml:space="preserve"> </w:t>
-      </w:r>
-      <w:r>
-        <w:t>₦19.60 billion from Electronic Money Transfer Levy (EMTL),</w:t>
-      </w:r>
-    </w:p>
-    <w:p/>
-    <w:p>
-      <w:r>
-        <w:t xml:space="preserve">In </w:t>
-      </w:r>
-      <w:r>
-        <w:t>Summary of Gross Revenue Allocation by Federation Account Allocation Committee for the Month of July, 2024 Shared in August, 2024</w:t>
-      </w:r>
-      <w:r>
-        <w:t xml:space="preserve"> Table in Appendixes</w:t>
-      </w:r>
-      <w:r>
-        <w:t xml:space="preserve"> PAGE 17;</w:t>
-      </w:r>
-    </w:p>
-    <w:p>
-      <w:pPr>
-        <w:pStyle w:val="Default"/>
-        <w:rPr>
-          <w:rFonts w:ascii="Times New Roman" w:hAnsi="Times New Roman" w:cs="Times New Roman"/>
-        </w:rPr>
-      </w:pPr>
-      <w:r>
-        <w:t>FGN (see Table II)</w:t>
-      </w:r>
-      <w:r>
-        <w:t xml:space="preserve"> received </w:t>
-      </w:r>
-      <w:r>
-        <w:rPr>
-          <w:rFonts w:ascii="Times New Roman" w:hAnsi="Times New Roman" w:cs="Times New Roman"/>
-        </w:rPr>
-        <w:t>2</w:t>
-      </w:r>
-      <w:r>
-        <w:rPr>
-          <w:rFonts w:ascii="Times New Roman" w:hAnsi="Times New Roman" w:cs="Times New Roman"/>
-        </w:rPr>
-        <w:t>822,698,918.94</w:t>
-      </w:r>
-    </w:p>
-    <w:p>
-      <w:pPr>
-        <w:pStyle w:val="Default"/>
-      </w:pPr>
-      <w:r>
-        <w:rPr>
-          <w:rFonts w:ascii="Times New Roman" w:hAnsi="Times New Roman" w:cs="Times New Roman"/>
-        </w:rPr>
-        <w:t>State (see Table III)</w:t>
-      </w:r>
-      <w:r>
-        <w:rPr>
-          <w:rFonts w:ascii="Times New Roman" w:hAnsi="Times New Roman" w:cs="Times New Roman"/>
-        </w:rPr>
-        <w:t xml:space="preserve"> </w:t>
-      </w:r>
-      <w:r>
-        <w:t>9,408,996,396.48</w:t>
-      </w:r>
-    </w:p>
-    <w:p>
-      <w:pPr>
-        <w:pStyle w:val="Default"/>
-        <w:rPr>
-          <w:rFonts w:ascii="Times New Roman" w:hAnsi="Times New Roman" w:cs="Times New Roman"/>
-        </w:rPr>
-      </w:pPr>
-      <w:r>
-        <w:rPr>
-          <w:rFonts w:ascii="Times New Roman" w:hAnsi="Times New Roman" w:cs="Times New Roman"/>
-        </w:rPr>
-        <w:t>LGCs (see Table IV)</w:t>
-      </w:r>
-      <w:r>
-        <w:rPr>
-          <w:rFonts w:ascii="Times New Roman" w:hAnsi="Times New Roman" w:cs="Times New Roman"/>
-        </w:rPr>
-        <w:t xml:space="preserve"> </w:t>
-      </w:r>
-      <w:r>
-        <w:rPr>
-          <w:rFonts w:ascii="Times New Roman" w:hAnsi="Times New Roman" w:cs="Times New Roman"/>
-        </w:rPr>
-        <w:t>6,586,297,477.54</w:t>
-      </w:r>
-    </w:p>
-    <w:p>
-      <w:pPr>
-        <w:pStyle w:val="Default"/>
-        <w:rPr>
-          <w:rFonts w:ascii="Times New Roman" w:hAnsi="Times New Roman" w:cs="Times New Roman"/>
-        </w:rPr>
-      </w:pPr>
-      <w:r>
-        <w:rPr>
-          <w:rFonts w:ascii="Times New Roman" w:hAnsi="Times New Roman" w:cs="Times New Roman"/>
-        </w:rPr>
-        <w:t xml:space="preserve">Cost of Collections </w:t>
-      </w:r>
-      <w:r>
-        <w:rPr>
-          <w:rFonts w:ascii="Times New Roman" w:hAnsi="Times New Roman" w:cs="Times New Roman"/>
-        </w:rPr>
-        <w:t>–</w:t>
-      </w:r>
-      <w:r>
-        <w:rPr>
-          <w:rFonts w:ascii="Times New Roman" w:hAnsi="Times New Roman" w:cs="Times New Roman"/>
-        </w:rPr>
-        <w:t xml:space="preserve"> FIRS</w:t>
-      </w:r>
-      <w:r>
-        <w:rPr>
-          <w:rFonts w:ascii="Times New Roman" w:hAnsi="Times New Roman" w:cs="Times New Roman"/>
-        </w:rPr>
-        <w:t xml:space="preserve"> </w:t>
-      </w:r>
-      <w:r>
-        <w:rPr>
-          <w:rFonts w:ascii="Times New Roman" w:hAnsi="Times New Roman" w:cs="Times New Roman"/>
-        </w:rPr>
-        <w:t>784,083,033.04</w:t>
-      </w:r>
-    </w:p>
-    <w:p>
-      <w:pPr>
-        <w:pStyle w:val="Default"/>
-        <w:rPr>
-          <w:rFonts w:ascii="Times New Roman" w:hAnsi="Times New Roman" w:cs="Times New Roman"/>
-        </w:rPr>
-      </w:pPr>
-    </w:p>
-    <w:p>
-      <w:pPr>
-        <w:pStyle w:val="Default"/>
-        <w:rPr>
-          <w:rFonts w:ascii="Times New Roman" w:hAnsi="Times New Roman" w:cs="Times New Roman"/>
-        </w:rPr>
-      </w:pPr>
-      <w:r>
-        <w:rPr>
-          <w:rFonts w:ascii="Times New Roman" w:hAnsi="Times New Roman" w:cs="Times New Roman"/>
-        </w:rPr>
-        <w:t xml:space="preserve">TOTAL is </w:t>
-      </w:r>
-      <w:r>
-        <w:rPr>
-          <w:rFonts w:ascii="Times New Roman" w:hAnsi="Times New Roman" w:cs="Times New Roman"/>
-        </w:rPr>
-        <w:t>19,602,075,826.00</w:t>
-      </w:r>
-    </w:p>
-    <w:p>
-      <w:pPr>
-        <w:pStyle w:val="Default"/>
-        <w:rPr>
-          <w:rFonts w:ascii="Times New Roman" w:hAnsi="Times New Roman" w:cs="Times New Roman"/>
-        </w:rPr>
-      </w:pPr>
-    </w:p>
-    <w:p>
-      <w:pPr>
-        <w:pStyle w:val="Default"/>
-        <w:rPr>
-          <w:rFonts w:ascii="Times New Roman" w:hAnsi="Times New Roman" w:cs="Times New Roman"/>
-          <w:sz w:val="23"/>
-          <w:szCs w:val="23"/>
-        </w:rPr>
-      </w:pPr>
-      <w:r>
-        <w:rPr>
-          <w:rFonts w:ascii="Times New Roman" w:hAnsi="Times New Roman" w:cs="Times New Roman"/>
-        </w:rPr>
-        <w:t xml:space="preserve">PAGE 18 contained a table that is about </w:t>
-      </w:r>
-      <w:r>
-        <w:rPr>
-          <w:rFonts w:ascii="Times New Roman" w:hAnsi="Times New Roman" w:cs="Times New Roman"/>
-          <w:b/>
-          <w:bCs/>
-          <w:sz w:val="23"/>
-          <w:szCs w:val="23"/>
-        </w:rPr>
-        <w:t xml:space="preserve">Distribution of Revenue Allocation to FGN </w:t>
-      </w:r>
-    </w:p>
-    <w:p>
-      <w:pPr>
-        <w:pStyle w:val="Default"/>
-        <w:rPr>
-          <w:rFonts w:ascii="Times New Roman" w:hAnsi="Times New Roman" w:cs="Times New Roman"/>
-        </w:rPr>
-      </w:pPr>
-    </w:p>
-    <w:p>
-      <w:pPr>
-        <w:pStyle w:val="Default"/>
-        <w:rPr>
-          <w:rFonts w:ascii="Times New Roman" w:hAnsi="Times New Roman" w:cs="Times New Roman"/>
-        </w:rPr>
-      </w:pPr>
-      <w:r>
-        <w:rPr>
-          <w:rFonts w:ascii="Times New Roman" w:hAnsi="Times New Roman" w:cs="Times New Roman"/>
-        </w:rPr>
-        <w:t>T</w:t>
-      </w:r>
-      <w:r>
-        <w:rPr>
-          <w:rFonts w:ascii="Times New Roman" w:hAnsi="Times New Roman" w:cs="Times New Roman"/>
-        </w:rPr>
-        <w:t xml:space="preserve">he money allocated to FGN through EMTL was </w:t>
-      </w:r>
-      <w:r>
-        <w:rPr>
-          <w:rFonts w:ascii="Times New Roman" w:hAnsi="Times New Roman" w:cs="Times New Roman"/>
-        </w:rPr>
-        <w:t>2</w:t>
-      </w:r>
-      <w:r>
-        <w:rPr>
-          <w:rFonts w:ascii="Times New Roman" w:hAnsi="Times New Roman" w:cs="Times New Roman"/>
-        </w:rPr>
-        <w:t>822,698,918.94</w:t>
-      </w:r>
-      <w:r>
-        <w:rPr>
-          <w:rFonts w:ascii="Times New Roman" w:hAnsi="Times New Roman" w:cs="Times New Roman"/>
-        </w:rPr>
-        <w:t xml:space="preserve"> in the table in page 17 only </w:t>
-      </w:r>
-      <w:r>
-        <w:rPr>
-          <w:rFonts w:ascii="Times New Roman" w:hAnsi="Times New Roman" w:cs="Times New Roman"/>
-        </w:rPr>
-        <w:t>2,822,698,918.94</w:t>
-      </w:r>
-      <w:r>
-        <w:rPr>
-          <w:rFonts w:ascii="Times New Roman" w:hAnsi="Times New Roman" w:cs="Times New Roman"/>
-        </w:rPr>
-        <w:t xml:space="preserve"> (same amount was allocated to different </w:t>
-      </w:r>
-      <w:proofErr w:type="gramStart"/>
-      <w:r>
-        <w:rPr>
-          <w:rFonts w:ascii="Times New Roman" w:hAnsi="Times New Roman" w:cs="Times New Roman"/>
-        </w:rPr>
-        <w:t>sectors,</w:t>
-      </w:r>
-      <w:proofErr w:type="gramEnd"/>
-      <w:r>
-        <w:rPr>
-          <w:rFonts w:ascii="Times New Roman" w:hAnsi="Times New Roman" w:cs="Times New Roman"/>
-        </w:rPr>
-        <w:t xml:space="preserve"> those sectors are:</w:t>
-      </w:r>
-    </w:p>
-    <w:p>
-      <w:pPr>
-        <w:pStyle w:val="Default"/>
-        <w:rPr>
-          <w:rFonts w:ascii="Times New Roman" w:hAnsi="Times New Roman" w:cs="Times New Roman"/>
-        </w:rPr>
-      </w:pPr>
-      <w:r>
-        <w:rPr>
-          <w:rFonts w:ascii="Times New Roman" w:hAnsi="Times New Roman" w:cs="Times New Roman"/>
-        </w:rPr>
-        <w:t>FGN (CRF Account)</w:t>
-      </w:r>
-      <w:r>
-        <w:rPr>
-          <w:rFonts w:ascii="Times New Roman" w:hAnsi="Times New Roman" w:cs="Times New Roman"/>
-        </w:rPr>
-        <w:t xml:space="preserve"> and FCT ABUJA</w:t>
-      </w:r>
-    </w:p>
-    <w:p>
-      <w:pPr>
-        <w:pStyle w:val="Default"/>
-        <w:rPr>
-          <w:rFonts w:ascii="Times New Roman" w:hAnsi="Times New Roman" w:cs="Times New Roman"/>
-        </w:rPr>
-      </w:pPr>
-    </w:p>
-    <w:p>
-      <w:pPr>
-        <w:pStyle w:val="Default"/>
-        <w:rPr>
-          <w:rFonts w:ascii="Times New Roman" w:hAnsi="Times New Roman" w:cs="Times New Roman"/>
-        </w:rPr>
-      </w:pPr>
-      <w:r>
-        <w:rPr>
-          <w:rFonts w:ascii="Times New Roman" w:hAnsi="Times New Roman" w:cs="Times New Roman"/>
-        </w:rPr>
-        <w:t xml:space="preserve">In page 17, the amount allocated to STATES in total was </w:t>
-      </w:r>
-      <w:r>
-        <w:rPr>
-          <w:rFonts w:ascii="Times New Roman" w:hAnsi="Times New Roman" w:cs="Times New Roman"/>
-        </w:rPr>
-        <w:t>9,408,996,396.48</w:t>
-      </w:r>
-      <w:r>
-        <w:rPr>
-          <w:rFonts w:ascii="Times New Roman" w:hAnsi="Times New Roman" w:cs="Times New Roman"/>
-        </w:rPr>
-        <w:t xml:space="preserve">, in Page 19 with table that described the </w:t>
-      </w:r>
-      <w:r>
-        <w:rPr>
-          <w:rFonts w:ascii="Times New Roman" w:hAnsi="Times New Roman" w:cs="Times New Roman"/>
-        </w:rPr>
-        <w:t>Distribution of Revenue Allocation to State Governments</w:t>
-      </w:r>
-      <w:r>
-        <w:rPr>
-          <w:rFonts w:ascii="Times New Roman" w:hAnsi="Times New Roman" w:cs="Times New Roman"/>
-        </w:rPr>
-        <w:t xml:space="preserve"> the total allocated to states </w:t>
-      </w:r>
-      <w:proofErr w:type="spellStart"/>
-      <w:r>
-        <w:rPr>
-          <w:rFonts w:ascii="Times New Roman" w:hAnsi="Times New Roman" w:cs="Times New Roman"/>
-        </w:rPr>
-        <w:t>fro</w:t>
-      </w:r>
-      <w:proofErr w:type="spellEnd"/>
-      <w:r>
-        <w:rPr>
-          <w:rFonts w:ascii="Times New Roman" w:hAnsi="Times New Roman" w:cs="Times New Roman"/>
-        </w:rPr>
-        <w:t xml:space="preserve"> EMTL was </w:t>
-      </w:r>
-      <w:r>
-        <w:rPr>
-          <w:rFonts w:ascii="Times New Roman" w:hAnsi="Times New Roman" w:cs="Times New Roman"/>
-        </w:rPr>
-        <w:t>9,408,996,396.48</w:t>
-      </w:r>
-      <w:r>
-        <w:rPr>
-          <w:rFonts w:ascii="Times New Roman" w:hAnsi="Times New Roman" w:cs="Times New Roman"/>
-        </w:rPr>
-        <w:t xml:space="preserve"> it tallied</w:t>
-      </w:r>
-    </w:p>
-    <w:p>
-      <w:pPr>
-        <w:pStyle w:val="Default"/>
-        <w:rPr>
-          <w:rFonts w:ascii="Times New Roman" w:hAnsi="Times New Roman" w:cs="Times New Roman"/>
-        </w:rPr>
-      </w:pPr>
-    </w:p>
-    <w:p>
-      <w:pPr>
-        <w:pStyle w:val="Default"/>
-        <w:rPr>
-          <w:rFonts w:ascii="Times New Roman" w:hAnsi="Times New Roman" w:cs="Times New Roman"/>
-        </w:rPr>
-      </w:pPr>
-      <w:r>
-        <w:rPr>
-          <w:rFonts w:ascii="Times New Roman" w:hAnsi="Times New Roman" w:cs="Times New Roman"/>
-        </w:rPr>
-        <w:t>COMPARING THE PDF TO THE SHEETS</w:t>
-      </w:r>
-    </w:p>
-    <w:p>
-      <w:pPr>
-        <w:pStyle w:val="Default"/>
-        <w:rPr>
-          <w:rFonts w:ascii="Times New Roman" w:hAnsi="Times New Roman" w:cs="Times New Roman"/>
-        </w:rPr>
-      </w:pPr>
-      <w:r>
-        <w:rPr>
-          <w:rFonts w:ascii="Times New Roman" w:hAnsi="Times New Roman" w:cs="Times New Roman"/>
-        </w:rPr>
-        <w:t>In the Sum and FG sheet TABLE 1</w:t>
-      </w:r>
-    </w:p>
-    <w:p>
-      <w:pPr>
-        <w:pStyle w:val="Default"/>
-        <w:rPr>
-          <w:rFonts w:ascii="Times New Roman" w:hAnsi="Times New Roman" w:cs="Times New Roman"/>
-        </w:rPr>
-      </w:pPr>
-    </w:p>
-    <w:p>
-      <w:pPr>
-        <w:pStyle w:val="Default"/>
-        <w:rPr>
-          <w:rFonts w:ascii="Times New Roman" w:hAnsi="Times New Roman" w:cs="Times New Roman"/>
-        </w:rPr>
-      </w:pPr>
-      <w:r>
-        <w:rPr>
-          <w:rFonts w:ascii="Times New Roman" w:hAnsi="Times New Roman" w:cs="Times New Roman"/>
-        </w:rPr>
-        <w:t>FGN (see Table II)</w:t>
-      </w:r>
-      <w:r>
-        <w:rPr>
-          <w:rFonts w:ascii="Times New Roman" w:hAnsi="Times New Roman" w:cs="Times New Roman"/>
-        </w:rPr>
-        <w:t xml:space="preserve">   </w:t>
-      </w:r>
-      <w:r>
-        <w:rPr>
-          <w:rFonts w:ascii="Times New Roman" w:hAnsi="Times New Roman" w:cs="Times New Roman"/>
-        </w:rPr>
-        <w:t xml:space="preserve"> 2,822,698,918.94 </w:t>
-      </w:r>
-    </w:p>
-    <w:p>
-      <w:pPr>
-        <w:pStyle w:val="Default"/>
-        <w:rPr>
-          <w:rFonts w:ascii="Times New Roman" w:hAnsi="Times New Roman" w:cs="Times New Roman"/>
-        </w:rPr>
-      </w:pPr>
-      <w:r>
-        <w:rPr>
-          <w:rFonts w:ascii="Times New Roman" w:hAnsi="Times New Roman" w:cs="Times New Roman"/>
-        </w:rPr>
-        <w:t>State (see Table III)</w:t>
-      </w:r>
-      <w:r>
-        <w:rPr>
-          <w:rFonts w:ascii="Times New Roman" w:hAnsi="Times New Roman" w:cs="Times New Roman"/>
-        </w:rPr>
-        <w:t xml:space="preserve">   </w:t>
-      </w:r>
-      <w:r>
-        <w:rPr>
-          <w:rFonts w:ascii="Times New Roman" w:hAnsi="Times New Roman" w:cs="Times New Roman"/>
-        </w:rPr>
-        <w:t xml:space="preserve"> 9,408,996,396.48 </w:t>
-      </w:r>
-    </w:p>
-    <w:p>
-      <w:pPr>
-        <w:pStyle w:val="Default"/>
-        <w:rPr>
-          <w:rFonts w:ascii="Times New Roman" w:hAnsi="Times New Roman" w:cs="Times New Roman"/>
-        </w:rPr>
-      </w:pPr>
-      <w:r>
-        <w:rPr>
-          <w:rFonts w:ascii="Times New Roman" w:hAnsi="Times New Roman" w:cs="Times New Roman"/>
-        </w:rPr>
-        <w:t>LGCs (see Table IV)</w:t>
-      </w:r>
-      <w:r>
-        <w:rPr>
-          <w:rFonts w:ascii="Times New Roman" w:hAnsi="Times New Roman" w:cs="Times New Roman"/>
-        </w:rPr>
-        <w:t xml:space="preserve">  </w:t>
-      </w:r>
-      <w:r>
-        <w:rPr>
-          <w:rFonts w:ascii="Times New Roman" w:hAnsi="Times New Roman" w:cs="Times New Roman"/>
-        </w:rPr>
-        <w:t xml:space="preserve"> 6,586,297,477.54 </w:t>
-      </w:r>
-    </w:p>
-    <w:p>
-      <w:pPr>
-        <w:pStyle w:val="Default"/>
-        <w:rPr>
-          <w:rFonts w:ascii="Times New Roman" w:hAnsi="Times New Roman" w:cs="Times New Roman"/>
-        </w:rPr>
-      </w:pPr>
-      <w:r>
-        <w:rPr>
-          <w:rFonts w:ascii="Times New Roman" w:hAnsi="Times New Roman" w:cs="Times New Roman"/>
-        </w:rPr>
-        <w:t xml:space="preserve">Cost of Collections </w:t>
-      </w:r>
-      <w:r>
-        <w:rPr>
-          <w:rFonts w:ascii="Times New Roman" w:hAnsi="Times New Roman" w:cs="Times New Roman"/>
-        </w:rPr>
-        <w:t>–</w:t>
-      </w:r>
-      <w:r>
-        <w:rPr>
-          <w:rFonts w:ascii="Times New Roman" w:hAnsi="Times New Roman" w:cs="Times New Roman"/>
-        </w:rPr>
-        <w:t xml:space="preserve"> FIRS</w:t>
-      </w:r>
-      <w:r>
-        <w:rPr>
-          <w:rFonts w:ascii="Times New Roman" w:hAnsi="Times New Roman" w:cs="Times New Roman"/>
-        </w:rPr>
-        <w:t xml:space="preserve">  </w:t>
-      </w:r>
-      <w:r>
-        <w:rPr>
-          <w:rFonts w:ascii="Times New Roman" w:hAnsi="Times New Roman" w:cs="Times New Roman"/>
-        </w:rPr>
-        <w:t xml:space="preserve"> 784,083,033.04</w:t>
-      </w:r>
-    </w:p>
-    <w:p>
-      <w:pPr>
-        <w:pStyle w:val="Default"/>
-        <w:rPr>
-          <w:rFonts w:ascii="Times New Roman" w:hAnsi="Times New Roman" w:cs="Times New Roman"/>
-        </w:rPr>
-      </w:pPr>
-      <w:r>
-        <w:rPr>
-          <w:rFonts w:ascii="Times New Roman" w:hAnsi="Times New Roman" w:cs="Times New Roman"/>
-        </w:rPr>
-        <w:t xml:space="preserve"> </w:t>
-      </w:r>
-      <w:proofErr w:type="gramStart"/>
-      <w:r>
-        <w:rPr>
-          <w:rFonts w:ascii="Times New Roman" w:hAnsi="Times New Roman" w:cs="Times New Roman"/>
-        </w:rPr>
-        <w:t xml:space="preserve">TOTAL </w:t>
-      </w:r>
-      <w:r>
-        <w:rPr>
-          <w:rFonts w:ascii="Times New Roman" w:hAnsi="Times New Roman" w:cs="Times New Roman"/>
-        </w:rPr>
-        <w:t xml:space="preserve"> 19,602,075,826.00</w:t>
-      </w:r>
-      <w:proofErr w:type="gramEnd"/>
-      <w:r>
-        <w:rPr>
-          <w:rFonts w:ascii="Times New Roman" w:hAnsi="Times New Roman" w:cs="Times New Roman"/>
-        </w:rPr>
-        <w:t xml:space="preserve"> </w:t>
-      </w:r>
-    </w:p>
-    <w:p>
-      <w:pPr>
-        <w:pStyle w:val="Default"/>
-        <w:rPr>
-          <w:rFonts w:ascii="Times New Roman" w:hAnsi="Times New Roman" w:cs="Times New Roman"/>
-        </w:rPr>
-      </w:pPr>
-      <w:r>
-        <w:rPr>
-          <w:rFonts w:ascii="Times New Roman" w:hAnsi="Times New Roman" w:cs="Times New Roman"/>
-        </w:rPr>
-        <w:t>THEY ARE ALL CORRECT</w:t>
-      </w:r>
-    </w:p>
-    <w:p>
-      <w:pPr>
-        <w:pStyle w:val="Default"/>
-        <w:rPr>
-          <w:rFonts w:ascii="Times New Roman" w:hAnsi="Times New Roman" w:cs="Times New Roman"/>
-        </w:rPr>
-      </w:pPr>
-    </w:p>
-    <w:p>
-      <w:pPr>
-        <w:pStyle w:val="Default"/>
-        <w:rPr>
-          <w:rFonts w:ascii="Times New Roman" w:hAnsi="Times New Roman" w:cs="Times New Roman"/>
-        </w:rPr>
-      </w:pPr>
-      <w:r>
-        <w:rPr>
-          <w:rFonts w:ascii="Times New Roman" w:hAnsi="Times New Roman" w:cs="Times New Roman"/>
-        </w:rPr>
-        <w:t xml:space="preserve">TABLE II </w:t>
-      </w:r>
-      <w:r>
-        <w:rPr>
-          <w:rFonts w:ascii="Times New Roman" w:hAnsi="Times New Roman" w:cs="Times New Roman"/>
-        </w:rPr>
-        <w:t>Distribution of Revenue Allocation to FGN by Federation Account Allocation Committee for the Month of July, 2024 Shared in August, 2024</w:t>
-      </w:r>
-      <w:r>
-        <w:rPr>
-          <w:rFonts w:ascii="Times New Roman" w:hAnsi="Times New Roman" w:cs="Times New Roman"/>
-        </w:rPr>
-        <w:tab/>
-      </w:r>
-    </w:p>
-    <w:p>
-      <w:pPr>
-        <w:pStyle w:val="Default"/>
-        <w:rPr>
-          <w:rFonts w:ascii="Times New Roman" w:hAnsi="Times New Roman" w:cs="Times New Roman"/>
-        </w:rPr>
-      </w:pPr>
-    </w:p>
-    <w:p>
-      <w:pPr>
-        <w:pStyle w:val="Default"/>
-        <w:rPr>
-          <w:rFonts w:ascii="Times New Roman" w:hAnsi="Times New Roman" w:cs="Times New Roman"/>
-        </w:rPr>
-      </w:pPr>
-      <w:r>
-        <w:rPr>
-          <w:rFonts w:ascii="Times New Roman" w:hAnsi="Times New Roman" w:cs="Times New Roman"/>
-        </w:rPr>
-        <w:t>Same amounts as before were allocated</w:t>
-      </w:r>
-    </w:p>
-    <w:p>
-      <w:pPr>
-        <w:pStyle w:val="Default"/>
-        <w:rPr>
-          <w:rFonts w:ascii="Times New Roman" w:hAnsi="Times New Roman" w:cs="Times New Roman"/>
-        </w:rPr>
-      </w:pPr>
-    </w:p>
-    <w:p>
-      <w:pPr>
-        <w:pStyle w:val="Default"/>
-        <w:rPr>
-          <w:rFonts w:ascii="Times New Roman" w:hAnsi="Times New Roman" w:cs="Times New Roman"/>
-        </w:rPr>
-      </w:pPr>
-      <w:r>
-        <w:rPr>
-          <w:rFonts w:ascii="Times New Roman" w:hAnsi="Times New Roman" w:cs="Times New Roman"/>
-        </w:rPr>
-        <w:t xml:space="preserve">TABLE III </w:t>
-      </w:r>
-      <w:r>
-        <w:rPr>
-          <w:rFonts w:ascii="Times New Roman" w:hAnsi="Times New Roman" w:cs="Times New Roman"/>
-        </w:rPr>
-        <w:t xml:space="preserve">Distribution of Revenue Allocation to State Governments by Federation Account Allocation Committee for the month of July, 2024 shared in </w:t>
-      </w:r>
-      <w:r>
-        <w:rPr>
-          <w:rFonts w:ascii="Times New Roman" w:hAnsi="Times New Roman" w:cs="Times New Roman"/>
-        </w:rPr>
-        <w:t>August, 2024</w:t>
-      </w:r>
-      <w:r>
-        <w:rPr>
-          <w:rFonts w:ascii="Times New Roman" w:hAnsi="Times New Roman" w:cs="Times New Roman"/>
-        </w:rPr>
-        <w:tab/>
-      </w:r>
-      <w:r>
-        <w:rPr>
-          <w:rFonts w:ascii="Times New Roman" w:hAnsi="Times New Roman" w:cs="Times New Roman"/>
-        </w:rPr>
-        <w:tab/>
-      </w:r>
-      <w:r>
-        <w:rPr>
-          <w:rFonts w:ascii="Times New Roman" w:hAnsi="Times New Roman" w:cs="Times New Roman"/>
-        </w:rPr>
-        <w:tab/>
-      </w:r>
-      <w:r>
-        <w:rPr>
-          <w:rFonts w:ascii="Times New Roman" w:hAnsi="Times New Roman" w:cs="Times New Roman"/>
-        </w:rPr>
-        <w:tab/>
-      </w:r>
-    </w:p>
-    <w:p>
-      <w:pPr>
-        <w:pStyle w:val="Default"/>
-        <w:rPr>
-          <w:rFonts w:ascii="Times New Roman" w:hAnsi="Times New Roman" w:cs="Times New Roman"/>
-        </w:rPr>
-      </w:pPr>
-      <w:r>
-        <w:rPr>
-          <w:rFonts w:ascii="Times New Roman" w:hAnsi="Times New Roman" w:cs="Times New Roman"/>
-        </w:rPr>
-        <w:lastRenderedPageBreak/>
-        <w:t>Same amounts as in the reports</w:t>
-      </w:r>
-    </w:p>
-    <w:p>
-      <w:pPr>
-        <w:pStyle w:val="Default"/>
-        <w:rPr>
-          <w:rFonts w:ascii="Times New Roman" w:hAnsi="Times New Roman" w:cs="Times New Roman"/>
-        </w:rPr>
-      </w:pPr>
-    </w:p>
-    <w:p>
-      <w:pPr>
-        <w:pStyle w:val="Default"/>
-        <w:rPr>
-          <w:rFonts w:ascii="Times New Roman" w:hAnsi="Times New Roman" w:cs="Times New Roman"/>
-        </w:rPr>
-      </w:pPr>
-      <w:r>
-        <w:rPr>
-          <w:rFonts w:ascii="Times New Roman" w:hAnsi="Times New Roman" w:cs="Times New Roman"/>
-        </w:rPr>
-        <w:t>TABLE IV</w:t>
-      </w:r>
-    </w:p>
-    <w:p>
-      <w:pPr>
-        <w:pStyle w:val="Default"/>
-        <w:rPr>
-          <w:rFonts w:ascii="Times New Roman" w:hAnsi="Times New Roman" w:cs="Times New Roman"/>
-        </w:rPr>
-      </w:pPr>
-      <w:r>
-        <w:rPr>
-          <w:rFonts w:ascii="Times New Roman" w:hAnsi="Times New Roman" w:cs="Times New Roman"/>
-        </w:rPr>
-        <w:t xml:space="preserve">Local Government </w:t>
-      </w:r>
-      <w:proofErr w:type="gramStart"/>
-      <w:r>
-        <w:rPr>
-          <w:rFonts w:ascii="Times New Roman" w:hAnsi="Times New Roman" w:cs="Times New Roman"/>
-        </w:rPr>
-        <w:t>councils</w:t>
-      </w:r>
-      <w:proofErr w:type="gramEnd"/>
-      <w:r>
-        <w:rPr>
-          <w:rFonts w:ascii="Times New Roman" w:hAnsi="Times New Roman" w:cs="Times New Roman"/>
-        </w:rPr>
-        <w:t xml:space="preserve"> allocation in Sheet 3</w:t>
-      </w:r>
-    </w:p>
-    <w:p>
-      <w:pPr>
-        <w:pStyle w:val="Default"/>
-        <w:rPr>
-          <w:rFonts w:ascii="Times New Roman" w:hAnsi="Times New Roman" w:cs="Times New Roman"/>
-        </w:rPr>
-      </w:pPr>
-      <w:r>
-        <w:rPr>
-          <w:rFonts w:ascii="Times New Roman" w:hAnsi="Times New Roman" w:cs="Times New Roman"/>
-        </w:rPr>
-        <w:t>The grand total is same as the report</w:t>
-      </w:r>
-    </w:p>
-    <w:p>
-      <w:pPr>
-        <w:pStyle w:val="Default"/>
-        <w:rPr>
-          <w:rFonts w:ascii="Times New Roman" w:hAnsi="Times New Roman" w:cs="Times New Roman"/>
-        </w:rPr>
-      </w:pPr>
-    </w:p>
-    <w:p>
-      <w:pPr>
-        <w:pStyle w:val="Default"/>
-        <w:rPr>
-          <w:rFonts w:ascii="Times New Roman" w:hAnsi="Times New Roman" w:cs="Times New Roman"/>
-        </w:rPr>
-      </w:pPr>
-      <w:bookmarkStart w:id="0" w:name="_GoBack"/>
-      <w:bookmarkEnd w:id="0"/>
+        <w:t>_2024 REPORT</w:t>
+      </w:r>
+    </w:p>
+    <w:p>
+      <w:pPr>
+        <w:pStyle w:val="Default"/>
+        <w:rPr>
+          <w:rFonts w:ascii="Times New Roman" w:hAnsi="Times New Roman" w:cs="Times New Roman"/>
+        </w:rPr>
+      </w:pPr>
+      <w:r>
+        <w:rPr>
+          <w:rFonts w:ascii="Times New Roman" w:hAnsi="Times New Roman" w:cs="Times New Roman"/>
+        </w:rPr>
+        <w:t>The numbers in the pdf report and the excel sheets all match</w:t>
+      </w:r>
+    </w:p>
+    <w:p>
+      <w:pPr>
+        <w:pStyle w:val="Default"/>
+        <w:rPr>
+          <w:rFonts w:ascii="Times New Roman" w:hAnsi="Times New Roman" w:cs="Times New Roman"/>
+        </w:rPr>
+      </w:pPr>
+    </w:p>
+    <w:p>
+      <w:pPr>
+        <w:pStyle w:val="Default"/>
+        <w:rPr>
+          <w:rFonts w:ascii="Times New Roman" w:hAnsi="Times New Roman" w:cs="Times New Roman"/>
+        </w:rPr>
+      </w:pPr>
+    </w:p>
+    <w:p>
+      <w:pPr>
+        <w:pStyle w:val="Default"/>
+        <w:rPr>
+          <w:rFonts w:ascii="Times New Roman" w:hAnsi="Times New Roman" w:cs="Times New Roman"/>
+        </w:rPr>
+      </w:pPr>
+      <w:r>
+        <w:rPr>
+          <w:rFonts w:ascii="Times New Roman" w:hAnsi="Times New Roman" w:cs="Times New Roman"/>
+        </w:rPr>
+        <w:t>Same for December</w:t>
+      </w:r>
     </w:p>
     <w:p>
       <w:pPr>

</xml_diff>

<commit_message>
add observations concerning source audit of 2025 and 2026 reports
</commit_message>
<xml_diff>
--- a/data/notes/observation notes.docx
+++ b/data/notes/observation notes.docx
@@ -1798,21 +1798,7 @@
         <w:rPr>
           <w:rFonts w:ascii="Times New Roman" w:hAnsi="Times New Roman" w:cs="Times New Roman"/>
         </w:rPr>
-        <w:t>MONTHENTRY says 1, 2025 and is full of #</w:t>
-      </w:r>
-      <w:proofErr w:type="gramStart"/>
-      <w:r>
-        <w:rPr>
-          <w:rFonts w:ascii="Times New Roman" w:hAnsi="Times New Roman" w:cs="Times New Roman"/>
-        </w:rPr>
-        <w:t>REF!.</w:t>
-      </w:r>
-      <w:proofErr w:type="gramEnd"/>
-      <w:r>
-        <w:rPr>
-          <w:rFonts w:ascii="Times New Roman" w:hAnsi="Times New Roman" w:cs="Times New Roman"/>
-        </w:rPr>
-        <w:t xml:space="preserve"> It is wrong for this file, so I did not use it.</w:t>
+        <w:t>MONTHENTRY says 1, 2025 and is full of #REF!. It is wrong for this file, so I did not use it.</w:t>
       </w:r>
     </w:p>
     <w:p>
@@ -2186,21 +2172,7 @@
         <w:rPr>
           <w:rFonts w:ascii="Times New Roman" w:hAnsi="Times New Roman" w:cs="Times New Roman"/>
         </w:rPr>
-        <w:t>MONTHENTRY says 5, 2025 and is full of #</w:t>
-      </w:r>
-      <w:proofErr w:type="gramStart"/>
-      <w:r>
-        <w:rPr>
-          <w:rFonts w:ascii="Times New Roman" w:hAnsi="Times New Roman" w:cs="Times New Roman"/>
-        </w:rPr>
-        <w:t>REF!.</w:t>
-      </w:r>
-      <w:proofErr w:type="gramEnd"/>
-      <w:r>
-        <w:rPr>
-          <w:rFonts w:ascii="Times New Roman" w:hAnsi="Times New Roman" w:cs="Times New Roman"/>
-        </w:rPr>
-        <w:t xml:space="preserve"> Wrong again, I did not use it.</w:t>
+        <w:t>MONTHENTRY says 5, 2025 and is full of #REF!. Wrong again, I did not use it.</w:t>
       </w:r>
     </w:p>
     <w:p>
@@ -2572,21 +2544,7 @@
         <w:rPr>
           <w:rFonts w:ascii="Times New Roman" w:hAnsi="Times New Roman" w:cs="Times New Roman"/>
         </w:rPr>
-        <w:t>MONTHENTRY says 1, 2025 and is full of #</w:t>
-      </w:r>
-      <w:proofErr w:type="gramStart"/>
-      <w:r>
-        <w:rPr>
-          <w:rFonts w:ascii="Times New Roman" w:hAnsi="Times New Roman" w:cs="Times New Roman"/>
-        </w:rPr>
-        <w:t>REF!,</w:t>
-      </w:r>
-      <w:proofErr w:type="gramEnd"/>
-      <w:r>
-        <w:rPr>
-          <w:rFonts w:ascii="Times New Roman" w:hAnsi="Times New Roman" w:cs="Times New Roman"/>
-        </w:rPr>
-        <w:t xml:space="preserve"> so I did not use it.</w:t>
+        <w:t>MONTHENTRY says 1, 2025 and is full of #REF!, so I did not use it.</w:t>
       </w:r>
     </w:p>
     <w:p>
@@ -2660,21 +2618,7 @@
         <w:rPr>
           <w:rFonts w:ascii="Times New Roman" w:hAnsi="Times New Roman" w:cs="Times New Roman"/>
         </w:rPr>
-        <w:t xml:space="preserve">3. For EMTL, the PDF and the Excel are the same in all 4 months: </w:t>
-      </w:r>
-      <w:proofErr w:type="gramStart"/>
-      <w:r>
-        <w:rPr>
-          <w:rFonts w:ascii="Times New Roman" w:hAnsi="Times New Roman" w:cs="Times New Roman"/>
-        </w:rPr>
-        <w:t>the</w:t>
-      </w:r>
-      <w:proofErr w:type="gramEnd"/>
-      <w:r>
-        <w:rPr>
-          <w:rFonts w:ascii="Times New Roman" w:hAnsi="Times New Roman" w:cs="Times New Roman"/>
-        </w:rPr>
-        <w:t xml:space="preserve"> Table I lines, the state by state amounts and the local government grand totals.</w:t>
+        <w:t>3. For EMTL, the PDF and the Excel are the same in all 4 months: the Table I lines, the state by state amounts and the local government grand totals.</w:t>
       </w:r>
     </w:p>
     <w:p>
@@ -2886,13 +2830,1681 @@
     </w:p>
     <w:p>
       <w:pPr>
-        <w:pStyle w:val="Default"/>
-        <w:rPr>
-          <w:rFonts w:ascii="Times New Roman" w:hAnsi="Times New Roman" w:cs="Times New Roman"/>
-        </w:rPr>
+        <w:pStyle w:val="Heading2"/>
+      </w:pPr>
+      <w:r>
+        <w:br/>
+      </w:r>
+      <w:r>
+        <w:t>FAAC REPORTS FOR 2025</w:t>
+      </w:r>
+    </w:p>
+    <w:p>
+      <w:pPr>
+        <w:pStyle w:val="Heading3"/>
+      </w:pPr>
+      <w:r>
+        <w:t>FAAC_JANUARY_2025 REPORT</w:t>
+      </w:r>
+    </w:p>
+    <w:p>
+      <w:pPr>
+        <w:pStyle w:val="NormalWeb"/>
+      </w:pPr>
+      <w:r>
+        <w:t>(Revenue generated in December 2024, shared in January 2025)</w:t>
+      </w:r>
+    </w:p>
+    <w:p>
+      <w:pPr>
+        <w:pStyle w:val="NormalWeb"/>
+      </w:pPr>
+      <w:r>
+        <w:t>PDF</w:t>
+      </w:r>
+    </w:p>
+    <w:p>
+      <w:pPr>
+        <w:pStyle w:val="NormalWeb"/>
+      </w:pPr>
+      <w:r>
+        <w:t>Page 4, Key Highlights, states that ₦32.51 billion was disbursed from Electronic Money Transfer Levy (EMTL).</w:t>
+      </w:r>
+    </w:p>
+    <w:p>
+      <w:pPr>
+        <w:pStyle w:val="NormalWeb"/>
+      </w:pPr>
+      <w:r>
+        <w:t>Excel spreadsheet</w:t>
+      </w:r>
+    </w:p>
+    <w:p>
+      <w:pPr>
+        <w:pStyle w:val="NormalWeb"/>
+      </w:pPr>
+      <w:r>
+        <w:t xml:space="preserve">In the </w:t>
+      </w:r>
+      <w:r>
+        <w:rPr>
+          <w:rStyle w:val="HTMLCode"/>
+        </w:rPr>
+        <w:t>Sum &amp; FG</w:t>
+      </w:r>
+      <w:r>
+        <w:t xml:space="preserve"> sheet, Table I, the EMTL total is ₦32,510,919,306.39. This agrees with the rounded figure in the PDF.</w:t>
+      </w:r>
+    </w:p>
+    <w:p>
+      <w:pPr>
+        <w:pStyle w:val="NormalWeb"/>
+      </w:pPr>
+      <w:r>
+        <w:t>The EMTL column is also available in the state and local government details, so the Excel can be used to check how the money was shared.</w:t>
+      </w:r>
+    </w:p>
+    <w:p>
+      <w:pPr>
+        <w:pStyle w:val="Heading3"/>
+      </w:pPr>
+      <w:r>
+        <w:t>FAAC_FEBRUARY_2025 REPORT</w:t>
+      </w:r>
+    </w:p>
+    <w:p>
+      <w:pPr>
+        <w:pStyle w:val="NormalWeb"/>
+      </w:pPr>
+      <w:r>
+        <w:t>(Revenue generated in January 2025, shared in February 2025)</w:t>
+      </w:r>
+    </w:p>
+    <w:p>
+      <w:pPr>
+        <w:pStyle w:val="NormalWeb"/>
+      </w:pPr>
+      <w:r>
+        <w:t>PDF</w:t>
+      </w:r>
+    </w:p>
+    <w:p>
+      <w:pPr>
+        <w:pStyle w:val="NormalWeb"/>
+      </w:pPr>
+      <w:r>
+        <w:t>Page 4 states that ₦21.40 billion was disbursed from EMTL.</w:t>
+      </w:r>
+    </w:p>
+    <w:p>
+      <w:pPr>
+        <w:pStyle w:val="NormalWeb"/>
+      </w:pPr>
+      <w:r>
+        <w:lastRenderedPageBreak/>
+        <w:t>Excel spreadsheet</w:t>
+      </w:r>
+    </w:p>
+    <w:p>
+      <w:pPr>
+        <w:pStyle w:val="NormalWeb"/>
+      </w:pPr>
+      <w:r>
+        <w:t xml:space="preserve">In the </w:t>
+      </w:r>
+      <w:r>
+        <w:rPr>
+          <w:rStyle w:val="HTMLCode"/>
+        </w:rPr>
+        <w:t>Sum &amp; FG</w:t>
+      </w:r>
+      <w:r>
+        <w:t xml:space="preserve"> sheet, Table I, the EMTL total is ₦21,403,688,302.23. This agrees with the rounded figure in the PDF.</w:t>
+      </w:r>
+    </w:p>
+    <w:p>
+      <w:pPr>
+        <w:pStyle w:val="NormalWeb"/>
+      </w:pPr>
+      <w:r>
+        <w:t>This month's Excel has a column for an augmentation of ₦214 billion. This is separate from EMTL, so it should not be added to the EMTL figure.</w:t>
+      </w:r>
+    </w:p>
+    <w:p>
+      <w:pPr>
+        <w:pStyle w:val="Heading3"/>
+      </w:pPr>
+      <w:r>
+        <w:t>FAAC_MARCH_2025 REPORT</w:t>
+      </w:r>
+    </w:p>
+    <w:p>
+      <w:pPr>
+        <w:pStyle w:val="NormalWeb"/>
+      </w:pPr>
+      <w:r>
+        <w:t>(Revenue generated in February 2025, shared in March 2025)</w:t>
+      </w:r>
+    </w:p>
+    <w:p>
+      <w:pPr>
+        <w:pStyle w:val="NormalWeb"/>
+      </w:pPr>
+      <w:r>
+        <w:t>PDF</w:t>
+      </w:r>
+    </w:p>
+    <w:p>
+      <w:pPr>
+        <w:pStyle w:val="NormalWeb"/>
+      </w:pPr>
+      <w:r>
+        <w:t>Page 4 states that ₦36.64 billion was disbursed from EMTL. However, the same section says the money was disbursed in December 2024 from revenue generated in November 2024. This does not agree with the report filename or the period indicated by the Excel table.</w:t>
+      </w:r>
+    </w:p>
+    <w:p>
+      <w:pPr>
+        <w:pStyle w:val="NormalWeb"/>
+      </w:pPr>
+      <w:r>
+        <w:t>Excel spreadsheet</w:t>
+      </w:r>
+    </w:p>
+    <w:p>
+      <w:pPr>
+        <w:pStyle w:val="NormalWeb"/>
+      </w:pPr>
+      <w:r>
+        <w:t xml:space="preserve">In the </w:t>
+      </w:r>
+      <w:r>
+        <w:rPr>
+          <w:rStyle w:val="HTMLCode"/>
+        </w:rPr>
+        <w:t>Sum &amp; FG</w:t>
+      </w:r>
+      <w:r>
+        <w:t xml:space="preserve"> sheet, Table I, the EMTL total is ₦36,636,330,862.07. This agrees with the rounded EMTL figure in the PDF.</w:t>
+      </w:r>
+    </w:p>
+    <w:p>
+      <w:pPr>
+        <w:pStyle w:val="NormalWeb"/>
+      </w:pPr>
+      <w:r>
+        <w:t>The Excel also has separate columns for augmentation and solid minerals. These are not EMTL and should be kept separate.</w:t>
+      </w:r>
+    </w:p>
+    <w:p>
+      <w:pPr>
+        <w:pStyle w:val="NormalWeb"/>
+      </w:pPr>
+      <w:r>
+        <w:t>What I noticed: The EMTL amount agrees, but the reporting period in the PDF Key Highlights appears to be copied from an earlier report. I would use the main table title and check it against the Excel rather than relying on that paragraph alone.</w:t>
+      </w:r>
+    </w:p>
+    <w:p>
+      <w:pPr>
+        <w:pStyle w:val="Heading3"/>
+      </w:pPr>
+      <w:r>
+        <w:t>FAAC_APRIL_2025 REPORT</w:t>
+      </w:r>
+    </w:p>
+    <w:p>
+      <w:pPr>
+        <w:pStyle w:val="NormalWeb"/>
+      </w:pPr>
+      <w:r>
+        <w:t>(Revenue generated in March 2025, shared in April 2025)</w:t>
+      </w:r>
+    </w:p>
+    <w:p>
+      <w:pPr>
+        <w:pStyle w:val="NormalWeb"/>
+      </w:pPr>
+      <w:r>
+        <w:t>PDF</w:t>
+      </w:r>
+    </w:p>
+    <w:p>
+      <w:pPr>
+        <w:pStyle w:val="NormalWeb"/>
+      </w:pPr>
+      <w:r>
+        <w:t>Page 4 states that ₦26.01 billion was disbursed from EMTL. However, the paragraph about the allocations to the three tiers refers to December 2024, which does not agree with the report period.</w:t>
+      </w:r>
+    </w:p>
+    <w:p>
+      <w:pPr>
+        <w:pStyle w:val="NormalWeb"/>
+      </w:pPr>
+      <w:r>
+        <w:t>Excel spreadsheet</w:t>
+      </w:r>
+    </w:p>
+    <w:p>
+      <w:pPr>
+        <w:pStyle w:val="NormalWeb"/>
+      </w:pPr>
+      <w:r>
+        <w:t xml:space="preserve">In the </w:t>
+      </w:r>
+      <w:r>
+        <w:rPr>
+          <w:rStyle w:val="HTMLCode"/>
+        </w:rPr>
+        <w:t>Sum &amp; FG</w:t>
+      </w:r>
+      <w:r>
+        <w:t xml:space="preserve"> sheet, Table I, the EMTL total is ₦26,010,943,485.73. This agrees with the rounded figure in the PDF.</w:t>
+      </w:r>
+    </w:p>
+    <w:p>
+      <w:pPr>
+        <w:pStyle w:val="NormalWeb"/>
+      </w:pPr>
+      <w:r>
+        <w:lastRenderedPageBreak/>
+        <w:t>What I noticed: The EMTL figure agrees, but the Key Highlights section contains an inconsistent reference to December 2024. The table titles should be used to identify the period.</w:t>
+      </w:r>
+    </w:p>
+    <w:p>
+      <w:pPr>
+        <w:pStyle w:val="Heading3"/>
+      </w:pPr>
+      <w:r>
+        <w:t>FAAC_MAY_2025 REPORT</w:t>
+      </w:r>
+    </w:p>
+    <w:p>
+      <w:pPr>
+        <w:pStyle w:val="NormalWeb"/>
+      </w:pPr>
+      <w:r>
+        <w:t>(Revenue generated in April 2025, shared in May 2025)</w:t>
+      </w:r>
+    </w:p>
+    <w:p>
+      <w:pPr>
+        <w:pStyle w:val="NormalWeb"/>
+      </w:pPr>
+      <w:r>
+        <w:t>PDF</w:t>
+      </w:r>
+    </w:p>
+    <w:p>
+      <w:pPr>
+        <w:pStyle w:val="NormalWeb"/>
+      </w:pPr>
+      <w:r>
+        <w:t>Page 4 states that ₦40.48 billion was disbursed from EMTL. However, the paragraph about allocations to the three tiers refers to January 2025 instead of April 2025.</w:t>
+      </w:r>
+    </w:p>
+    <w:p>
+      <w:pPr>
+        <w:pStyle w:val="NormalWeb"/>
+      </w:pPr>
+      <w:r>
+        <w:t>Excel spreadsheet</w:t>
+      </w:r>
+    </w:p>
+    <w:p>
+      <w:pPr>
+        <w:pStyle w:val="NormalWeb"/>
+      </w:pPr>
+      <w:r>
+        <w:t xml:space="preserve">In the </w:t>
+      </w:r>
+      <w:r>
+        <w:rPr>
+          <w:rStyle w:val="HTMLCode"/>
+        </w:rPr>
+        <w:t>Sum &amp; FG</w:t>
+      </w:r>
+      <w:r>
+        <w:t xml:space="preserve"> sheet, Table I, the EMTL total is ₦40,480,923,620.64. This agrees with the rounded figure in the PDF.</w:t>
+      </w:r>
+    </w:p>
+    <w:p>
+      <w:pPr>
+        <w:pStyle w:val="NormalWeb"/>
+      </w:pPr>
+      <w:r>
+        <w:t>What I noticed: The EMTL amount agrees, but the period in part of the PDF Key Highlights is inconsistent with the report title.</w:t>
+      </w:r>
+    </w:p>
+    <w:p>
+      <w:pPr>
+        <w:pStyle w:val="Heading3"/>
+      </w:pPr>
+      <w:r>
+        <w:t>FAAC_JUNE_2025 REPORT</w:t>
+      </w:r>
+    </w:p>
+    <w:p>
+      <w:pPr>
+        <w:pStyle w:val="NormalWeb"/>
+      </w:pPr>
+      <w:r>
+        <w:t>(Revenue generated in May 2025, shared in June 2025)</w:t>
+      </w:r>
+    </w:p>
+    <w:p>
+      <w:pPr>
+        <w:pStyle w:val="NormalWeb"/>
+      </w:pPr>
+      <w:r>
+        <w:t>PDF</w:t>
+      </w:r>
+    </w:p>
+    <w:p>
+      <w:pPr>
+        <w:pStyle w:val="NormalWeb"/>
+      </w:pPr>
+      <w:r>
+        <w:t>Page 4 states that ₦28.82 billion was disbursed from EMTL.</w:t>
+      </w:r>
+    </w:p>
+    <w:p>
+      <w:pPr>
+        <w:pStyle w:val="NormalWeb"/>
+      </w:pPr>
+      <w:r>
+        <w:t>Excel spreadsheet</w:t>
+      </w:r>
+    </w:p>
+    <w:p>
+      <w:pPr>
+        <w:pStyle w:val="NormalWeb"/>
+      </w:pPr>
+      <w:r>
+        <w:t xml:space="preserve">In the </w:t>
+      </w:r>
+      <w:r>
+        <w:rPr>
+          <w:rStyle w:val="HTMLCode"/>
+        </w:rPr>
+        <w:t>Sum &amp; FG</w:t>
+      </w:r>
+      <w:r>
+        <w:t xml:space="preserve"> sheet, Table I, the EMTL total is ₦28,819,669,802.00. This agrees with the rounded figure in the PDF.</w:t>
+      </w:r>
+    </w:p>
+    <w:p>
+      <w:pPr>
+        <w:pStyle w:val="NormalWeb"/>
+      </w:pPr>
+      <w:r>
+        <w:t>The EMTL column is available in the state and local government details.</w:t>
+      </w:r>
+    </w:p>
+    <w:p>
+      <w:pPr>
+        <w:pStyle w:val="Heading3"/>
+      </w:pPr>
+      <w:r>
+        <w:t>FAAC_JULY_2025 REPORT</w:t>
+      </w:r>
+    </w:p>
+    <w:p>
+      <w:pPr>
+        <w:pStyle w:val="NormalWeb"/>
+      </w:pPr>
+      <w:r>
+        <w:t>(Revenue generated in June 2025, shared in July 2025)</w:t>
+      </w:r>
+    </w:p>
+    <w:p>
+      <w:pPr>
+        <w:pStyle w:val="NormalWeb"/>
+      </w:pPr>
+      <w:r>
+        <w:t>PDF</w:t>
+      </w:r>
+    </w:p>
+    <w:p>
+      <w:pPr>
+        <w:pStyle w:val="NormalWeb"/>
+      </w:pPr>
+      <w:r>
+        <w:t>Page 4 states that ₦30.37 billion was disbursed from EMTL.</w:t>
+      </w:r>
+    </w:p>
+    <w:p>
+      <w:pPr>
+        <w:pStyle w:val="NormalWeb"/>
+      </w:pPr>
+      <w:r>
+        <w:t>Excel spreadsheet</w:t>
+      </w:r>
+    </w:p>
+    <w:p>
+      <w:pPr>
+        <w:pStyle w:val="NormalWeb"/>
+      </w:pPr>
+      <w:r>
+        <w:lastRenderedPageBreak/>
+        <w:t xml:space="preserve">In the </w:t>
+      </w:r>
+      <w:r>
+        <w:rPr>
+          <w:rStyle w:val="HTMLCode"/>
+        </w:rPr>
+        <w:t>Sum &amp; FG</w:t>
+      </w:r>
+      <w:r>
+        <w:t xml:space="preserve"> sheet, Table I, the EMTL total is ₦30,379,578,750.00. This agrees with the rounded figure in the PDF.</w:t>
+      </w:r>
+    </w:p>
+    <w:p>
+      <w:pPr>
+        <w:pStyle w:val="NormalWeb"/>
+      </w:pPr>
+      <w:r>
+        <w:t>The workbook has separate columns for EMTL, exchange gain, the ₦100 billion non-oil revenue augmentation and other revenue. These should not be mixed together.</w:t>
+      </w:r>
+    </w:p>
+    <w:p>
+      <w:pPr>
+        <w:pStyle w:val="Heading3"/>
+      </w:pPr>
+      <w:r>
+        <w:t>FAAC_AUGUST_2025 REPORT</w:t>
+      </w:r>
+    </w:p>
+    <w:p>
+      <w:pPr>
+        <w:pStyle w:val="NormalWeb"/>
+      </w:pPr>
+      <w:r>
+        <w:t>(Revenue generated in July 2025, shared in August 2025)</w:t>
+      </w:r>
+    </w:p>
+    <w:p>
+      <w:pPr>
+        <w:pStyle w:val="NormalWeb"/>
+      </w:pPr>
+      <w:r>
+        <w:t>PDF</w:t>
+      </w:r>
+    </w:p>
+    <w:p>
+      <w:pPr>
+        <w:pStyle w:val="NormalWeb"/>
+      </w:pPr>
+      <w:r>
+        <w:t>Page 4 states that ₦39.16 billion was disbursed from EMTL.</w:t>
+      </w:r>
+    </w:p>
+    <w:p>
+      <w:pPr>
+        <w:pStyle w:val="NormalWeb"/>
+      </w:pPr>
+      <w:r>
+        <w:t>Excel spreadsheet</w:t>
+      </w:r>
+    </w:p>
+    <w:p>
+      <w:pPr>
+        <w:pStyle w:val="NormalWeb"/>
+      </w:pPr>
+      <w:r>
+        <w:t xml:space="preserve">In the </w:t>
+      </w:r>
+      <w:r>
+        <w:rPr>
+          <w:rStyle w:val="HTMLCode"/>
+        </w:rPr>
+        <w:t>Sum &amp; FG</w:t>
+      </w:r>
+      <w:r>
+        <w:t xml:space="preserve"> sheet, Table I, the EMTL total is ₦39,168,321,000.00. This agrees with the rounded figure in the PDF.</w:t>
+      </w:r>
+    </w:p>
+    <w:p>
+      <w:pPr>
+        <w:pStyle w:val="NormalWeb"/>
+      </w:pPr>
+      <w:r>
+        <w:t>The workbook includes separate columns for exchange gain, EMTL, other revenue and VAT.</w:t>
+      </w:r>
+    </w:p>
+    <w:p>
+      <w:pPr>
+        <w:pStyle w:val="Heading3"/>
+      </w:pPr>
+      <w:r>
+        <w:t>FAAC_SEPTEMBER_2025 REPORT</w:t>
+      </w:r>
+    </w:p>
+    <w:p>
+      <w:pPr>
+        <w:pStyle w:val="NormalWeb"/>
+      </w:pPr>
+      <w:r>
+        <w:t>(Revenue generated in August 2025, shared in September 2025)</w:t>
+      </w:r>
+    </w:p>
+    <w:p>
+      <w:pPr>
+        <w:pStyle w:val="NormalWeb"/>
+      </w:pPr>
+      <w:r>
+        <w:t>PDF</w:t>
+      </w:r>
+    </w:p>
+    <w:p>
+      <w:pPr>
+        <w:pStyle w:val="NormalWeb"/>
+      </w:pPr>
+      <w:r>
+        <w:t>Page 4 states that ₦33.68 billion was disbursed from EMTL.</w:t>
+      </w:r>
+    </w:p>
+    <w:p>
+      <w:pPr>
+        <w:pStyle w:val="NormalWeb"/>
+      </w:pPr>
+      <w:r>
+        <w:t>Excel spreadsheet</w:t>
+      </w:r>
+    </w:p>
+    <w:p>
+      <w:pPr>
+        <w:pStyle w:val="NormalWeb"/>
+      </w:pPr>
+      <w:r>
+        <w:t xml:space="preserve">In the </w:t>
+      </w:r>
+      <w:r>
+        <w:rPr>
+          <w:rStyle w:val="HTMLCode"/>
+        </w:rPr>
+        <w:t>Sum &amp; FG</w:t>
+      </w:r>
+      <w:r>
+        <w:t xml:space="preserve"> sheet, Table I, the EMTL total is ₦33,684,960,112.00. This agrees with the rounded figure in the PDF.</w:t>
+      </w:r>
+    </w:p>
+    <w:p>
+      <w:pPr>
+        <w:pStyle w:val="NormalWeb"/>
+      </w:pPr>
+      <w:r>
+        <w:t>The workbook has separate columns for exchange gain, EMTL and other revenue. These should be identified by their headings because their positions can change between reports.</w:t>
+      </w:r>
+    </w:p>
+    <w:p>
+      <w:pPr>
+        <w:pStyle w:val="Heading3"/>
+      </w:pPr>
+      <w:r>
+        <w:t>FAAC_OCTOBER_2025 REPORT</w:t>
+      </w:r>
+    </w:p>
+    <w:p>
+      <w:pPr>
+        <w:pStyle w:val="NormalWeb"/>
+      </w:pPr>
+      <w:r>
+        <w:t>(Revenue generated in September 2025, shared in October 2025)</w:t>
+      </w:r>
+    </w:p>
+    <w:p>
+      <w:pPr>
+        <w:pStyle w:val="NormalWeb"/>
+      </w:pPr>
+      <w:r>
+        <w:t>PDF</w:t>
+      </w:r>
+    </w:p>
+    <w:p>
+      <w:pPr>
+        <w:pStyle w:val="NormalWeb"/>
+      </w:pPr>
+      <w:r>
+        <w:t>Page 4 states that ₦53.84 billion was disbursed from EMTL.</w:t>
+      </w:r>
+    </w:p>
+    <w:p>
+      <w:pPr>
+        <w:pStyle w:val="NormalWeb"/>
+      </w:pPr>
+      <w:r>
+        <w:t>Excel spreadsheet</w:t>
+      </w:r>
+    </w:p>
+    <w:p>
+      <w:pPr>
+        <w:pStyle w:val="NormalWeb"/>
+      </w:pPr>
+      <w:r>
+        <w:lastRenderedPageBreak/>
+        <w:t xml:space="preserve">In the </w:t>
+      </w:r>
+      <w:r>
+        <w:rPr>
+          <w:rStyle w:val="HTMLCode"/>
+        </w:rPr>
+        <w:t>Sum &amp; FG</w:t>
+      </w:r>
+      <w:r>
+        <w:t xml:space="preserve"> sheet, Table I, the EMTL total is ₦53,837,616,650.00. This agrees with the rounded figure in the PDF.</w:t>
+      </w:r>
+    </w:p>
+    <w:p>
+      <w:pPr>
+        <w:pStyle w:val="NormalWeb"/>
+      </w:pPr>
+      <w:r>
+        <w:t>The workbook lists EMTL separately from other revenue and VAT.</w:t>
+      </w:r>
+    </w:p>
+    <w:p>
+      <w:pPr>
+        <w:pStyle w:val="Heading3"/>
+      </w:pPr>
+      <w:r>
+        <w:t>FAAC_NOVEMBER_2025 REPORT</w:t>
+      </w:r>
+    </w:p>
+    <w:p>
+      <w:pPr>
+        <w:pStyle w:val="NormalWeb"/>
+      </w:pPr>
+      <w:r>
+        <w:t>(Revenue generated in October 2025, shared in November 2025)</w:t>
+      </w:r>
+    </w:p>
+    <w:p>
+      <w:pPr>
+        <w:pStyle w:val="NormalWeb"/>
+      </w:pPr>
+      <w:r>
+        <w:t>PDF</w:t>
+      </w:r>
+    </w:p>
+    <w:p>
+      <w:pPr>
+        <w:pStyle w:val="NormalWeb"/>
+      </w:pPr>
+      <w:r>
+        <w:t>Page 4 states that ₦49.87 billion was disbursed from EMTL.</w:t>
+      </w:r>
+    </w:p>
+    <w:p>
+      <w:pPr>
+        <w:pStyle w:val="NormalWeb"/>
+      </w:pPr>
+      <w:r>
+        <w:t>Excel spreadsheet</w:t>
+      </w:r>
+    </w:p>
+    <w:p>
+      <w:pPr>
+        <w:pStyle w:val="NormalWeb"/>
+      </w:pPr>
+      <w:r>
+        <w:t xml:space="preserve">In the </w:t>
+      </w:r>
+      <w:r>
+        <w:rPr>
+          <w:rStyle w:val="HTMLCode"/>
+        </w:rPr>
+        <w:t>Sum &amp; FG</w:t>
+      </w:r>
+      <w:r>
+        <w:t xml:space="preserve"> sheet, Table I, the EMTL total is ₦49,865,111,320.49. This agrees with the rounded figure in the PDF.</w:t>
+      </w:r>
+    </w:p>
+    <w:p>
+      <w:pPr>
+        <w:pStyle w:val="NormalWeb"/>
+      </w:pPr>
+      <w:r>
+        <w:t>The PDF notes that the “Others” figure includes exchange gain, EMTL and the ₦100 billion augmentation from non-oil revenue. The Excel separates these items into their own columns, so I used the EMTL column rather than the combined “Others” figure.</w:t>
+      </w:r>
+    </w:p>
+    <w:p>
+      <w:pPr>
+        <w:pStyle w:val="Heading3"/>
+      </w:pPr>
+      <w:r>
+        <w:t>FAAC_DECEMBER_2025 REPORT</w:t>
+      </w:r>
+    </w:p>
+    <w:p>
+      <w:pPr>
+        <w:pStyle w:val="NormalWeb"/>
+      </w:pPr>
+      <w:r>
+        <w:t>(Revenue generated in November 2025, shared in December 2025)</w:t>
+      </w:r>
+    </w:p>
+    <w:p>
+      <w:pPr>
+        <w:pStyle w:val="NormalWeb"/>
+      </w:pPr>
+      <w:r>
+        <w:t>PDF</w:t>
+      </w:r>
+    </w:p>
+    <w:p>
+      <w:pPr>
+        <w:pStyle w:val="NormalWeb"/>
+      </w:pPr>
+      <w:r>
+        <w:t>Page 4 states that ₦43.40 billion was disbursed from EMTL.</w:t>
+      </w:r>
+    </w:p>
+    <w:p>
+      <w:pPr>
+        <w:pStyle w:val="NormalWeb"/>
+      </w:pPr>
+      <w:r>
+        <w:t>Excel spreadsheet</w:t>
+      </w:r>
+    </w:p>
+    <w:p>
+      <w:pPr>
+        <w:pStyle w:val="NormalWeb"/>
+      </w:pPr>
+      <w:r>
+        <w:t xml:space="preserve">In the </w:t>
+      </w:r>
+      <w:r>
+        <w:rPr>
+          <w:rStyle w:val="HTMLCode"/>
+        </w:rPr>
+        <w:t>Sum &amp; FG</w:t>
+      </w:r>
+      <w:r>
+        <w:t xml:space="preserve"> sheet, Table I, the EMTL total is ₦43,400,180,171.40. This agrees with the rounded figure in the PDF.</w:t>
+      </w:r>
+    </w:p>
+    <w:p>
+      <w:pPr>
+        <w:pStyle w:val="NormalWeb"/>
+      </w:pPr>
+      <w:r>
+        <w:t>Correction to my earlier observation: I previously added the main allocation figures and got ₦41,381,743,551.02, then treated the difference from the PDF figure as a possible mismatch. That was my error because I had left out the EMTL amount in the row titled “0.5% of Non-Oil Federation Revenue to RMAFC.” The EMTL amount in that row is ₦2,018,436,620.38. When this is included, the total is ₦43,400,180,171.40, which agrees with the Excel EMTL total and the rounded PDF figure.</w:t>
+      </w:r>
+    </w:p>
+    <w:p>
+      <w:pPr>
+        <w:pStyle w:val="NormalWeb"/>
+      </w:pPr>
+      <w:r>
+        <w:t>The RMAFC amount is part of the EMTL distribution shown in the relevant EMTL column. It must not be confused with the separate statutory or VAT amounts in that row.</w:t>
+      </w:r>
+    </w:p>
+    <w:p>
+      <w:pPr>
+        <w:pStyle w:val="Heading2"/>
+      </w:pPr>
+      <w:r>
+        <w:lastRenderedPageBreak/>
+        <w:t>FAAC REPORTS FOR 2026</w:t>
+      </w:r>
+    </w:p>
+    <w:p>
+      <w:pPr>
+        <w:pStyle w:val="Heading3"/>
+      </w:pPr>
+      <w:r>
+        <w:t>FAAC_JANUARY_2026 REPORT</w:t>
+      </w:r>
+    </w:p>
+    <w:p>
+      <w:pPr>
+        <w:pStyle w:val="NormalWeb"/>
+      </w:pPr>
+      <w:r>
+        <w:t>(Revenue generated in December 2025, shared in January 2026)</w:t>
+      </w:r>
+    </w:p>
+    <w:p>
+      <w:pPr>
+        <w:pStyle w:val="NormalWeb"/>
+      </w:pPr>
+      <w:r>
+        <w:t>PDF</w:t>
+      </w:r>
+    </w:p>
+    <w:p>
+      <w:pPr>
+        <w:pStyle w:val="NormalWeb"/>
+      </w:pPr>
+      <w:r>
+        <w:t>Page 4 states that ₦39.91 billion was disbursed from EMTL.</w:t>
+      </w:r>
+    </w:p>
+    <w:p>
+      <w:pPr>
+        <w:pStyle w:val="NormalWeb"/>
+      </w:pPr>
+      <w:r>
+        <w:t>Excel spreadsheet</w:t>
+      </w:r>
+    </w:p>
+    <w:p>
+      <w:pPr>
+        <w:pStyle w:val="NormalWeb"/>
+      </w:pPr>
+      <w:r>
+        <w:t xml:space="preserve">In the </w:t>
+      </w:r>
+      <w:r>
+        <w:rPr>
+          <w:rStyle w:val="HTMLCode"/>
+        </w:rPr>
+        <w:t>Sum &amp; FG</w:t>
+      </w:r>
+      <w:r>
+        <w:t xml:space="preserve"> sheet, Table I, the EMTL total is ₦39,905,899,825.00. This agrees with the rounded figure in the PDF.</w:t>
+      </w:r>
+    </w:p>
+    <w:p>
+      <w:pPr>
+        <w:pStyle w:val="NormalWeb"/>
+      </w:pPr>
+      <w:r>
+        <w:t>The EMTL column is also available in the state and local government details.</w:t>
+      </w:r>
+    </w:p>
+    <w:p>
+      <w:pPr>
+        <w:pStyle w:val="Heading3"/>
+      </w:pPr>
+      <w:r>
+        <w:t>FAAC_FEBRUARY_2026 REPORT</w:t>
+      </w:r>
+    </w:p>
+    <w:p>
+      <w:pPr>
+        <w:pStyle w:val="NormalWeb"/>
+      </w:pPr>
+      <w:r>
+        <w:t>(Revenue generated in January 2026, shared in February 2026)</w:t>
+      </w:r>
+    </w:p>
+    <w:p>
+      <w:pPr>
+        <w:pStyle w:val="NormalWeb"/>
+      </w:pPr>
+      <w:r>
+        <w:t>PDF</w:t>
+      </w:r>
+    </w:p>
+    <w:p>
+      <w:pPr>
+        <w:pStyle w:val="NormalWeb"/>
+      </w:pPr>
+      <w:r>
+        <w:t>The Key Highlights do not list EMTL as one of the revenue items distributed. The report lists statutory revenue, VAT and the ₦100 billion augmentation from non-oil revenue.</w:t>
+      </w:r>
+    </w:p>
+    <w:p>
+      <w:pPr>
+        <w:pStyle w:val="NormalWeb"/>
+      </w:pPr>
+      <w:r>
+        <w:t>Excel spreadsheet</w:t>
+      </w:r>
+    </w:p>
+    <w:p>
+      <w:pPr>
+        <w:pStyle w:val="NormalWeb"/>
+      </w:pPr>
+      <w:r>
+        <w:t xml:space="preserve">In the </w:t>
+      </w:r>
+      <w:r>
+        <w:rPr>
+          <w:rStyle w:val="HTMLCode"/>
+        </w:rPr>
+        <w:t>Sum &amp; FG</w:t>
+      </w:r>
+      <w:r>
+        <w:t xml:space="preserve"> sheet, Table I, there is no EMTL column. The table contains statutory revenue, VAT and the non-oil revenue augmentation.</w:t>
+      </w:r>
+    </w:p>
+    <w:p>
+      <w:pPr>
+        <w:pStyle w:val="NormalWeb"/>
+      </w:pPr>
+      <w:r>
+        <w:t>What I noticed: EMTL is not included in the February 2026 FAAC disbursement breakdown. This means that no EMTL allocation is shown in this report. It does not prove that no EMTL was collected during the period.</w:t>
+      </w:r>
+    </w:p>
+    <w:p>
+      <w:pPr>
+        <w:pStyle w:val="NormalWeb"/>
+      </w:pPr>
+      <w:r>
+        <w:t>I do not have an official explanation from the report for why EMTL was excluded.</w:t>
+      </w:r>
+    </w:p>
+    <w:p>
+      <w:pPr>
+        <w:pStyle w:val="Heading3"/>
+      </w:pPr>
+      <w:r>
+        <w:t>FAAC REPORTS FROM MARCH TO JULY 2026</w:t>
+      </w:r>
+    </w:p>
+    <w:p>
+      <w:pPr>
+        <w:pStyle w:val="NormalWeb"/>
+      </w:pPr>
+      <w:r>
+        <w:t>From my checks of the reports available in the NBS catalogue up to July 2026, I could not find EMTL listed as a distributed revenue item in the reports for March, April, May, June or July 2026.</w:t>
+      </w:r>
+    </w:p>
+    <w:p>
+      <w:pPr>
+        <w:pStyle w:val="NormalWeb"/>
+      </w:pPr>
+      <w:r>
+        <w:t>What I noticed: EMTL appears in the January 2026 report but is not listed in the reports from February through July 2026.</w:t>
+      </w:r>
+    </w:p>
+    <w:p>
+      <w:pPr>
+        <w:pStyle w:val="NormalWeb"/>
+      </w:pPr>
+      <w:r>
+        <w:lastRenderedPageBreak/>
+        <w:t>The reports do not establish why the levy is missing from these later breakdowns. I cannot conclude from this alone whether it was not collected, was collected but not shared, or was reported elsewhere.</w:t>
+      </w:r>
+    </w:p>
+    <w:p>
+      <w:pPr>
+        <w:pStyle w:val="NormalWeb"/>
+      </w:pPr>
+      <w:r>
+        <w:t>The more recent reports needed to check what happened after July 2026 are not available in the catalogue I checked.</w:t>
+      </w:r>
+    </w:p>
+    <w:p>
+      <w:pPr>
+        <w:pStyle w:val="Heading2"/>
+      </w:pPr>
+      <w:r>
+        <w:t>WHAT I NOTICED ACROSS THE 2025 AND 2026 FILES</w:t>
+      </w:r>
+    </w:p>
+    <w:p>
+      <w:pPr>
+        <w:pStyle w:val="NormalWeb"/>
+      </w:pPr>
+      <w:r>
+        <w:t>1. The file name is the month the money was shared. The revenue month is usually the month before. I should use the table titles to identify the correct period.</w:t>
+      </w:r>
+    </w:p>
+    <w:p>
+      <w:pPr>
+        <w:pStyle w:val="NormalWeb"/>
+      </w:pPr>
+      <w:r>
+        <w:t>2. EMTL is present in all 12 reports for 2025. The exact totals from the Excel Table I are:</w:t>
+      </w:r>
+    </w:p>
+    <w:tbl>
+      <w:tblPr>
+        <w:tblW w:w="0" w:type="auto"/>
+        <w:tblCellSpacing w:w="15" w:type="dxa"/>
+        <w:tblCellMar>
+          <w:top w:w="15" w:type="dxa"/>
+          <w:left w:w="15" w:type="dxa"/>
+          <w:bottom w:w="15" w:type="dxa"/>
+          <w:right w:w="15" w:type="dxa"/>
+        </w:tblCellMar>
+        <w:tblLook w:val="04A0" w:firstRow="1" w:lastRow="0" w:firstColumn="1" w:lastColumn="0" w:noHBand="0" w:noVBand="1"/>
+      </w:tblPr>
+      <w:tblGrid>
+        <w:gridCol w:w="1642"/>
+        <w:gridCol w:w="2049"/>
+      </w:tblGrid>
+      <w:tr>
+        <w:trPr>
+          <w:tblCellSpacing w:w="15" w:type="dxa"/>
+        </w:trPr>
+        <w:tc>
+          <w:tcPr>
+            <w:tcW w:w="0" w:type="auto"/>
+            <w:vAlign w:val="center"/>
+            <w:hideMark/>
+          </w:tcPr>
+          <w:p>
+            <w:pPr>
+              <w:pStyle w:val="NormalWeb"/>
+              <w:jc w:val="center"/>
+              <w:rPr>
+                <w:b/>
+                <w:bCs/>
+              </w:rPr>
+            </w:pPr>
+            <w:r>
+              <w:rPr>
+                <w:b/>
+                <w:bCs/>
+              </w:rPr>
+              <w:t>Sharing month</w:t>
+            </w:r>
+          </w:p>
+        </w:tc>
+        <w:tc>
+          <w:tcPr>
+            <w:tcW w:w="0" w:type="auto"/>
+            <w:vAlign w:val="center"/>
+            <w:hideMark/>
+          </w:tcPr>
+          <w:p>
+            <w:pPr>
+              <w:pStyle w:val="NormalWeb"/>
+              <w:jc w:val="center"/>
+              <w:rPr>
+                <w:b/>
+                <w:bCs/>
+              </w:rPr>
+            </w:pPr>
+            <w:r>
+              <w:rPr>
+                <w:b/>
+                <w:bCs/>
+              </w:rPr>
+              <w:t>EMTL amount</w:t>
+            </w:r>
+          </w:p>
+        </w:tc>
+      </w:tr>
+      <w:tr>
+        <w:trPr>
+          <w:tblCellSpacing w:w="15" w:type="dxa"/>
+        </w:trPr>
+        <w:tc>
+          <w:tcPr>
+            <w:tcW w:w="0" w:type="auto"/>
+            <w:vAlign w:val="center"/>
+            <w:hideMark/>
+          </w:tcPr>
+          <w:p>
+            <w:pPr>
+              <w:pStyle w:val="NormalWeb"/>
+            </w:pPr>
+            <w:r>
+              <w:t>January 2025</w:t>
+            </w:r>
+          </w:p>
+        </w:tc>
+        <w:tc>
+          <w:tcPr>
+            <w:tcW w:w="0" w:type="auto"/>
+            <w:vAlign w:val="center"/>
+            <w:hideMark/>
+          </w:tcPr>
+          <w:p>
+            <w:pPr>
+              <w:pStyle w:val="NormalWeb"/>
+            </w:pPr>
+            <w:r>
+              <w:t>₦32,510,919,306.39</w:t>
+            </w:r>
+          </w:p>
+        </w:tc>
+      </w:tr>
+      <w:tr>
+        <w:trPr>
+          <w:tblCellSpacing w:w="15" w:type="dxa"/>
+        </w:trPr>
+        <w:tc>
+          <w:tcPr>
+            <w:tcW w:w="0" w:type="auto"/>
+            <w:vAlign w:val="center"/>
+            <w:hideMark/>
+          </w:tcPr>
+          <w:p>
+            <w:pPr>
+              <w:pStyle w:val="NormalWeb"/>
+            </w:pPr>
+            <w:r>
+              <w:t>February 2025</w:t>
+            </w:r>
+          </w:p>
+        </w:tc>
+        <w:tc>
+          <w:tcPr>
+            <w:tcW w:w="0" w:type="auto"/>
+            <w:vAlign w:val="center"/>
+            <w:hideMark/>
+          </w:tcPr>
+          <w:p>
+            <w:pPr>
+              <w:pStyle w:val="NormalWeb"/>
+            </w:pPr>
+            <w:r>
+              <w:t>₦21,403,688,302.23</w:t>
+            </w:r>
+          </w:p>
+        </w:tc>
+      </w:tr>
+      <w:tr>
+        <w:trPr>
+          <w:tblCellSpacing w:w="15" w:type="dxa"/>
+        </w:trPr>
+        <w:tc>
+          <w:tcPr>
+            <w:tcW w:w="0" w:type="auto"/>
+            <w:vAlign w:val="center"/>
+            <w:hideMark/>
+          </w:tcPr>
+          <w:p>
+            <w:pPr>
+              <w:pStyle w:val="NormalWeb"/>
+            </w:pPr>
+            <w:r>
+              <w:t>March 2025</w:t>
+            </w:r>
+          </w:p>
+        </w:tc>
+        <w:tc>
+          <w:tcPr>
+            <w:tcW w:w="0" w:type="auto"/>
+            <w:vAlign w:val="center"/>
+            <w:hideMark/>
+          </w:tcPr>
+          <w:p>
+            <w:pPr>
+              <w:pStyle w:val="NormalWeb"/>
+            </w:pPr>
+            <w:r>
+              <w:t>₦36,636,330,862.07</w:t>
+            </w:r>
+          </w:p>
+        </w:tc>
+      </w:tr>
+      <w:tr>
+        <w:trPr>
+          <w:tblCellSpacing w:w="15" w:type="dxa"/>
+        </w:trPr>
+        <w:tc>
+          <w:tcPr>
+            <w:tcW w:w="0" w:type="auto"/>
+            <w:vAlign w:val="center"/>
+            <w:hideMark/>
+          </w:tcPr>
+          <w:p>
+            <w:pPr>
+              <w:pStyle w:val="NormalWeb"/>
+            </w:pPr>
+            <w:r>
+              <w:t>April 2025</w:t>
+            </w:r>
+          </w:p>
+        </w:tc>
+        <w:tc>
+          <w:tcPr>
+            <w:tcW w:w="0" w:type="auto"/>
+            <w:vAlign w:val="center"/>
+            <w:hideMark/>
+          </w:tcPr>
+          <w:p>
+            <w:pPr>
+              <w:pStyle w:val="NormalWeb"/>
+            </w:pPr>
+            <w:r>
+              <w:t>₦26,010,943,485.73</w:t>
+            </w:r>
+          </w:p>
+        </w:tc>
+      </w:tr>
+      <w:tr>
+        <w:trPr>
+          <w:tblCellSpacing w:w="15" w:type="dxa"/>
+        </w:trPr>
+        <w:tc>
+          <w:tcPr>
+            <w:tcW w:w="0" w:type="auto"/>
+            <w:vAlign w:val="center"/>
+            <w:hideMark/>
+          </w:tcPr>
+          <w:p>
+            <w:pPr>
+              <w:pStyle w:val="NormalWeb"/>
+            </w:pPr>
+            <w:r>
+              <w:t>May 2025</w:t>
+            </w:r>
+          </w:p>
+        </w:tc>
+        <w:tc>
+          <w:tcPr>
+            <w:tcW w:w="0" w:type="auto"/>
+            <w:vAlign w:val="center"/>
+            <w:hideMark/>
+          </w:tcPr>
+          <w:p>
+            <w:pPr>
+              <w:pStyle w:val="NormalWeb"/>
+            </w:pPr>
+            <w:r>
+              <w:t>₦40,480,923,620.64</w:t>
+            </w:r>
+          </w:p>
+        </w:tc>
+      </w:tr>
+      <w:tr>
+        <w:trPr>
+          <w:tblCellSpacing w:w="15" w:type="dxa"/>
+        </w:trPr>
+        <w:tc>
+          <w:tcPr>
+            <w:tcW w:w="0" w:type="auto"/>
+            <w:vAlign w:val="center"/>
+            <w:hideMark/>
+          </w:tcPr>
+          <w:p>
+            <w:pPr>
+              <w:pStyle w:val="NormalWeb"/>
+            </w:pPr>
+            <w:r>
+              <w:t>June 2025</w:t>
+            </w:r>
+          </w:p>
+        </w:tc>
+        <w:tc>
+          <w:tcPr>
+            <w:tcW w:w="0" w:type="auto"/>
+            <w:vAlign w:val="center"/>
+            <w:hideMark/>
+          </w:tcPr>
+          <w:p>
+            <w:pPr>
+              <w:pStyle w:val="NormalWeb"/>
+            </w:pPr>
+            <w:r>
+              <w:t>₦28,819,669,802.00</w:t>
+            </w:r>
+          </w:p>
+        </w:tc>
+      </w:tr>
+      <w:tr>
+        <w:trPr>
+          <w:tblCellSpacing w:w="15" w:type="dxa"/>
+        </w:trPr>
+        <w:tc>
+          <w:tcPr>
+            <w:tcW w:w="0" w:type="auto"/>
+            <w:vAlign w:val="center"/>
+            <w:hideMark/>
+          </w:tcPr>
+          <w:p>
+            <w:pPr>
+              <w:pStyle w:val="NormalWeb"/>
+            </w:pPr>
+            <w:r>
+              <w:t>July 2025</w:t>
+            </w:r>
+          </w:p>
+        </w:tc>
+        <w:tc>
+          <w:tcPr>
+            <w:tcW w:w="0" w:type="auto"/>
+            <w:vAlign w:val="center"/>
+            <w:hideMark/>
+          </w:tcPr>
+          <w:p>
+            <w:pPr>
+              <w:pStyle w:val="NormalWeb"/>
+            </w:pPr>
+            <w:r>
+              <w:t>₦30,379,578,750.00</w:t>
+            </w:r>
+          </w:p>
+        </w:tc>
+      </w:tr>
+      <w:tr>
+        <w:trPr>
+          <w:tblCellSpacing w:w="15" w:type="dxa"/>
+        </w:trPr>
+        <w:tc>
+          <w:tcPr>
+            <w:tcW w:w="0" w:type="auto"/>
+            <w:vAlign w:val="center"/>
+            <w:hideMark/>
+          </w:tcPr>
+          <w:p>
+            <w:pPr>
+              <w:pStyle w:val="NormalWeb"/>
+            </w:pPr>
+            <w:r>
+              <w:t>August 2025</w:t>
+            </w:r>
+          </w:p>
+        </w:tc>
+        <w:tc>
+          <w:tcPr>
+            <w:tcW w:w="0" w:type="auto"/>
+            <w:vAlign w:val="center"/>
+            <w:hideMark/>
+          </w:tcPr>
+          <w:p>
+            <w:pPr>
+              <w:pStyle w:val="NormalWeb"/>
+            </w:pPr>
+            <w:r>
+              <w:t>₦39,168,321,000.00</w:t>
+            </w:r>
+          </w:p>
+        </w:tc>
+      </w:tr>
+      <w:tr>
+        <w:trPr>
+          <w:tblCellSpacing w:w="15" w:type="dxa"/>
+        </w:trPr>
+        <w:tc>
+          <w:tcPr>
+            <w:tcW w:w="0" w:type="auto"/>
+            <w:vAlign w:val="center"/>
+            <w:hideMark/>
+          </w:tcPr>
+          <w:p>
+            <w:pPr>
+              <w:pStyle w:val="NormalWeb"/>
+            </w:pPr>
+            <w:r>
+              <w:t>September 2025</w:t>
+            </w:r>
+          </w:p>
+        </w:tc>
+        <w:tc>
+          <w:tcPr>
+            <w:tcW w:w="0" w:type="auto"/>
+            <w:vAlign w:val="center"/>
+            <w:hideMark/>
+          </w:tcPr>
+          <w:p>
+            <w:pPr>
+              <w:pStyle w:val="NormalWeb"/>
+            </w:pPr>
+            <w:r>
+              <w:t>₦33,684,960,112.00</w:t>
+            </w:r>
+          </w:p>
+        </w:tc>
+      </w:tr>
+      <w:tr>
+        <w:trPr>
+          <w:tblCellSpacing w:w="15" w:type="dxa"/>
+        </w:trPr>
+        <w:tc>
+          <w:tcPr>
+            <w:tcW w:w="0" w:type="auto"/>
+            <w:vAlign w:val="center"/>
+            <w:hideMark/>
+          </w:tcPr>
+          <w:p>
+            <w:pPr>
+              <w:pStyle w:val="NormalWeb"/>
+            </w:pPr>
+            <w:r>
+              <w:t>October 2025</w:t>
+            </w:r>
+          </w:p>
+        </w:tc>
+        <w:tc>
+          <w:tcPr>
+            <w:tcW w:w="0" w:type="auto"/>
+            <w:vAlign w:val="center"/>
+            <w:hideMark/>
+          </w:tcPr>
+          <w:p>
+            <w:pPr>
+              <w:pStyle w:val="NormalWeb"/>
+            </w:pPr>
+            <w:r>
+              <w:t>₦53,837,616,650.00</w:t>
+            </w:r>
+          </w:p>
+        </w:tc>
+      </w:tr>
+      <w:tr>
+        <w:trPr>
+          <w:tblCellSpacing w:w="15" w:type="dxa"/>
+        </w:trPr>
+        <w:tc>
+          <w:tcPr>
+            <w:tcW w:w="0" w:type="auto"/>
+            <w:vAlign w:val="center"/>
+            <w:hideMark/>
+          </w:tcPr>
+          <w:p>
+            <w:pPr>
+              <w:pStyle w:val="NormalWeb"/>
+            </w:pPr>
+            <w:r>
+              <w:t>November 2025</w:t>
+            </w:r>
+          </w:p>
+        </w:tc>
+        <w:tc>
+          <w:tcPr>
+            <w:tcW w:w="0" w:type="auto"/>
+            <w:vAlign w:val="center"/>
+            <w:hideMark/>
+          </w:tcPr>
+          <w:p>
+            <w:pPr>
+              <w:pStyle w:val="NormalWeb"/>
+            </w:pPr>
+            <w:r>
+              <w:t>₦49,865,111,320.49</w:t>
+            </w:r>
+          </w:p>
+        </w:tc>
+      </w:tr>
+      <w:tr>
+        <w:trPr>
+          <w:tblCellSpacing w:w="15" w:type="dxa"/>
+        </w:trPr>
+        <w:tc>
+          <w:tcPr>
+            <w:tcW w:w="0" w:type="auto"/>
+            <w:vAlign w:val="center"/>
+            <w:hideMark/>
+          </w:tcPr>
+          <w:p>
+            <w:pPr>
+              <w:pStyle w:val="NormalWeb"/>
+            </w:pPr>
+            <w:r>
+              <w:t>December 2025</w:t>
+            </w:r>
+          </w:p>
+        </w:tc>
+        <w:tc>
+          <w:tcPr>
+            <w:tcW w:w="0" w:type="auto"/>
+            <w:vAlign w:val="center"/>
+            <w:hideMark/>
+          </w:tcPr>
+          <w:p>
+            <w:pPr>
+              <w:pStyle w:val="NormalWeb"/>
+            </w:pPr>
+            <w:r>
+              <w:t>₦43,400,180,171.40</w:t>
+            </w:r>
+          </w:p>
+        </w:tc>
+      </w:tr>
+    </w:tbl>
+    <w:p>
+      <w:pPr>
+        <w:pStyle w:val="NormalWeb"/>
+      </w:pPr>
+      <w:r>
+        <w:t>3. The December 2025 EMTL total matches the PDF. My earlier calculation was wrong because I left out the ₦2,018,436,620.38 EMTL amount in the RMAFC row. Including it gives the correct total of ₦43,400,180,171.40.</w:t>
+      </w:r>
+    </w:p>
+    <w:p>
+      <w:pPr>
+        <w:pStyle w:val="NormalWeb"/>
+      </w:pPr>
+      <w:r>
+        <w:t>4. Some PDF Key Highlights contain period errors. In the March 2025 report, the text refers to December 2024 and November 2024. In the April report, the allocation paragraph refers to December 2024. In the May report, it refers to January 2025. The EMTL figures still agree with the rounded PDF figures, but the period descriptions need care.</w:t>
+      </w:r>
+    </w:p>
+    <w:p>
+      <w:pPr>
+        <w:pStyle w:val="NormalWeb"/>
+      </w:pPr>
+      <w:r>
+        <w:t>5. The EMTL column moves between files. Other columns also change, including exchange gain, augmentation, solid minerals and other revenue. When loading the data, I should find columns by their heading names, not by their positions.</w:t>
+      </w:r>
+    </w:p>
+    <w:p>
+      <w:pPr>
+        <w:pStyle w:val="NormalWeb"/>
+      </w:pPr>
+      <w:r>
+        <w:lastRenderedPageBreak/>
+        <w:t>6. The “Others” column can combine different revenue items. In some reports, it includes EMTL alongside exchange gain and/or augmentation. I should use the specific EMTL column rather than treating “Others” as EMTL.</w:t>
+      </w:r>
+    </w:p>
+    <w:p>
+      <w:pPr>
+        <w:pStyle w:val="NormalWeb"/>
+      </w:pPr>
+      <w:r>
+        <w:t>7. EMTL is missing from the February–July 2026 reports I checked. This is a gap in the reported FAAC distributions. The available reports do not explain why it is missing, so I should not assume the levy was not collected or that the money will be paid later.</w:t>
+      </w:r>
+    </w:p>
+    <w:p>
+      <w:pPr>
+        <w:pStyle w:val="NormalWeb"/>
+      </w:pPr>
+      <w:r>
+        <w:t xml:space="preserve">8. The reports show allocations and disbursements, not the number of transfers. They do not show how much each </w:t>
+      </w:r>
+      <w:proofErr w:type="spellStart"/>
+      <w:r>
+        <w:t>fintech</w:t>
+      </w:r>
+      <w:proofErr w:type="spellEnd"/>
+      <w:r>
+        <w:t xml:space="preserve"> collected. Dividing EMTL by ₦50 would only give a rough estimate, not a confirmed number of transfers.</w:t>
+      </w:r>
+    </w:p>
+    <w:p>
+      <w:pPr>
+        <w:pStyle w:val="Heading2"/>
+      </w:pPr>
+      <w:r>
+        <w:t>MY DECISION</w:t>
+      </w:r>
+    </w:p>
+    <w:p>
+      <w:pPr>
+        <w:pStyle w:val="NormalWeb"/>
+      </w:pPr>
+      <w:r>
+        <w:t>GO WITH REVISED SCOPE</w:t>
+      </w:r>
+    </w:p>
+    <w:p>
+      <w:pPr>
+        <w:pStyle w:val="NormalWeb"/>
+      </w:pPr>
+      <w:r>
+        <w:t xml:space="preserve">Use the EMTL figures from the Excel Table I and compare them against the PDF. Use the state and local government details </w:t>
+      </w:r>
+      <w:proofErr w:type="spellStart"/>
+      <w:r>
+        <w:t>where</w:t>
+      </w:r>
+      <w:proofErr w:type="spellEnd"/>
+      <w:r>
+        <w:t xml:space="preserve"> available.</w:t>
+      </w:r>
+    </w:p>
+    <w:p>
+      <w:pPr>
+        <w:pStyle w:val="NormalWeb"/>
+      </w:pPr>
+      <w:r>
+        <w:t>For 2025, the reports provide EMTL figures for all 12 sharing months. For 2026, EMTL is shown in January but is not listed in the reports from February through July that I checked.</w:t>
+      </w:r>
+    </w:p>
+    <w:p>
+      <w:pPr>
+        <w:pStyle w:val="NormalWeb"/>
+      </w:pPr>
+      <w:r>
+        <w:t>The analysis can show the reported EMTL amounts and how they were shared when the reports provide those details. It cannot explain why EMTL is missing from the 2026 reports or establish what happened to any money that may have been collected but not shared.</w:t>
+      </w:r>
+    </w:p>
+    <w:p>
+      <w:pPr>
+        <w:pStyle w:val="NormalWeb"/>
+      </w:pPr>
+      <w:r>
+        <w:t>What I still need to find out:</w:t>
+      </w:r>
+    </w:p>
+    <w:p>
+      <w:pPr>
+        <w:pStyle w:val="NormalWeb"/>
+        <w:numPr>
+          <w:ilvl w:val="0"/>
+          <w:numId w:val="15"/>
+        </w:numPr>
+      </w:pPr>
+      <w:r>
+        <w:t>Why EMTL is not listed in the FAAC reports from February through July 2026.</w:t>
+      </w:r>
+    </w:p>
+    <w:p>
+      <w:pPr>
+        <w:pStyle w:val="NormalWeb"/>
+        <w:numPr>
+          <w:ilvl w:val="0"/>
+          <w:numId w:val="15"/>
+        </w:numPr>
+      </w:pPr>
+      <w:r>
+        <w:t>Whether later official reports provide further information about the missing allocations.</w:t>
+      </w:r>
+    </w:p>
+    <w:p>
+      <w:pPr>
+        <w:pStyle w:val="NormalWeb"/>
+        <w:numPr>
+          <w:ilvl w:val="0"/>
+          <w:numId w:val="15"/>
+        </w:numPr>
+      </w:pPr>
+      <w:r>
+        <w:t>The legal basis for the allocation percentages before describing them as a confirmed rule.</w:t>
+      </w:r>
+    </w:p>
+    <w:p>
+      <w:pPr>
+        <w:pStyle w:val="Heading1"/>
       </w:pPr>
       <w:bookmarkStart w:id="0" w:name="_GoBack"/>
       <w:bookmarkEnd w:id="0"/>
+      <w:r>
+        <w:br/>
+      </w:r>
+      <w:r>
+        <w:br/>
+      </w:r>
+      <w:r>
+        <w:br/>
+      </w:r>
     </w:p>
     <w:sectPr>
       <w:pgSz w:w="12240" w:h="15840"/>
@@ -2902,6 +4514,2219 @@
     </w:sectPr>
   </w:body>
 </w:document>
+</file>
+
+<file path=word/numbering.xml><?xml version="1.0" encoding="utf-8"?>
+<w:numbering xmlns:wpc="http://schemas.microsoft.com/office/word/2010/wordprocessingCanvas" xmlns:cx="http://schemas.microsoft.com/office/drawing/2014/chartex" xmlns:mc="http://schemas.openxmlformats.org/markup-compatibility/2006" xmlns:o="urn:schemas-microsoft-com:office:office" xmlns:r="http://schemas.openxmlformats.org/officeDocument/2006/relationships" xmlns:m="http://schemas.openxmlformats.org/officeDocument/2006/math" xmlns:v="urn:schemas-microsoft-com:vml" xmlns:wp14="http://schemas.microsoft.com/office/word/2010/wordprocessingDrawing" xmlns:wp="http://schemas.openxmlformats.org/drawingml/2006/wordprocessingDrawing" xmlns:w10="urn:schemas-microsoft-com:office:word" xmlns:w="http://schemas.openxmlformats.org/wordprocessingml/2006/main" xmlns:w14="http://schemas.microsoft.com/office/word/2010/wordml" xmlns:w15="http://schemas.microsoft.com/office/word/2012/wordml" xmlns:w16se="http://schemas.microsoft.com/office/word/2015/wordml/symex" xmlns:wpg="http://schemas.microsoft.com/office/word/2010/wordprocessingGroup" xmlns:wpi="http://schemas.microsoft.com/office/word/2010/wordprocessingInk" xmlns:wne="http://schemas.microsoft.com/office/word/2006/wordml" xmlns:wps="http://schemas.microsoft.com/office/word/2010/wordprocessingShape" mc:Ignorable="w14 w15 w16se wp14">
+  <w:abstractNum w:abstractNumId="0" w15:restartNumberingAfterBreak="0">
+    <w:nsid w:val="102A3D75"/>
+    <w:multiLevelType w:val="multilevel"/>
+    <w:tmpl w:val="F782D918"/>
+    <w:lvl w:ilvl="0">
+      <w:start w:val="1"/>
+      <w:numFmt w:val="decimal"/>
+      <w:lvlText w:val="%1."/>
+      <w:lvlJc w:val="left"/>
+      <w:pPr>
+        <w:tabs>
+          <w:tab w:val="num" w:pos="720"/>
+        </w:tabs>
+        <w:ind w:left="720" w:hanging="360"/>
+      </w:pPr>
+    </w:lvl>
+    <w:lvl w:ilvl="1" w:tentative="1">
+      <w:start w:val="1"/>
+      <w:numFmt w:val="decimal"/>
+      <w:lvlText w:val="%2."/>
+      <w:lvlJc w:val="left"/>
+      <w:pPr>
+        <w:tabs>
+          <w:tab w:val="num" w:pos="1440"/>
+        </w:tabs>
+        <w:ind w:left="1440" w:hanging="360"/>
+      </w:pPr>
+    </w:lvl>
+    <w:lvl w:ilvl="2" w:tentative="1">
+      <w:start w:val="1"/>
+      <w:numFmt w:val="decimal"/>
+      <w:lvlText w:val="%3."/>
+      <w:lvlJc w:val="left"/>
+      <w:pPr>
+        <w:tabs>
+          <w:tab w:val="num" w:pos="2160"/>
+        </w:tabs>
+        <w:ind w:left="2160" w:hanging="360"/>
+      </w:pPr>
+    </w:lvl>
+    <w:lvl w:ilvl="3" w:tentative="1">
+      <w:start w:val="1"/>
+      <w:numFmt w:val="decimal"/>
+      <w:lvlText w:val="%4."/>
+      <w:lvlJc w:val="left"/>
+      <w:pPr>
+        <w:tabs>
+          <w:tab w:val="num" w:pos="2880"/>
+        </w:tabs>
+        <w:ind w:left="2880" w:hanging="360"/>
+      </w:pPr>
+    </w:lvl>
+    <w:lvl w:ilvl="4" w:tentative="1">
+      <w:start w:val="1"/>
+      <w:numFmt w:val="decimal"/>
+      <w:lvlText w:val="%5."/>
+      <w:lvlJc w:val="left"/>
+      <w:pPr>
+        <w:tabs>
+          <w:tab w:val="num" w:pos="3600"/>
+        </w:tabs>
+        <w:ind w:left="3600" w:hanging="360"/>
+      </w:pPr>
+    </w:lvl>
+    <w:lvl w:ilvl="5" w:tentative="1">
+      <w:start w:val="1"/>
+      <w:numFmt w:val="decimal"/>
+      <w:lvlText w:val="%6."/>
+      <w:lvlJc w:val="left"/>
+      <w:pPr>
+        <w:tabs>
+          <w:tab w:val="num" w:pos="4320"/>
+        </w:tabs>
+        <w:ind w:left="4320" w:hanging="360"/>
+      </w:pPr>
+    </w:lvl>
+    <w:lvl w:ilvl="6" w:tentative="1">
+      <w:start w:val="1"/>
+      <w:numFmt w:val="decimal"/>
+      <w:lvlText w:val="%7."/>
+      <w:lvlJc w:val="left"/>
+      <w:pPr>
+        <w:tabs>
+          <w:tab w:val="num" w:pos="5040"/>
+        </w:tabs>
+        <w:ind w:left="5040" w:hanging="360"/>
+      </w:pPr>
+    </w:lvl>
+    <w:lvl w:ilvl="7" w:tentative="1">
+      <w:start w:val="1"/>
+      <w:numFmt w:val="decimal"/>
+      <w:lvlText w:val="%8."/>
+      <w:lvlJc w:val="left"/>
+      <w:pPr>
+        <w:tabs>
+          <w:tab w:val="num" w:pos="5760"/>
+        </w:tabs>
+        <w:ind w:left="5760" w:hanging="360"/>
+      </w:pPr>
+    </w:lvl>
+    <w:lvl w:ilvl="8" w:tentative="1">
+      <w:start w:val="1"/>
+      <w:numFmt w:val="decimal"/>
+      <w:lvlText w:val="%9."/>
+      <w:lvlJc w:val="left"/>
+      <w:pPr>
+        <w:tabs>
+          <w:tab w:val="num" w:pos="6480"/>
+        </w:tabs>
+        <w:ind w:left="6480" w:hanging="360"/>
+      </w:pPr>
+    </w:lvl>
+  </w:abstractNum>
+  <w:abstractNum w:abstractNumId="1" w15:restartNumberingAfterBreak="0">
+    <w:nsid w:val="14A65FEB"/>
+    <w:multiLevelType w:val="multilevel"/>
+    <w:tmpl w:val="FA44B008"/>
+    <w:lvl w:ilvl="0">
+      <w:start w:val="1"/>
+      <w:numFmt w:val="bullet"/>
+      <w:lvlText w:val=""/>
+      <w:lvlJc w:val="left"/>
+      <w:pPr>
+        <w:tabs>
+          <w:tab w:val="num" w:pos="720"/>
+        </w:tabs>
+        <w:ind w:left="720" w:hanging="360"/>
+      </w:pPr>
+      <w:rPr>
+        <w:rFonts w:ascii="Symbol" w:hAnsi="Symbol" w:hint="default"/>
+        <w:sz w:val="20"/>
+      </w:rPr>
+    </w:lvl>
+    <w:lvl w:ilvl="1" w:tentative="1">
+      <w:start w:val="1"/>
+      <w:numFmt w:val="bullet"/>
+      <w:lvlText w:val="o"/>
+      <w:lvlJc w:val="left"/>
+      <w:pPr>
+        <w:tabs>
+          <w:tab w:val="num" w:pos="1440"/>
+        </w:tabs>
+        <w:ind w:left="1440" w:hanging="360"/>
+      </w:pPr>
+      <w:rPr>
+        <w:rFonts w:ascii="Courier New" w:hAnsi="Courier New" w:hint="default"/>
+        <w:sz w:val="20"/>
+      </w:rPr>
+    </w:lvl>
+    <w:lvl w:ilvl="2" w:tentative="1">
+      <w:start w:val="1"/>
+      <w:numFmt w:val="bullet"/>
+      <w:lvlText w:val=""/>
+      <w:lvlJc w:val="left"/>
+      <w:pPr>
+        <w:tabs>
+          <w:tab w:val="num" w:pos="2160"/>
+        </w:tabs>
+        <w:ind w:left="2160" w:hanging="360"/>
+      </w:pPr>
+      <w:rPr>
+        <w:rFonts w:ascii="Wingdings" w:hAnsi="Wingdings" w:hint="default"/>
+        <w:sz w:val="20"/>
+      </w:rPr>
+    </w:lvl>
+    <w:lvl w:ilvl="3" w:tentative="1">
+      <w:start w:val="1"/>
+      <w:numFmt w:val="bullet"/>
+      <w:lvlText w:val=""/>
+      <w:lvlJc w:val="left"/>
+      <w:pPr>
+        <w:tabs>
+          <w:tab w:val="num" w:pos="2880"/>
+        </w:tabs>
+        <w:ind w:left="2880" w:hanging="360"/>
+      </w:pPr>
+      <w:rPr>
+        <w:rFonts w:ascii="Wingdings" w:hAnsi="Wingdings" w:hint="default"/>
+        <w:sz w:val="20"/>
+      </w:rPr>
+    </w:lvl>
+    <w:lvl w:ilvl="4" w:tentative="1">
+      <w:start w:val="1"/>
+      <w:numFmt w:val="bullet"/>
+      <w:lvlText w:val=""/>
+      <w:lvlJc w:val="left"/>
+      <w:pPr>
+        <w:tabs>
+          <w:tab w:val="num" w:pos="3600"/>
+        </w:tabs>
+        <w:ind w:left="3600" w:hanging="360"/>
+      </w:pPr>
+      <w:rPr>
+        <w:rFonts w:ascii="Wingdings" w:hAnsi="Wingdings" w:hint="default"/>
+        <w:sz w:val="20"/>
+      </w:rPr>
+    </w:lvl>
+    <w:lvl w:ilvl="5" w:tentative="1">
+      <w:start w:val="1"/>
+      <w:numFmt w:val="bullet"/>
+      <w:lvlText w:val=""/>
+      <w:lvlJc w:val="left"/>
+      <w:pPr>
+        <w:tabs>
+          <w:tab w:val="num" w:pos="4320"/>
+        </w:tabs>
+        <w:ind w:left="4320" w:hanging="360"/>
+      </w:pPr>
+      <w:rPr>
+        <w:rFonts w:ascii="Wingdings" w:hAnsi="Wingdings" w:hint="default"/>
+        <w:sz w:val="20"/>
+      </w:rPr>
+    </w:lvl>
+    <w:lvl w:ilvl="6" w:tentative="1">
+      <w:start w:val="1"/>
+      <w:numFmt w:val="bullet"/>
+      <w:lvlText w:val=""/>
+      <w:lvlJc w:val="left"/>
+      <w:pPr>
+        <w:tabs>
+          <w:tab w:val="num" w:pos="5040"/>
+        </w:tabs>
+        <w:ind w:left="5040" w:hanging="360"/>
+      </w:pPr>
+      <w:rPr>
+        <w:rFonts w:ascii="Wingdings" w:hAnsi="Wingdings" w:hint="default"/>
+        <w:sz w:val="20"/>
+      </w:rPr>
+    </w:lvl>
+    <w:lvl w:ilvl="7" w:tentative="1">
+      <w:start w:val="1"/>
+      <w:numFmt w:val="bullet"/>
+      <w:lvlText w:val=""/>
+      <w:lvlJc w:val="left"/>
+      <w:pPr>
+        <w:tabs>
+          <w:tab w:val="num" w:pos="5760"/>
+        </w:tabs>
+        <w:ind w:left="5760" w:hanging="360"/>
+      </w:pPr>
+      <w:rPr>
+        <w:rFonts w:ascii="Wingdings" w:hAnsi="Wingdings" w:hint="default"/>
+        <w:sz w:val="20"/>
+      </w:rPr>
+    </w:lvl>
+    <w:lvl w:ilvl="8" w:tentative="1">
+      <w:start w:val="1"/>
+      <w:numFmt w:val="bullet"/>
+      <w:lvlText w:val=""/>
+      <w:lvlJc w:val="left"/>
+      <w:pPr>
+        <w:tabs>
+          <w:tab w:val="num" w:pos="6480"/>
+        </w:tabs>
+        <w:ind w:left="6480" w:hanging="360"/>
+      </w:pPr>
+      <w:rPr>
+        <w:rFonts w:ascii="Wingdings" w:hAnsi="Wingdings" w:hint="default"/>
+        <w:sz w:val="20"/>
+      </w:rPr>
+    </w:lvl>
+  </w:abstractNum>
+  <w:abstractNum w:abstractNumId="2" w15:restartNumberingAfterBreak="0">
+    <w:nsid w:val="15BC1062"/>
+    <w:multiLevelType w:val="multilevel"/>
+    <w:tmpl w:val="79F66F72"/>
+    <w:lvl w:ilvl="0">
+      <w:start w:val="1"/>
+      <w:numFmt w:val="bullet"/>
+      <w:lvlText w:val=""/>
+      <w:lvlJc w:val="left"/>
+      <w:pPr>
+        <w:tabs>
+          <w:tab w:val="num" w:pos="720"/>
+        </w:tabs>
+        <w:ind w:left="720" w:hanging="360"/>
+      </w:pPr>
+      <w:rPr>
+        <w:rFonts w:ascii="Symbol" w:hAnsi="Symbol" w:hint="default"/>
+        <w:sz w:val="20"/>
+      </w:rPr>
+    </w:lvl>
+    <w:lvl w:ilvl="1" w:tentative="1">
+      <w:start w:val="1"/>
+      <w:numFmt w:val="bullet"/>
+      <w:lvlText w:val="o"/>
+      <w:lvlJc w:val="left"/>
+      <w:pPr>
+        <w:tabs>
+          <w:tab w:val="num" w:pos="1440"/>
+        </w:tabs>
+        <w:ind w:left="1440" w:hanging="360"/>
+      </w:pPr>
+      <w:rPr>
+        <w:rFonts w:ascii="Courier New" w:hAnsi="Courier New" w:hint="default"/>
+        <w:sz w:val="20"/>
+      </w:rPr>
+    </w:lvl>
+    <w:lvl w:ilvl="2" w:tentative="1">
+      <w:start w:val="1"/>
+      <w:numFmt w:val="bullet"/>
+      <w:lvlText w:val=""/>
+      <w:lvlJc w:val="left"/>
+      <w:pPr>
+        <w:tabs>
+          <w:tab w:val="num" w:pos="2160"/>
+        </w:tabs>
+        <w:ind w:left="2160" w:hanging="360"/>
+      </w:pPr>
+      <w:rPr>
+        <w:rFonts w:ascii="Wingdings" w:hAnsi="Wingdings" w:hint="default"/>
+        <w:sz w:val="20"/>
+      </w:rPr>
+    </w:lvl>
+    <w:lvl w:ilvl="3" w:tentative="1">
+      <w:start w:val="1"/>
+      <w:numFmt w:val="bullet"/>
+      <w:lvlText w:val=""/>
+      <w:lvlJc w:val="left"/>
+      <w:pPr>
+        <w:tabs>
+          <w:tab w:val="num" w:pos="2880"/>
+        </w:tabs>
+        <w:ind w:left="2880" w:hanging="360"/>
+      </w:pPr>
+      <w:rPr>
+        <w:rFonts w:ascii="Wingdings" w:hAnsi="Wingdings" w:hint="default"/>
+        <w:sz w:val="20"/>
+      </w:rPr>
+    </w:lvl>
+    <w:lvl w:ilvl="4" w:tentative="1">
+      <w:start w:val="1"/>
+      <w:numFmt w:val="bullet"/>
+      <w:lvlText w:val=""/>
+      <w:lvlJc w:val="left"/>
+      <w:pPr>
+        <w:tabs>
+          <w:tab w:val="num" w:pos="3600"/>
+        </w:tabs>
+        <w:ind w:left="3600" w:hanging="360"/>
+      </w:pPr>
+      <w:rPr>
+        <w:rFonts w:ascii="Wingdings" w:hAnsi="Wingdings" w:hint="default"/>
+        <w:sz w:val="20"/>
+      </w:rPr>
+    </w:lvl>
+    <w:lvl w:ilvl="5" w:tentative="1">
+      <w:start w:val="1"/>
+      <w:numFmt w:val="bullet"/>
+      <w:lvlText w:val=""/>
+      <w:lvlJc w:val="left"/>
+      <w:pPr>
+        <w:tabs>
+          <w:tab w:val="num" w:pos="4320"/>
+        </w:tabs>
+        <w:ind w:left="4320" w:hanging="360"/>
+      </w:pPr>
+      <w:rPr>
+        <w:rFonts w:ascii="Wingdings" w:hAnsi="Wingdings" w:hint="default"/>
+        <w:sz w:val="20"/>
+      </w:rPr>
+    </w:lvl>
+    <w:lvl w:ilvl="6" w:tentative="1">
+      <w:start w:val="1"/>
+      <w:numFmt w:val="bullet"/>
+      <w:lvlText w:val=""/>
+      <w:lvlJc w:val="left"/>
+      <w:pPr>
+        <w:tabs>
+          <w:tab w:val="num" w:pos="5040"/>
+        </w:tabs>
+        <w:ind w:left="5040" w:hanging="360"/>
+      </w:pPr>
+      <w:rPr>
+        <w:rFonts w:ascii="Wingdings" w:hAnsi="Wingdings" w:hint="default"/>
+        <w:sz w:val="20"/>
+      </w:rPr>
+    </w:lvl>
+    <w:lvl w:ilvl="7" w:tentative="1">
+      <w:start w:val="1"/>
+      <w:numFmt w:val="bullet"/>
+      <w:lvlText w:val=""/>
+      <w:lvlJc w:val="left"/>
+      <w:pPr>
+        <w:tabs>
+          <w:tab w:val="num" w:pos="5760"/>
+        </w:tabs>
+        <w:ind w:left="5760" w:hanging="360"/>
+      </w:pPr>
+      <w:rPr>
+        <w:rFonts w:ascii="Wingdings" w:hAnsi="Wingdings" w:hint="default"/>
+        <w:sz w:val="20"/>
+      </w:rPr>
+    </w:lvl>
+    <w:lvl w:ilvl="8" w:tentative="1">
+      <w:start w:val="1"/>
+      <w:numFmt w:val="bullet"/>
+      <w:lvlText w:val=""/>
+      <w:lvlJc w:val="left"/>
+      <w:pPr>
+        <w:tabs>
+          <w:tab w:val="num" w:pos="6480"/>
+        </w:tabs>
+        <w:ind w:left="6480" w:hanging="360"/>
+      </w:pPr>
+      <w:rPr>
+        <w:rFonts w:ascii="Wingdings" w:hAnsi="Wingdings" w:hint="default"/>
+        <w:sz w:val="20"/>
+      </w:rPr>
+    </w:lvl>
+  </w:abstractNum>
+  <w:abstractNum w:abstractNumId="3" w15:restartNumberingAfterBreak="0">
+    <w:nsid w:val="1CCC01D2"/>
+    <w:multiLevelType w:val="multilevel"/>
+    <w:tmpl w:val="1F02F1F8"/>
+    <w:lvl w:ilvl="0">
+      <w:start w:val="1"/>
+      <w:numFmt w:val="bullet"/>
+      <w:lvlText w:val=""/>
+      <w:lvlJc w:val="left"/>
+      <w:pPr>
+        <w:tabs>
+          <w:tab w:val="num" w:pos="720"/>
+        </w:tabs>
+        <w:ind w:left="720" w:hanging="360"/>
+      </w:pPr>
+      <w:rPr>
+        <w:rFonts w:ascii="Symbol" w:hAnsi="Symbol" w:hint="default"/>
+        <w:sz w:val="20"/>
+      </w:rPr>
+    </w:lvl>
+    <w:lvl w:ilvl="1" w:tentative="1">
+      <w:start w:val="1"/>
+      <w:numFmt w:val="bullet"/>
+      <w:lvlText w:val="o"/>
+      <w:lvlJc w:val="left"/>
+      <w:pPr>
+        <w:tabs>
+          <w:tab w:val="num" w:pos="1440"/>
+        </w:tabs>
+        <w:ind w:left="1440" w:hanging="360"/>
+      </w:pPr>
+      <w:rPr>
+        <w:rFonts w:ascii="Courier New" w:hAnsi="Courier New" w:hint="default"/>
+        <w:sz w:val="20"/>
+      </w:rPr>
+    </w:lvl>
+    <w:lvl w:ilvl="2" w:tentative="1">
+      <w:start w:val="1"/>
+      <w:numFmt w:val="bullet"/>
+      <w:lvlText w:val=""/>
+      <w:lvlJc w:val="left"/>
+      <w:pPr>
+        <w:tabs>
+          <w:tab w:val="num" w:pos="2160"/>
+        </w:tabs>
+        <w:ind w:left="2160" w:hanging="360"/>
+      </w:pPr>
+      <w:rPr>
+        <w:rFonts w:ascii="Wingdings" w:hAnsi="Wingdings" w:hint="default"/>
+        <w:sz w:val="20"/>
+      </w:rPr>
+    </w:lvl>
+    <w:lvl w:ilvl="3" w:tentative="1">
+      <w:start w:val="1"/>
+      <w:numFmt w:val="bullet"/>
+      <w:lvlText w:val=""/>
+      <w:lvlJc w:val="left"/>
+      <w:pPr>
+        <w:tabs>
+          <w:tab w:val="num" w:pos="2880"/>
+        </w:tabs>
+        <w:ind w:left="2880" w:hanging="360"/>
+      </w:pPr>
+      <w:rPr>
+        <w:rFonts w:ascii="Wingdings" w:hAnsi="Wingdings" w:hint="default"/>
+        <w:sz w:val="20"/>
+      </w:rPr>
+    </w:lvl>
+    <w:lvl w:ilvl="4" w:tentative="1">
+      <w:start w:val="1"/>
+      <w:numFmt w:val="bullet"/>
+      <w:lvlText w:val=""/>
+      <w:lvlJc w:val="left"/>
+      <w:pPr>
+        <w:tabs>
+          <w:tab w:val="num" w:pos="3600"/>
+        </w:tabs>
+        <w:ind w:left="3600" w:hanging="360"/>
+      </w:pPr>
+      <w:rPr>
+        <w:rFonts w:ascii="Wingdings" w:hAnsi="Wingdings" w:hint="default"/>
+        <w:sz w:val="20"/>
+      </w:rPr>
+    </w:lvl>
+    <w:lvl w:ilvl="5" w:tentative="1">
+      <w:start w:val="1"/>
+      <w:numFmt w:val="bullet"/>
+      <w:lvlText w:val=""/>
+      <w:lvlJc w:val="left"/>
+      <w:pPr>
+        <w:tabs>
+          <w:tab w:val="num" w:pos="4320"/>
+        </w:tabs>
+        <w:ind w:left="4320" w:hanging="360"/>
+      </w:pPr>
+      <w:rPr>
+        <w:rFonts w:ascii="Wingdings" w:hAnsi="Wingdings" w:hint="default"/>
+        <w:sz w:val="20"/>
+      </w:rPr>
+    </w:lvl>
+    <w:lvl w:ilvl="6" w:tentative="1">
+      <w:start w:val="1"/>
+      <w:numFmt w:val="bullet"/>
+      <w:lvlText w:val=""/>
+      <w:lvlJc w:val="left"/>
+      <w:pPr>
+        <w:tabs>
+          <w:tab w:val="num" w:pos="5040"/>
+        </w:tabs>
+        <w:ind w:left="5040" w:hanging="360"/>
+      </w:pPr>
+      <w:rPr>
+        <w:rFonts w:ascii="Wingdings" w:hAnsi="Wingdings" w:hint="default"/>
+        <w:sz w:val="20"/>
+      </w:rPr>
+    </w:lvl>
+    <w:lvl w:ilvl="7" w:tentative="1">
+      <w:start w:val="1"/>
+      <w:numFmt w:val="bullet"/>
+      <w:lvlText w:val=""/>
+      <w:lvlJc w:val="left"/>
+      <w:pPr>
+        <w:tabs>
+          <w:tab w:val="num" w:pos="5760"/>
+        </w:tabs>
+        <w:ind w:left="5760" w:hanging="360"/>
+      </w:pPr>
+      <w:rPr>
+        <w:rFonts w:ascii="Wingdings" w:hAnsi="Wingdings" w:hint="default"/>
+        <w:sz w:val="20"/>
+      </w:rPr>
+    </w:lvl>
+    <w:lvl w:ilvl="8" w:tentative="1">
+      <w:start w:val="1"/>
+      <w:numFmt w:val="bullet"/>
+      <w:lvlText w:val=""/>
+      <w:lvlJc w:val="left"/>
+      <w:pPr>
+        <w:tabs>
+          <w:tab w:val="num" w:pos="6480"/>
+        </w:tabs>
+        <w:ind w:left="6480" w:hanging="360"/>
+      </w:pPr>
+      <w:rPr>
+        <w:rFonts w:ascii="Wingdings" w:hAnsi="Wingdings" w:hint="default"/>
+        <w:sz w:val="20"/>
+      </w:rPr>
+    </w:lvl>
+  </w:abstractNum>
+  <w:abstractNum w:abstractNumId="4" w15:restartNumberingAfterBreak="0">
+    <w:nsid w:val="304B779A"/>
+    <w:multiLevelType w:val="multilevel"/>
+    <w:tmpl w:val="5CDA722E"/>
+    <w:lvl w:ilvl="0">
+      <w:start w:val="1"/>
+      <w:numFmt w:val="bullet"/>
+      <w:lvlText w:val=""/>
+      <w:lvlJc w:val="left"/>
+      <w:pPr>
+        <w:tabs>
+          <w:tab w:val="num" w:pos="720"/>
+        </w:tabs>
+        <w:ind w:left="720" w:hanging="360"/>
+      </w:pPr>
+      <w:rPr>
+        <w:rFonts w:ascii="Symbol" w:hAnsi="Symbol" w:hint="default"/>
+        <w:sz w:val="20"/>
+      </w:rPr>
+    </w:lvl>
+    <w:lvl w:ilvl="1" w:tentative="1">
+      <w:start w:val="1"/>
+      <w:numFmt w:val="bullet"/>
+      <w:lvlText w:val="o"/>
+      <w:lvlJc w:val="left"/>
+      <w:pPr>
+        <w:tabs>
+          <w:tab w:val="num" w:pos="1440"/>
+        </w:tabs>
+        <w:ind w:left="1440" w:hanging="360"/>
+      </w:pPr>
+      <w:rPr>
+        <w:rFonts w:ascii="Courier New" w:hAnsi="Courier New" w:hint="default"/>
+        <w:sz w:val="20"/>
+      </w:rPr>
+    </w:lvl>
+    <w:lvl w:ilvl="2" w:tentative="1">
+      <w:start w:val="1"/>
+      <w:numFmt w:val="bullet"/>
+      <w:lvlText w:val=""/>
+      <w:lvlJc w:val="left"/>
+      <w:pPr>
+        <w:tabs>
+          <w:tab w:val="num" w:pos="2160"/>
+        </w:tabs>
+        <w:ind w:left="2160" w:hanging="360"/>
+      </w:pPr>
+      <w:rPr>
+        <w:rFonts w:ascii="Wingdings" w:hAnsi="Wingdings" w:hint="default"/>
+        <w:sz w:val="20"/>
+      </w:rPr>
+    </w:lvl>
+    <w:lvl w:ilvl="3" w:tentative="1">
+      <w:start w:val="1"/>
+      <w:numFmt w:val="bullet"/>
+      <w:lvlText w:val=""/>
+      <w:lvlJc w:val="left"/>
+      <w:pPr>
+        <w:tabs>
+          <w:tab w:val="num" w:pos="2880"/>
+        </w:tabs>
+        <w:ind w:left="2880" w:hanging="360"/>
+      </w:pPr>
+      <w:rPr>
+        <w:rFonts w:ascii="Wingdings" w:hAnsi="Wingdings" w:hint="default"/>
+        <w:sz w:val="20"/>
+      </w:rPr>
+    </w:lvl>
+    <w:lvl w:ilvl="4" w:tentative="1">
+      <w:start w:val="1"/>
+      <w:numFmt w:val="bullet"/>
+      <w:lvlText w:val=""/>
+      <w:lvlJc w:val="left"/>
+      <w:pPr>
+        <w:tabs>
+          <w:tab w:val="num" w:pos="3600"/>
+        </w:tabs>
+        <w:ind w:left="3600" w:hanging="360"/>
+      </w:pPr>
+      <w:rPr>
+        <w:rFonts w:ascii="Wingdings" w:hAnsi="Wingdings" w:hint="default"/>
+        <w:sz w:val="20"/>
+      </w:rPr>
+    </w:lvl>
+    <w:lvl w:ilvl="5" w:tentative="1">
+      <w:start w:val="1"/>
+      <w:numFmt w:val="bullet"/>
+      <w:lvlText w:val=""/>
+      <w:lvlJc w:val="left"/>
+      <w:pPr>
+        <w:tabs>
+          <w:tab w:val="num" w:pos="4320"/>
+        </w:tabs>
+        <w:ind w:left="4320" w:hanging="360"/>
+      </w:pPr>
+      <w:rPr>
+        <w:rFonts w:ascii="Wingdings" w:hAnsi="Wingdings" w:hint="default"/>
+        <w:sz w:val="20"/>
+      </w:rPr>
+    </w:lvl>
+    <w:lvl w:ilvl="6" w:tentative="1">
+      <w:start w:val="1"/>
+      <w:numFmt w:val="bullet"/>
+      <w:lvlText w:val=""/>
+      <w:lvlJc w:val="left"/>
+      <w:pPr>
+        <w:tabs>
+          <w:tab w:val="num" w:pos="5040"/>
+        </w:tabs>
+        <w:ind w:left="5040" w:hanging="360"/>
+      </w:pPr>
+      <w:rPr>
+        <w:rFonts w:ascii="Wingdings" w:hAnsi="Wingdings" w:hint="default"/>
+        <w:sz w:val="20"/>
+      </w:rPr>
+    </w:lvl>
+    <w:lvl w:ilvl="7" w:tentative="1">
+      <w:start w:val="1"/>
+      <w:numFmt w:val="bullet"/>
+      <w:lvlText w:val=""/>
+      <w:lvlJc w:val="left"/>
+      <w:pPr>
+        <w:tabs>
+          <w:tab w:val="num" w:pos="5760"/>
+        </w:tabs>
+        <w:ind w:left="5760" w:hanging="360"/>
+      </w:pPr>
+      <w:rPr>
+        <w:rFonts w:ascii="Wingdings" w:hAnsi="Wingdings" w:hint="default"/>
+        <w:sz w:val="20"/>
+      </w:rPr>
+    </w:lvl>
+    <w:lvl w:ilvl="8" w:tentative="1">
+      <w:start w:val="1"/>
+      <w:numFmt w:val="bullet"/>
+      <w:lvlText w:val=""/>
+      <w:lvlJc w:val="left"/>
+      <w:pPr>
+        <w:tabs>
+          <w:tab w:val="num" w:pos="6480"/>
+        </w:tabs>
+        <w:ind w:left="6480" w:hanging="360"/>
+      </w:pPr>
+      <w:rPr>
+        <w:rFonts w:ascii="Wingdings" w:hAnsi="Wingdings" w:hint="default"/>
+        <w:sz w:val="20"/>
+      </w:rPr>
+    </w:lvl>
+  </w:abstractNum>
+  <w:abstractNum w:abstractNumId="5" w15:restartNumberingAfterBreak="0">
+    <w:nsid w:val="42B30C20"/>
+    <w:multiLevelType w:val="multilevel"/>
+    <w:tmpl w:val="AC52524E"/>
+    <w:lvl w:ilvl="0">
+      <w:start w:val="1"/>
+      <w:numFmt w:val="bullet"/>
+      <w:lvlText w:val=""/>
+      <w:lvlJc w:val="left"/>
+      <w:pPr>
+        <w:tabs>
+          <w:tab w:val="num" w:pos="720"/>
+        </w:tabs>
+        <w:ind w:left="720" w:hanging="360"/>
+      </w:pPr>
+      <w:rPr>
+        <w:rFonts w:ascii="Symbol" w:hAnsi="Symbol" w:hint="default"/>
+        <w:sz w:val="20"/>
+      </w:rPr>
+    </w:lvl>
+    <w:lvl w:ilvl="1" w:tentative="1">
+      <w:start w:val="1"/>
+      <w:numFmt w:val="bullet"/>
+      <w:lvlText w:val="o"/>
+      <w:lvlJc w:val="left"/>
+      <w:pPr>
+        <w:tabs>
+          <w:tab w:val="num" w:pos="1440"/>
+        </w:tabs>
+        <w:ind w:left="1440" w:hanging="360"/>
+      </w:pPr>
+      <w:rPr>
+        <w:rFonts w:ascii="Courier New" w:hAnsi="Courier New" w:hint="default"/>
+        <w:sz w:val="20"/>
+      </w:rPr>
+    </w:lvl>
+    <w:lvl w:ilvl="2" w:tentative="1">
+      <w:start w:val="1"/>
+      <w:numFmt w:val="bullet"/>
+      <w:lvlText w:val=""/>
+      <w:lvlJc w:val="left"/>
+      <w:pPr>
+        <w:tabs>
+          <w:tab w:val="num" w:pos="2160"/>
+        </w:tabs>
+        <w:ind w:left="2160" w:hanging="360"/>
+      </w:pPr>
+      <w:rPr>
+        <w:rFonts w:ascii="Wingdings" w:hAnsi="Wingdings" w:hint="default"/>
+        <w:sz w:val="20"/>
+      </w:rPr>
+    </w:lvl>
+    <w:lvl w:ilvl="3" w:tentative="1">
+      <w:start w:val="1"/>
+      <w:numFmt w:val="bullet"/>
+      <w:lvlText w:val=""/>
+      <w:lvlJc w:val="left"/>
+      <w:pPr>
+        <w:tabs>
+          <w:tab w:val="num" w:pos="2880"/>
+        </w:tabs>
+        <w:ind w:left="2880" w:hanging="360"/>
+      </w:pPr>
+      <w:rPr>
+        <w:rFonts w:ascii="Wingdings" w:hAnsi="Wingdings" w:hint="default"/>
+        <w:sz w:val="20"/>
+      </w:rPr>
+    </w:lvl>
+    <w:lvl w:ilvl="4" w:tentative="1">
+      <w:start w:val="1"/>
+      <w:numFmt w:val="bullet"/>
+      <w:lvlText w:val=""/>
+      <w:lvlJc w:val="left"/>
+      <w:pPr>
+        <w:tabs>
+          <w:tab w:val="num" w:pos="3600"/>
+        </w:tabs>
+        <w:ind w:left="3600" w:hanging="360"/>
+      </w:pPr>
+      <w:rPr>
+        <w:rFonts w:ascii="Wingdings" w:hAnsi="Wingdings" w:hint="default"/>
+        <w:sz w:val="20"/>
+      </w:rPr>
+    </w:lvl>
+    <w:lvl w:ilvl="5" w:tentative="1">
+      <w:start w:val="1"/>
+      <w:numFmt w:val="bullet"/>
+      <w:lvlText w:val=""/>
+      <w:lvlJc w:val="left"/>
+      <w:pPr>
+        <w:tabs>
+          <w:tab w:val="num" w:pos="4320"/>
+        </w:tabs>
+        <w:ind w:left="4320" w:hanging="360"/>
+      </w:pPr>
+      <w:rPr>
+        <w:rFonts w:ascii="Wingdings" w:hAnsi="Wingdings" w:hint="default"/>
+        <w:sz w:val="20"/>
+      </w:rPr>
+    </w:lvl>
+    <w:lvl w:ilvl="6" w:tentative="1">
+      <w:start w:val="1"/>
+      <w:numFmt w:val="bullet"/>
+      <w:lvlText w:val=""/>
+      <w:lvlJc w:val="left"/>
+      <w:pPr>
+        <w:tabs>
+          <w:tab w:val="num" w:pos="5040"/>
+        </w:tabs>
+        <w:ind w:left="5040" w:hanging="360"/>
+      </w:pPr>
+      <w:rPr>
+        <w:rFonts w:ascii="Wingdings" w:hAnsi="Wingdings" w:hint="default"/>
+        <w:sz w:val="20"/>
+      </w:rPr>
+    </w:lvl>
+    <w:lvl w:ilvl="7" w:tentative="1">
+      <w:start w:val="1"/>
+      <w:numFmt w:val="bullet"/>
+      <w:lvlText w:val=""/>
+      <w:lvlJc w:val="left"/>
+      <w:pPr>
+        <w:tabs>
+          <w:tab w:val="num" w:pos="5760"/>
+        </w:tabs>
+        <w:ind w:left="5760" w:hanging="360"/>
+      </w:pPr>
+      <w:rPr>
+        <w:rFonts w:ascii="Wingdings" w:hAnsi="Wingdings" w:hint="default"/>
+        <w:sz w:val="20"/>
+      </w:rPr>
+    </w:lvl>
+    <w:lvl w:ilvl="8" w:tentative="1">
+      <w:start w:val="1"/>
+      <w:numFmt w:val="bullet"/>
+      <w:lvlText w:val=""/>
+      <w:lvlJc w:val="left"/>
+      <w:pPr>
+        <w:tabs>
+          <w:tab w:val="num" w:pos="6480"/>
+        </w:tabs>
+        <w:ind w:left="6480" w:hanging="360"/>
+      </w:pPr>
+      <w:rPr>
+        <w:rFonts w:ascii="Wingdings" w:hAnsi="Wingdings" w:hint="default"/>
+        <w:sz w:val="20"/>
+      </w:rPr>
+    </w:lvl>
+  </w:abstractNum>
+  <w:abstractNum w:abstractNumId="6" w15:restartNumberingAfterBreak="0">
+    <w:nsid w:val="44A247FD"/>
+    <w:multiLevelType w:val="multilevel"/>
+    <w:tmpl w:val="04300D0C"/>
+    <w:lvl w:ilvl="0">
+      <w:start w:val="1"/>
+      <w:numFmt w:val="bullet"/>
+      <w:lvlText w:val=""/>
+      <w:lvlJc w:val="left"/>
+      <w:pPr>
+        <w:tabs>
+          <w:tab w:val="num" w:pos="720"/>
+        </w:tabs>
+        <w:ind w:left="720" w:hanging="360"/>
+      </w:pPr>
+      <w:rPr>
+        <w:rFonts w:ascii="Symbol" w:hAnsi="Symbol" w:hint="default"/>
+        <w:sz w:val="20"/>
+      </w:rPr>
+    </w:lvl>
+    <w:lvl w:ilvl="1" w:tentative="1">
+      <w:start w:val="1"/>
+      <w:numFmt w:val="bullet"/>
+      <w:lvlText w:val="o"/>
+      <w:lvlJc w:val="left"/>
+      <w:pPr>
+        <w:tabs>
+          <w:tab w:val="num" w:pos="1440"/>
+        </w:tabs>
+        <w:ind w:left="1440" w:hanging="360"/>
+      </w:pPr>
+      <w:rPr>
+        <w:rFonts w:ascii="Courier New" w:hAnsi="Courier New" w:hint="default"/>
+        <w:sz w:val="20"/>
+      </w:rPr>
+    </w:lvl>
+    <w:lvl w:ilvl="2" w:tentative="1">
+      <w:start w:val="1"/>
+      <w:numFmt w:val="bullet"/>
+      <w:lvlText w:val=""/>
+      <w:lvlJc w:val="left"/>
+      <w:pPr>
+        <w:tabs>
+          <w:tab w:val="num" w:pos="2160"/>
+        </w:tabs>
+        <w:ind w:left="2160" w:hanging="360"/>
+      </w:pPr>
+      <w:rPr>
+        <w:rFonts w:ascii="Wingdings" w:hAnsi="Wingdings" w:hint="default"/>
+        <w:sz w:val="20"/>
+      </w:rPr>
+    </w:lvl>
+    <w:lvl w:ilvl="3" w:tentative="1">
+      <w:start w:val="1"/>
+      <w:numFmt w:val="bullet"/>
+      <w:lvlText w:val=""/>
+      <w:lvlJc w:val="left"/>
+      <w:pPr>
+        <w:tabs>
+          <w:tab w:val="num" w:pos="2880"/>
+        </w:tabs>
+        <w:ind w:left="2880" w:hanging="360"/>
+      </w:pPr>
+      <w:rPr>
+        <w:rFonts w:ascii="Wingdings" w:hAnsi="Wingdings" w:hint="default"/>
+        <w:sz w:val="20"/>
+      </w:rPr>
+    </w:lvl>
+    <w:lvl w:ilvl="4" w:tentative="1">
+      <w:start w:val="1"/>
+      <w:numFmt w:val="bullet"/>
+      <w:lvlText w:val=""/>
+      <w:lvlJc w:val="left"/>
+      <w:pPr>
+        <w:tabs>
+          <w:tab w:val="num" w:pos="3600"/>
+        </w:tabs>
+        <w:ind w:left="3600" w:hanging="360"/>
+      </w:pPr>
+      <w:rPr>
+        <w:rFonts w:ascii="Wingdings" w:hAnsi="Wingdings" w:hint="default"/>
+        <w:sz w:val="20"/>
+      </w:rPr>
+    </w:lvl>
+    <w:lvl w:ilvl="5" w:tentative="1">
+      <w:start w:val="1"/>
+      <w:numFmt w:val="bullet"/>
+      <w:lvlText w:val=""/>
+      <w:lvlJc w:val="left"/>
+      <w:pPr>
+        <w:tabs>
+          <w:tab w:val="num" w:pos="4320"/>
+        </w:tabs>
+        <w:ind w:left="4320" w:hanging="360"/>
+      </w:pPr>
+      <w:rPr>
+        <w:rFonts w:ascii="Wingdings" w:hAnsi="Wingdings" w:hint="default"/>
+        <w:sz w:val="20"/>
+      </w:rPr>
+    </w:lvl>
+    <w:lvl w:ilvl="6" w:tentative="1">
+      <w:start w:val="1"/>
+      <w:numFmt w:val="bullet"/>
+      <w:lvlText w:val=""/>
+      <w:lvlJc w:val="left"/>
+      <w:pPr>
+        <w:tabs>
+          <w:tab w:val="num" w:pos="5040"/>
+        </w:tabs>
+        <w:ind w:left="5040" w:hanging="360"/>
+      </w:pPr>
+      <w:rPr>
+        <w:rFonts w:ascii="Wingdings" w:hAnsi="Wingdings" w:hint="default"/>
+        <w:sz w:val="20"/>
+      </w:rPr>
+    </w:lvl>
+    <w:lvl w:ilvl="7" w:tentative="1">
+      <w:start w:val="1"/>
+      <w:numFmt w:val="bullet"/>
+      <w:lvlText w:val=""/>
+      <w:lvlJc w:val="left"/>
+      <w:pPr>
+        <w:tabs>
+          <w:tab w:val="num" w:pos="5760"/>
+        </w:tabs>
+        <w:ind w:left="5760" w:hanging="360"/>
+      </w:pPr>
+      <w:rPr>
+        <w:rFonts w:ascii="Wingdings" w:hAnsi="Wingdings" w:hint="default"/>
+        <w:sz w:val="20"/>
+      </w:rPr>
+    </w:lvl>
+    <w:lvl w:ilvl="8" w:tentative="1">
+      <w:start w:val="1"/>
+      <w:numFmt w:val="bullet"/>
+      <w:lvlText w:val=""/>
+      <w:lvlJc w:val="left"/>
+      <w:pPr>
+        <w:tabs>
+          <w:tab w:val="num" w:pos="6480"/>
+        </w:tabs>
+        <w:ind w:left="6480" w:hanging="360"/>
+      </w:pPr>
+      <w:rPr>
+        <w:rFonts w:ascii="Wingdings" w:hAnsi="Wingdings" w:hint="default"/>
+        <w:sz w:val="20"/>
+      </w:rPr>
+    </w:lvl>
+  </w:abstractNum>
+  <w:abstractNum w:abstractNumId="7" w15:restartNumberingAfterBreak="0">
+    <w:nsid w:val="47F706BF"/>
+    <w:multiLevelType w:val="multilevel"/>
+    <w:tmpl w:val="18665D68"/>
+    <w:lvl w:ilvl="0">
+      <w:start w:val="1"/>
+      <w:numFmt w:val="bullet"/>
+      <w:lvlText w:val=""/>
+      <w:lvlJc w:val="left"/>
+      <w:pPr>
+        <w:tabs>
+          <w:tab w:val="num" w:pos="720"/>
+        </w:tabs>
+        <w:ind w:left="720" w:hanging="360"/>
+      </w:pPr>
+      <w:rPr>
+        <w:rFonts w:ascii="Symbol" w:hAnsi="Symbol" w:hint="default"/>
+        <w:sz w:val="20"/>
+      </w:rPr>
+    </w:lvl>
+    <w:lvl w:ilvl="1" w:tentative="1">
+      <w:start w:val="1"/>
+      <w:numFmt w:val="bullet"/>
+      <w:lvlText w:val="o"/>
+      <w:lvlJc w:val="left"/>
+      <w:pPr>
+        <w:tabs>
+          <w:tab w:val="num" w:pos="1440"/>
+        </w:tabs>
+        <w:ind w:left="1440" w:hanging="360"/>
+      </w:pPr>
+      <w:rPr>
+        <w:rFonts w:ascii="Courier New" w:hAnsi="Courier New" w:hint="default"/>
+        <w:sz w:val="20"/>
+      </w:rPr>
+    </w:lvl>
+    <w:lvl w:ilvl="2" w:tentative="1">
+      <w:start w:val="1"/>
+      <w:numFmt w:val="bullet"/>
+      <w:lvlText w:val=""/>
+      <w:lvlJc w:val="left"/>
+      <w:pPr>
+        <w:tabs>
+          <w:tab w:val="num" w:pos="2160"/>
+        </w:tabs>
+        <w:ind w:left="2160" w:hanging="360"/>
+      </w:pPr>
+      <w:rPr>
+        <w:rFonts w:ascii="Wingdings" w:hAnsi="Wingdings" w:hint="default"/>
+        <w:sz w:val="20"/>
+      </w:rPr>
+    </w:lvl>
+    <w:lvl w:ilvl="3" w:tentative="1">
+      <w:start w:val="1"/>
+      <w:numFmt w:val="bullet"/>
+      <w:lvlText w:val=""/>
+      <w:lvlJc w:val="left"/>
+      <w:pPr>
+        <w:tabs>
+          <w:tab w:val="num" w:pos="2880"/>
+        </w:tabs>
+        <w:ind w:left="2880" w:hanging="360"/>
+      </w:pPr>
+      <w:rPr>
+        <w:rFonts w:ascii="Wingdings" w:hAnsi="Wingdings" w:hint="default"/>
+        <w:sz w:val="20"/>
+      </w:rPr>
+    </w:lvl>
+    <w:lvl w:ilvl="4" w:tentative="1">
+      <w:start w:val="1"/>
+      <w:numFmt w:val="bullet"/>
+      <w:lvlText w:val=""/>
+      <w:lvlJc w:val="left"/>
+      <w:pPr>
+        <w:tabs>
+          <w:tab w:val="num" w:pos="3600"/>
+        </w:tabs>
+        <w:ind w:left="3600" w:hanging="360"/>
+      </w:pPr>
+      <w:rPr>
+        <w:rFonts w:ascii="Wingdings" w:hAnsi="Wingdings" w:hint="default"/>
+        <w:sz w:val="20"/>
+      </w:rPr>
+    </w:lvl>
+    <w:lvl w:ilvl="5" w:tentative="1">
+      <w:start w:val="1"/>
+      <w:numFmt w:val="bullet"/>
+      <w:lvlText w:val=""/>
+      <w:lvlJc w:val="left"/>
+      <w:pPr>
+        <w:tabs>
+          <w:tab w:val="num" w:pos="4320"/>
+        </w:tabs>
+        <w:ind w:left="4320" w:hanging="360"/>
+      </w:pPr>
+      <w:rPr>
+        <w:rFonts w:ascii="Wingdings" w:hAnsi="Wingdings" w:hint="default"/>
+        <w:sz w:val="20"/>
+      </w:rPr>
+    </w:lvl>
+    <w:lvl w:ilvl="6" w:tentative="1">
+      <w:start w:val="1"/>
+      <w:numFmt w:val="bullet"/>
+      <w:lvlText w:val=""/>
+      <w:lvlJc w:val="left"/>
+      <w:pPr>
+        <w:tabs>
+          <w:tab w:val="num" w:pos="5040"/>
+        </w:tabs>
+        <w:ind w:left="5040" w:hanging="360"/>
+      </w:pPr>
+      <w:rPr>
+        <w:rFonts w:ascii="Wingdings" w:hAnsi="Wingdings" w:hint="default"/>
+        <w:sz w:val="20"/>
+      </w:rPr>
+    </w:lvl>
+    <w:lvl w:ilvl="7" w:tentative="1">
+      <w:start w:val="1"/>
+      <w:numFmt w:val="bullet"/>
+      <w:lvlText w:val=""/>
+      <w:lvlJc w:val="left"/>
+      <w:pPr>
+        <w:tabs>
+          <w:tab w:val="num" w:pos="5760"/>
+        </w:tabs>
+        <w:ind w:left="5760" w:hanging="360"/>
+      </w:pPr>
+      <w:rPr>
+        <w:rFonts w:ascii="Wingdings" w:hAnsi="Wingdings" w:hint="default"/>
+        <w:sz w:val="20"/>
+      </w:rPr>
+    </w:lvl>
+    <w:lvl w:ilvl="8" w:tentative="1">
+      <w:start w:val="1"/>
+      <w:numFmt w:val="bullet"/>
+      <w:lvlText w:val=""/>
+      <w:lvlJc w:val="left"/>
+      <w:pPr>
+        <w:tabs>
+          <w:tab w:val="num" w:pos="6480"/>
+        </w:tabs>
+        <w:ind w:left="6480" w:hanging="360"/>
+      </w:pPr>
+      <w:rPr>
+        <w:rFonts w:ascii="Wingdings" w:hAnsi="Wingdings" w:hint="default"/>
+        <w:sz w:val="20"/>
+      </w:rPr>
+    </w:lvl>
+  </w:abstractNum>
+  <w:abstractNum w:abstractNumId="8" w15:restartNumberingAfterBreak="0">
+    <w:nsid w:val="4D0F78B9"/>
+    <w:multiLevelType w:val="multilevel"/>
+    <w:tmpl w:val="5FB2CA74"/>
+    <w:lvl w:ilvl="0">
+      <w:start w:val="1"/>
+      <w:numFmt w:val="bullet"/>
+      <w:lvlText w:val=""/>
+      <w:lvlJc w:val="left"/>
+      <w:pPr>
+        <w:tabs>
+          <w:tab w:val="num" w:pos="720"/>
+        </w:tabs>
+        <w:ind w:left="720" w:hanging="360"/>
+      </w:pPr>
+      <w:rPr>
+        <w:rFonts w:ascii="Symbol" w:hAnsi="Symbol" w:hint="default"/>
+        <w:sz w:val="20"/>
+      </w:rPr>
+    </w:lvl>
+    <w:lvl w:ilvl="1" w:tentative="1">
+      <w:start w:val="1"/>
+      <w:numFmt w:val="bullet"/>
+      <w:lvlText w:val="o"/>
+      <w:lvlJc w:val="left"/>
+      <w:pPr>
+        <w:tabs>
+          <w:tab w:val="num" w:pos="1440"/>
+        </w:tabs>
+        <w:ind w:left="1440" w:hanging="360"/>
+      </w:pPr>
+      <w:rPr>
+        <w:rFonts w:ascii="Courier New" w:hAnsi="Courier New" w:hint="default"/>
+        <w:sz w:val="20"/>
+      </w:rPr>
+    </w:lvl>
+    <w:lvl w:ilvl="2" w:tentative="1">
+      <w:start w:val="1"/>
+      <w:numFmt w:val="bullet"/>
+      <w:lvlText w:val=""/>
+      <w:lvlJc w:val="left"/>
+      <w:pPr>
+        <w:tabs>
+          <w:tab w:val="num" w:pos="2160"/>
+        </w:tabs>
+        <w:ind w:left="2160" w:hanging="360"/>
+      </w:pPr>
+      <w:rPr>
+        <w:rFonts w:ascii="Wingdings" w:hAnsi="Wingdings" w:hint="default"/>
+        <w:sz w:val="20"/>
+      </w:rPr>
+    </w:lvl>
+    <w:lvl w:ilvl="3" w:tentative="1">
+      <w:start w:val="1"/>
+      <w:numFmt w:val="bullet"/>
+      <w:lvlText w:val=""/>
+      <w:lvlJc w:val="left"/>
+      <w:pPr>
+        <w:tabs>
+          <w:tab w:val="num" w:pos="2880"/>
+        </w:tabs>
+        <w:ind w:left="2880" w:hanging="360"/>
+      </w:pPr>
+      <w:rPr>
+        <w:rFonts w:ascii="Wingdings" w:hAnsi="Wingdings" w:hint="default"/>
+        <w:sz w:val="20"/>
+      </w:rPr>
+    </w:lvl>
+    <w:lvl w:ilvl="4" w:tentative="1">
+      <w:start w:val="1"/>
+      <w:numFmt w:val="bullet"/>
+      <w:lvlText w:val=""/>
+      <w:lvlJc w:val="left"/>
+      <w:pPr>
+        <w:tabs>
+          <w:tab w:val="num" w:pos="3600"/>
+        </w:tabs>
+        <w:ind w:left="3600" w:hanging="360"/>
+      </w:pPr>
+      <w:rPr>
+        <w:rFonts w:ascii="Wingdings" w:hAnsi="Wingdings" w:hint="default"/>
+        <w:sz w:val="20"/>
+      </w:rPr>
+    </w:lvl>
+    <w:lvl w:ilvl="5" w:tentative="1">
+      <w:start w:val="1"/>
+      <w:numFmt w:val="bullet"/>
+      <w:lvlText w:val=""/>
+      <w:lvlJc w:val="left"/>
+      <w:pPr>
+        <w:tabs>
+          <w:tab w:val="num" w:pos="4320"/>
+        </w:tabs>
+        <w:ind w:left="4320" w:hanging="360"/>
+      </w:pPr>
+      <w:rPr>
+        <w:rFonts w:ascii="Wingdings" w:hAnsi="Wingdings" w:hint="default"/>
+        <w:sz w:val="20"/>
+      </w:rPr>
+    </w:lvl>
+    <w:lvl w:ilvl="6" w:tentative="1">
+      <w:start w:val="1"/>
+      <w:numFmt w:val="bullet"/>
+      <w:lvlText w:val=""/>
+      <w:lvlJc w:val="left"/>
+      <w:pPr>
+        <w:tabs>
+          <w:tab w:val="num" w:pos="5040"/>
+        </w:tabs>
+        <w:ind w:left="5040" w:hanging="360"/>
+      </w:pPr>
+      <w:rPr>
+        <w:rFonts w:ascii="Wingdings" w:hAnsi="Wingdings" w:hint="default"/>
+        <w:sz w:val="20"/>
+      </w:rPr>
+    </w:lvl>
+    <w:lvl w:ilvl="7" w:tentative="1">
+      <w:start w:val="1"/>
+      <w:numFmt w:val="bullet"/>
+      <w:lvlText w:val=""/>
+      <w:lvlJc w:val="left"/>
+      <w:pPr>
+        <w:tabs>
+          <w:tab w:val="num" w:pos="5760"/>
+        </w:tabs>
+        <w:ind w:left="5760" w:hanging="360"/>
+      </w:pPr>
+      <w:rPr>
+        <w:rFonts w:ascii="Wingdings" w:hAnsi="Wingdings" w:hint="default"/>
+        <w:sz w:val="20"/>
+      </w:rPr>
+    </w:lvl>
+    <w:lvl w:ilvl="8" w:tentative="1">
+      <w:start w:val="1"/>
+      <w:numFmt w:val="bullet"/>
+      <w:lvlText w:val=""/>
+      <w:lvlJc w:val="left"/>
+      <w:pPr>
+        <w:tabs>
+          <w:tab w:val="num" w:pos="6480"/>
+        </w:tabs>
+        <w:ind w:left="6480" w:hanging="360"/>
+      </w:pPr>
+      <w:rPr>
+        <w:rFonts w:ascii="Wingdings" w:hAnsi="Wingdings" w:hint="default"/>
+        <w:sz w:val="20"/>
+      </w:rPr>
+    </w:lvl>
+  </w:abstractNum>
+  <w:abstractNum w:abstractNumId="9" w15:restartNumberingAfterBreak="0">
+    <w:nsid w:val="62FF2691"/>
+    <w:multiLevelType w:val="multilevel"/>
+    <w:tmpl w:val="6C72DC26"/>
+    <w:lvl w:ilvl="0">
+      <w:start w:val="1"/>
+      <w:numFmt w:val="bullet"/>
+      <w:lvlText w:val=""/>
+      <w:lvlJc w:val="left"/>
+      <w:pPr>
+        <w:tabs>
+          <w:tab w:val="num" w:pos="720"/>
+        </w:tabs>
+        <w:ind w:left="720" w:hanging="360"/>
+      </w:pPr>
+      <w:rPr>
+        <w:rFonts w:ascii="Symbol" w:hAnsi="Symbol" w:hint="default"/>
+        <w:sz w:val="20"/>
+      </w:rPr>
+    </w:lvl>
+    <w:lvl w:ilvl="1" w:tentative="1">
+      <w:start w:val="1"/>
+      <w:numFmt w:val="bullet"/>
+      <w:lvlText w:val="o"/>
+      <w:lvlJc w:val="left"/>
+      <w:pPr>
+        <w:tabs>
+          <w:tab w:val="num" w:pos="1440"/>
+        </w:tabs>
+        <w:ind w:left="1440" w:hanging="360"/>
+      </w:pPr>
+      <w:rPr>
+        <w:rFonts w:ascii="Courier New" w:hAnsi="Courier New" w:hint="default"/>
+        <w:sz w:val="20"/>
+      </w:rPr>
+    </w:lvl>
+    <w:lvl w:ilvl="2" w:tentative="1">
+      <w:start w:val="1"/>
+      <w:numFmt w:val="bullet"/>
+      <w:lvlText w:val=""/>
+      <w:lvlJc w:val="left"/>
+      <w:pPr>
+        <w:tabs>
+          <w:tab w:val="num" w:pos="2160"/>
+        </w:tabs>
+        <w:ind w:left="2160" w:hanging="360"/>
+      </w:pPr>
+      <w:rPr>
+        <w:rFonts w:ascii="Wingdings" w:hAnsi="Wingdings" w:hint="default"/>
+        <w:sz w:val="20"/>
+      </w:rPr>
+    </w:lvl>
+    <w:lvl w:ilvl="3" w:tentative="1">
+      <w:start w:val="1"/>
+      <w:numFmt w:val="bullet"/>
+      <w:lvlText w:val=""/>
+      <w:lvlJc w:val="left"/>
+      <w:pPr>
+        <w:tabs>
+          <w:tab w:val="num" w:pos="2880"/>
+        </w:tabs>
+        <w:ind w:left="2880" w:hanging="360"/>
+      </w:pPr>
+      <w:rPr>
+        <w:rFonts w:ascii="Wingdings" w:hAnsi="Wingdings" w:hint="default"/>
+        <w:sz w:val="20"/>
+      </w:rPr>
+    </w:lvl>
+    <w:lvl w:ilvl="4" w:tentative="1">
+      <w:start w:val="1"/>
+      <w:numFmt w:val="bullet"/>
+      <w:lvlText w:val=""/>
+      <w:lvlJc w:val="left"/>
+      <w:pPr>
+        <w:tabs>
+          <w:tab w:val="num" w:pos="3600"/>
+        </w:tabs>
+        <w:ind w:left="3600" w:hanging="360"/>
+      </w:pPr>
+      <w:rPr>
+        <w:rFonts w:ascii="Wingdings" w:hAnsi="Wingdings" w:hint="default"/>
+        <w:sz w:val="20"/>
+      </w:rPr>
+    </w:lvl>
+    <w:lvl w:ilvl="5" w:tentative="1">
+      <w:start w:val="1"/>
+      <w:numFmt w:val="bullet"/>
+      <w:lvlText w:val=""/>
+      <w:lvlJc w:val="left"/>
+      <w:pPr>
+        <w:tabs>
+          <w:tab w:val="num" w:pos="4320"/>
+        </w:tabs>
+        <w:ind w:left="4320" w:hanging="360"/>
+      </w:pPr>
+      <w:rPr>
+        <w:rFonts w:ascii="Wingdings" w:hAnsi="Wingdings" w:hint="default"/>
+        <w:sz w:val="20"/>
+      </w:rPr>
+    </w:lvl>
+    <w:lvl w:ilvl="6" w:tentative="1">
+      <w:start w:val="1"/>
+      <w:numFmt w:val="bullet"/>
+      <w:lvlText w:val=""/>
+      <w:lvlJc w:val="left"/>
+      <w:pPr>
+        <w:tabs>
+          <w:tab w:val="num" w:pos="5040"/>
+        </w:tabs>
+        <w:ind w:left="5040" w:hanging="360"/>
+      </w:pPr>
+      <w:rPr>
+        <w:rFonts w:ascii="Wingdings" w:hAnsi="Wingdings" w:hint="default"/>
+        <w:sz w:val="20"/>
+      </w:rPr>
+    </w:lvl>
+    <w:lvl w:ilvl="7" w:tentative="1">
+      <w:start w:val="1"/>
+      <w:numFmt w:val="bullet"/>
+      <w:lvlText w:val=""/>
+      <w:lvlJc w:val="left"/>
+      <w:pPr>
+        <w:tabs>
+          <w:tab w:val="num" w:pos="5760"/>
+        </w:tabs>
+        <w:ind w:left="5760" w:hanging="360"/>
+      </w:pPr>
+      <w:rPr>
+        <w:rFonts w:ascii="Wingdings" w:hAnsi="Wingdings" w:hint="default"/>
+        <w:sz w:val="20"/>
+      </w:rPr>
+    </w:lvl>
+    <w:lvl w:ilvl="8" w:tentative="1">
+      <w:start w:val="1"/>
+      <w:numFmt w:val="bullet"/>
+      <w:lvlText w:val=""/>
+      <w:lvlJc w:val="left"/>
+      <w:pPr>
+        <w:tabs>
+          <w:tab w:val="num" w:pos="6480"/>
+        </w:tabs>
+        <w:ind w:left="6480" w:hanging="360"/>
+      </w:pPr>
+      <w:rPr>
+        <w:rFonts w:ascii="Wingdings" w:hAnsi="Wingdings" w:hint="default"/>
+        <w:sz w:val="20"/>
+      </w:rPr>
+    </w:lvl>
+  </w:abstractNum>
+  <w:abstractNum w:abstractNumId="10" w15:restartNumberingAfterBreak="0">
+    <w:nsid w:val="67B9715A"/>
+    <w:multiLevelType w:val="multilevel"/>
+    <w:tmpl w:val="C6D09CBE"/>
+    <w:lvl w:ilvl="0">
+      <w:start w:val="1"/>
+      <w:numFmt w:val="bullet"/>
+      <w:lvlText w:val=""/>
+      <w:lvlJc w:val="left"/>
+      <w:pPr>
+        <w:tabs>
+          <w:tab w:val="num" w:pos="720"/>
+        </w:tabs>
+        <w:ind w:left="720" w:hanging="360"/>
+      </w:pPr>
+      <w:rPr>
+        <w:rFonts w:ascii="Symbol" w:hAnsi="Symbol" w:hint="default"/>
+        <w:sz w:val="20"/>
+      </w:rPr>
+    </w:lvl>
+    <w:lvl w:ilvl="1" w:tentative="1">
+      <w:start w:val="1"/>
+      <w:numFmt w:val="bullet"/>
+      <w:lvlText w:val="o"/>
+      <w:lvlJc w:val="left"/>
+      <w:pPr>
+        <w:tabs>
+          <w:tab w:val="num" w:pos="1440"/>
+        </w:tabs>
+        <w:ind w:left="1440" w:hanging="360"/>
+      </w:pPr>
+      <w:rPr>
+        <w:rFonts w:ascii="Courier New" w:hAnsi="Courier New" w:hint="default"/>
+        <w:sz w:val="20"/>
+      </w:rPr>
+    </w:lvl>
+    <w:lvl w:ilvl="2" w:tentative="1">
+      <w:start w:val="1"/>
+      <w:numFmt w:val="bullet"/>
+      <w:lvlText w:val=""/>
+      <w:lvlJc w:val="left"/>
+      <w:pPr>
+        <w:tabs>
+          <w:tab w:val="num" w:pos="2160"/>
+        </w:tabs>
+        <w:ind w:left="2160" w:hanging="360"/>
+      </w:pPr>
+      <w:rPr>
+        <w:rFonts w:ascii="Wingdings" w:hAnsi="Wingdings" w:hint="default"/>
+        <w:sz w:val="20"/>
+      </w:rPr>
+    </w:lvl>
+    <w:lvl w:ilvl="3" w:tentative="1">
+      <w:start w:val="1"/>
+      <w:numFmt w:val="bullet"/>
+      <w:lvlText w:val=""/>
+      <w:lvlJc w:val="left"/>
+      <w:pPr>
+        <w:tabs>
+          <w:tab w:val="num" w:pos="2880"/>
+        </w:tabs>
+        <w:ind w:left="2880" w:hanging="360"/>
+      </w:pPr>
+      <w:rPr>
+        <w:rFonts w:ascii="Wingdings" w:hAnsi="Wingdings" w:hint="default"/>
+        <w:sz w:val="20"/>
+      </w:rPr>
+    </w:lvl>
+    <w:lvl w:ilvl="4" w:tentative="1">
+      <w:start w:val="1"/>
+      <w:numFmt w:val="bullet"/>
+      <w:lvlText w:val=""/>
+      <w:lvlJc w:val="left"/>
+      <w:pPr>
+        <w:tabs>
+          <w:tab w:val="num" w:pos="3600"/>
+        </w:tabs>
+        <w:ind w:left="3600" w:hanging="360"/>
+      </w:pPr>
+      <w:rPr>
+        <w:rFonts w:ascii="Wingdings" w:hAnsi="Wingdings" w:hint="default"/>
+        <w:sz w:val="20"/>
+      </w:rPr>
+    </w:lvl>
+    <w:lvl w:ilvl="5" w:tentative="1">
+      <w:start w:val="1"/>
+      <w:numFmt w:val="bullet"/>
+      <w:lvlText w:val=""/>
+      <w:lvlJc w:val="left"/>
+      <w:pPr>
+        <w:tabs>
+          <w:tab w:val="num" w:pos="4320"/>
+        </w:tabs>
+        <w:ind w:left="4320" w:hanging="360"/>
+      </w:pPr>
+      <w:rPr>
+        <w:rFonts w:ascii="Wingdings" w:hAnsi="Wingdings" w:hint="default"/>
+        <w:sz w:val="20"/>
+      </w:rPr>
+    </w:lvl>
+    <w:lvl w:ilvl="6" w:tentative="1">
+      <w:start w:val="1"/>
+      <w:numFmt w:val="bullet"/>
+      <w:lvlText w:val=""/>
+      <w:lvlJc w:val="left"/>
+      <w:pPr>
+        <w:tabs>
+          <w:tab w:val="num" w:pos="5040"/>
+        </w:tabs>
+        <w:ind w:left="5040" w:hanging="360"/>
+      </w:pPr>
+      <w:rPr>
+        <w:rFonts w:ascii="Wingdings" w:hAnsi="Wingdings" w:hint="default"/>
+        <w:sz w:val="20"/>
+      </w:rPr>
+    </w:lvl>
+    <w:lvl w:ilvl="7" w:tentative="1">
+      <w:start w:val="1"/>
+      <w:numFmt w:val="bullet"/>
+      <w:lvlText w:val=""/>
+      <w:lvlJc w:val="left"/>
+      <w:pPr>
+        <w:tabs>
+          <w:tab w:val="num" w:pos="5760"/>
+        </w:tabs>
+        <w:ind w:left="5760" w:hanging="360"/>
+      </w:pPr>
+      <w:rPr>
+        <w:rFonts w:ascii="Wingdings" w:hAnsi="Wingdings" w:hint="default"/>
+        <w:sz w:val="20"/>
+      </w:rPr>
+    </w:lvl>
+    <w:lvl w:ilvl="8" w:tentative="1">
+      <w:start w:val="1"/>
+      <w:numFmt w:val="bullet"/>
+      <w:lvlText w:val=""/>
+      <w:lvlJc w:val="left"/>
+      <w:pPr>
+        <w:tabs>
+          <w:tab w:val="num" w:pos="6480"/>
+        </w:tabs>
+        <w:ind w:left="6480" w:hanging="360"/>
+      </w:pPr>
+      <w:rPr>
+        <w:rFonts w:ascii="Wingdings" w:hAnsi="Wingdings" w:hint="default"/>
+        <w:sz w:val="20"/>
+      </w:rPr>
+    </w:lvl>
+  </w:abstractNum>
+  <w:abstractNum w:abstractNumId="11" w15:restartNumberingAfterBreak="0">
+    <w:nsid w:val="6F5D1DC0"/>
+    <w:multiLevelType w:val="multilevel"/>
+    <w:tmpl w:val="F0EAE7BE"/>
+    <w:lvl w:ilvl="0">
+      <w:start w:val="1"/>
+      <w:numFmt w:val="bullet"/>
+      <w:lvlText w:val=""/>
+      <w:lvlJc w:val="left"/>
+      <w:pPr>
+        <w:tabs>
+          <w:tab w:val="num" w:pos="720"/>
+        </w:tabs>
+        <w:ind w:left="720" w:hanging="360"/>
+      </w:pPr>
+      <w:rPr>
+        <w:rFonts w:ascii="Symbol" w:hAnsi="Symbol" w:hint="default"/>
+        <w:sz w:val="20"/>
+      </w:rPr>
+    </w:lvl>
+    <w:lvl w:ilvl="1" w:tentative="1">
+      <w:start w:val="1"/>
+      <w:numFmt w:val="bullet"/>
+      <w:lvlText w:val="o"/>
+      <w:lvlJc w:val="left"/>
+      <w:pPr>
+        <w:tabs>
+          <w:tab w:val="num" w:pos="1440"/>
+        </w:tabs>
+        <w:ind w:left="1440" w:hanging="360"/>
+      </w:pPr>
+      <w:rPr>
+        <w:rFonts w:ascii="Courier New" w:hAnsi="Courier New" w:hint="default"/>
+        <w:sz w:val="20"/>
+      </w:rPr>
+    </w:lvl>
+    <w:lvl w:ilvl="2" w:tentative="1">
+      <w:start w:val="1"/>
+      <w:numFmt w:val="bullet"/>
+      <w:lvlText w:val=""/>
+      <w:lvlJc w:val="left"/>
+      <w:pPr>
+        <w:tabs>
+          <w:tab w:val="num" w:pos="2160"/>
+        </w:tabs>
+        <w:ind w:left="2160" w:hanging="360"/>
+      </w:pPr>
+      <w:rPr>
+        <w:rFonts w:ascii="Wingdings" w:hAnsi="Wingdings" w:hint="default"/>
+        <w:sz w:val="20"/>
+      </w:rPr>
+    </w:lvl>
+    <w:lvl w:ilvl="3" w:tentative="1">
+      <w:start w:val="1"/>
+      <w:numFmt w:val="bullet"/>
+      <w:lvlText w:val=""/>
+      <w:lvlJc w:val="left"/>
+      <w:pPr>
+        <w:tabs>
+          <w:tab w:val="num" w:pos="2880"/>
+        </w:tabs>
+        <w:ind w:left="2880" w:hanging="360"/>
+      </w:pPr>
+      <w:rPr>
+        <w:rFonts w:ascii="Wingdings" w:hAnsi="Wingdings" w:hint="default"/>
+        <w:sz w:val="20"/>
+      </w:rPr>
+    </w:lvl>
+    <w:lvl w:ilvl="4" w:tentative="1">
+      <w:start w:val="1"/>
+      <w:numFmt w:val="bullet"/>
+      <w:lvlText w:val=""/>
+      <w:lvlJc w:val="left"/>
+      <w:pPr>
+        <w:tabs>
+          <w:tab w:val="num" w:pos="3600"/>
+        </w:tabs>
+        <w:ind w:left="3600" w:hanging="360"/>
+      </w:pPr>
+      <w:rPr>
+        <w:rFonts w:ascii="Wingdings" w:hAnsi="Wingdings" w:hint="default"/>
+        <w:sz w:val="20"/>
+      </w:rPr>
+    </w:lvl>
+    <w:lvl w:ilvl="5" w:tentative="1">
+      <w:start w:val="1"/>
+      <w:numFmt w:val="bullet"/>
+      <w:lvlText w:val=""/>
+      <w:lvlJc w:val="left"/>
+      <w:pPr>
+        <w:tabs>
+          <w:tab w:val="num" w:pos="4320"/>
+        </w:tabs>
+        <w:ind w:left="4320" w:hanging="360"/>
+      </w:pPr>
+      <w:rPr>
+        <w:rFonts w:ascii="Wingdings" w:hAnsi="Wingdings" w:hint="default"/>
+        <w:sz w:val="20"/>
+      </w:rPr>
+    </w:lvl>
+    <w:lvl w:ilvl="6" w:tentative="1">
+      <w:start w:val="1"/>
+      <w:numFmt w:val="bullet"/>
+      <w:lvlText w:val=""/>
+      <w:lvlJc w:val="left"/>
+      <w:pPr>
+        <w:tabs>
+          <w:tab w:val="num" w:pos="5040"/>
+        </w:tabs>
+        <w:ind w:left="5040" w:hanging="360"/>
+      </w:pPr>
+      <w:rPr>
+        <w:rFonts w:ascii="Wingdings" w:hAnsi="Wingdings" w:hint="default"/>
+        <w:sz w:val="20"/>
+      </w:rPr>
+    </w:lvl>
+    <w:lvl w:ilvl="7" w:tentative="1">
+      <w:start w:val="1"/>
+      <w:numFmt w:val="bullet"/>
+      <w:lvlText w:val=""/>
+      <w:lvlJc w:val="left"/>
+      <w:pPr>
+        <w:tabs>
+          <w:tab w:val="num" w:pos="5760"/>
+        </w:tabs>
+        <w:ind w:left="5760" w:hanging="360"/>
+      </w:pPr>
+      <w:rPr>
+        <w:rFonts w:ascii="Wingdings" w:hAnsi="Wingdings" w:hint="default"/>
+        <w:sz w:val="20"/>
+      </w:rPr>
+    </w:lvl>
+    <w:lvl w:ilvl="8" w:tentative="1">
+      <w:start w:val="1"/>
+      <w:numFmt w:val="bullet"/>
+      <w:lvlText w:val=""/>
+      <w:lvlJc w:val="left"/>
+      <w:pPr>
+        <w:tabs>
+          <w:tab w:val="num" w:pos="6480"/>
+        </w:tabs>
+        <w:ind w:left="6480" w:hanging="360"/>
+      </w:pPr>
+      <w:rPr>
+        <w:rFonts w:ascii="Wingdings" w:hAnsi="Wingdings" w:hint="default"/>
+        <w:sz w:val="20"/>
+      </w:rPr>
+    </w:lvl>
+  </w:abstractNum>
+  <w:abstractNum w:abstractNumId="12" w15:restartNumberingAfterBreak="0">
+    <w:nsid w:val="70CC1710"/>
+    <w:multiLevelType w:val="multilevel"/>
+    <w:tmpl w:val="03706112"/>
+    <w:lvl w:ilvl="0">
+      <w:start w:val="1"/>
+      <w:numFmt w:val="bullet"/>
+      <w:lvlText w:val=""/>
+      <w:lvlJc w:val="left"/>
+      <w:pPr>
+        <w:tabs>
+          <w:tab w:val="num" w:pos="720"/>
+        </w:tabs>
+        <w:ind w:left="720" w:hanging="360"/>
+      </w:pPr>
+      <w:rPr>
+        <w:rFonts w:ascii="Symbol" w:hAnsi="Symbol" w:hint="default"/>
+        <w:sz w:val="20"/>
+      </w:rPr>
+    </w:lvl>
+    <w:lvl w:ilvl="1" w:tentative="1">
+      <w:start w:val="1"/>
+      <w:numFmt w:val="bullet"/>
+      <w:lvlText w:val="o"/>
+      <w:lvlJc w:val="left"/>
+      <w:pPr>
+        <w:tabs>
+          <w:tab w:val="num" w:pos="1440"/>
+        </w:tabs>
+        <w:ind w:left="1440" w:hanging="360"/>
+      </w:pPr>
+      <w:rPr>
+        <w:rFonts w:ascii="Courier New" w:hAnsi="Courier New" w:hint="default"/>
+        <w:sz w:val="20"/>
+      </w:rPr>
+    </w:lvl>
+    <w:lvl w:ilvl="2" w:tentative="1">
+      <w:start w:val="1"/>
+      <w:numFmt w:val="bullet"/>
+      <w:lvlText w:val=""/>
+      <w:lvlJc w:val="left"/>
+      <w:pPr>
+        <w:tabs>
+          <w:tab w:val="num" w:pos="2160"/>
+        </w:tabs>
+        <w:ind w:left="2160" w:hanging="360"/>
+      </w:pPr>
+      <w:rPr>
+        <w:rFonts w:ascii="Wingdings" w:hAnsi="Wingdings" w:hint="default"/>
+        <w:sz w:val="20"/>
+      </w:rPr>
+    </w:lvl>
+    <w:lvl w:ilvl="3" w:tentative="1">
+      <w:start w:val="1"/>
+      <w:numFmt w:val="bullet"/>
+      <w:lvlText w:val=""/>
+      <w:lvlJc w:val="left"/>
+      <w:pPr>
+        <w:tabs>
+          <w:tab w:val="num" w:pos="2880"/>
+        </w:tabs>
+        <w:ind w:left="2880" w:hanging="360"/>
+      </w:pPr>
+      <w:rPr>
+        <w:rFonts w:ascii="Wingdings" w:hAnsi="Wingdings" w:hint="default"/>
+        <w:sz w:val="20"/>
+      </w:rPr>
+    </w:lvl>
+    <w:lvl w:ilvl="4" w:tentative="1">
+      <w:start w:val="1"/>
+      <w:numFmt w:val="bullet"/>
+      <w:lvlText w:val=""/>
+      <w:lvlJc w:val="left"/>
+      <w:pPr>
+        <w:tabs>
+          <w:tab w:val="num" w:pos="3600"/>
+        </w:tabs>
+        <w:ind w:left="3600" w:hanging="360"/>
+      </w:pPr>
+      <w:rPr>
+        <w:rFonts w:ascii="Wingdings" w:hAnsi="Wingdings" w:hint="default"/>
+        <w:sz w:val="20"/>
+      </w:rPr>
+    </w:lvl>
+    <w:lvl w:ilvl="5" w:tentative="1">
+      <w:start w:val="1"/>
+      <w:numFmt w:val="bullet"/>
+      <w:lvlText w:val=""/>
+      <w:lvlJc w:val="left"/>
+      <w:pPr>
+        <w:tabs>
+          <w:tab w:val="num" w:pos="4320"/>
+        </w:tabs>
+        <w:ind w:left="4320" w:hanging="360"/>
+      </w:pPr>
+      <w:rPr>
+        <w:rFonts w:ascii="Wingdings" w:hAnsi="Wingdings" w:hint="default"/>
+        <w:sz w:val="20"/>
+      </w:rPr>
+    </w:lvl>
+    <w:lvl w:ilvl="6" w:tentative="1">
+      <w:start w:val="1"/>
+      <w:numFmt w:val="bullet"/>
+      <w:lvlText w:val=""/>
+      <w:lvlJc w:val="left"/>
+      <w:pPr>
+        <w:tabs>
+          <w:tab w:val="num" w:pos="5040"/>
+        </w:tabs>
+        <w:ind w:left="5040" w:hanging="360"/>
+      </w:pPr>
+      <w:rPr>
+        <w:rFonts w:ascii="Wingdings" w:hAnsi="Wingdings" w:hint="default"/>
+        <w:sz w:val="20"/>
+      </w:rPr>
+    </w:lvl>
+    <w:lvl w:ilvl="7" w:tentative="1">
+      <w:start w:val="1"/>
+      <w:numFmt w:val="bullet"/>
+      <w:lvlText w:val=""/>
+      <w:lvlJc w:val="left"/>
+      <w:pPr>
+        <w:tabs>
+          <w:tab w:val="num" w:pos="5760"/>
+        </w:tabs>
+        <w:ind w:left="5760" w:hanging="360"/>
+      </w:pPr>
+      <w:rPr>
+        <w:rFonts w:ascii="Wingdings" w:hAnsi="Wingdings" w:hint="default"/>
+        <w:sz w:val="20"/>
+      </w:rPr>
+    </w:lvl>
+    <w:lvl w:ilvl="8" w:tentative="1">
+      <w:start w:val="1"/>
+      <w:numFmt w:val="bullet"/>
+      <w:lvlText w:val=""/>
+      <w:lvlJc w:val="left"/>
+      <w:pPr>
+        <w:tabs>
+          <w:tab w:val="num" w:pos="6480"/>
+        </w:tabs>
+        <w:ind w:left="6480" w:hanging="360"/>
+      </w:pPr>
+      <w:rPr>
+        <w:rFonts w:ascii="Wingdings" w:hAnsi="Wingdings" w:hint="default"/>
+        <w:sz w:val="20"/>
+      </w:rPr>
+    </w:lvl>
+  </w:abstractNum>
+  <w:abstractNum w:abstractNumId="13" w15:restartNumberingAfterBreak="0">
+    <w:nsid w:val="789667EE"/>
+    <w:multiLevelType w:val="multilevel"/>
+    <w:tmpl w:val="BF9C3714"/>
+    <w:lvl w:ilvl="0">
+      <w:start w:val="1"/>
+      <w:numFmt w:val="bullet"/>
+      <w:lvlText w:val=""/>
+      <w:lvlJc w:val="left"/>
+      <w:pPr>
+        <w:tabs>
+          <w:tab w:val="num" w:pos="720"/>
+        </w:tabs>
+        <w:ind w:left="720" w:hanging="360"/>
+      </w:pPr>
+      <w:rPr>
+        <w:rFonts w:ascii="Symbol" w:hAnsi="Symbol" w:hint="default"/>
+        <w:sz w:val="20"/>
+      </w:rPr>
+    </w:lvl>
+    <w:lvl w:ilvl="1" w:tentative="1">
+      <w:start w:val="1"/>
+      <w:numFmt w:val="bullet"/>
+      <w:lvlText w:val="o"/>
+      <w:lvlJc w:val="left"/>
+      <w:pPr>
+        <w:tabs>
+          <w:tab w:val="num" w:pos="1440"/>
+        </w:tabs>
+        <w:ind w:left="1440" w:hanging="360"/>
+      </w:pPr>
+      <w:rPr>
+        <w:rFonts w:ascii="Courier New" w:hAnsi="Courier New" w:hint="default"/>
+        <w:sz w:val="20"/>
+      </w:rPr>
+    </w:lvl>
+    <w:lvl w:ilvl="2" w:tentative="1">
+      <w:start w:val="1"/>
+      <w:numFmt w:val="bullet"/>
+      <w:lvlText w:val=""/>
+      <w:lvlJc w:val="left"/>
+      <w:pPr>
+        <w:tabs>
+          <w:tab w:val="num" w:pos="2160"/>
+        </w:tabs>
+        <w:ind w:left="2160" w:hanging="360"/>
+      </w:pPr>
+      <w:rPr>
+        <w:rFonts w:ascii="Wingdings" w:hAnsi="Wingdings" w:hint="default"/>
+        <w:sz w:val="20"/>
+      </w:rPr>
+    </w:lvl>
+    <w:lvl w:ilvl="3" w:tentative="1">
+      <w:start w:val="1"/>
+      <w:numFmt w:val="bullet"/>
+      <w:lvlText w:val=""/>
+      <w:lvlJc w:val="left"/>
+      <w:pPr>
+        <w:tabs>
+          <w:tab w:val="num" w:pos="2880"/>
+        </w:tabs>
+        <w:ind w:left="2880" w:hanging="360"/>
+      </w:pPr>
+      <w:rPr>
+        <w:rFonts w:ascii="Wingdings" w:hAnsi="Wingdings" w:hint="default"/>
+        <w:sz w:val="20"/>
+      </w:rPr>
+    </w:lvl>
+    <w:lvl w:ilvl="4" w:tentative="1">
+      <w:start w:val="1"/>
+      <w:numFmt w:val="bullet"/>
+      <w:lvlText w:val=""/>
+      <w:lvlJc w:val="left"/>
+      <w:pPr>
+        <w:tabs>
+          <w:tab w:val="num" w:pos="3600"/>
+        </w:tabs>
+        <w:ind w:left="3600" w:hanging="360"/>
+      </w:pPr>
+      <w:rPr>
+        <w:rFonts w:ascii="Wingdings" w:hAnsi="Wingdings" w:hint="default"/>
+        <w:sz w:val="20"/>
+      </w:rPr>
+    </w:lvl>
+    <w:lvl w:ilvl="5" w:tentative="1">
+      <w:start w:val="1"/>
+      <w:numFmt w:val="bullet"/>
+      <w:lvlText w:val=""/>
+      <w:lvlJc w:val="left"/>
+      <w:pPr>
+        <w:tabs>
+          <w:tab w:val="num" w:pos="4320"/>
+        </w:tabs>
+        <w:ind w:left="4320" w:hanging="360"/>
+      </w:pPr>
+      <w:rPr>
+        <w:rFonts w:ascii="Wingdings" w:hAnsi="Wingdings" w:hint="default"/>
+        <w:sz w:val="20"/>
+      </w:rPr>
+    </w:lvl>
+    <w:lvl w:ilvl="6" w:tentative="1">
+      <w:start w:val="1"/>
+      <w:numFmt w:val="bullet"/>
+      <w:lvlText w:val=""/>
+      <w:lvlJc w:val="left"/>
+      <w:pPr>
+        <w:tabs>
+          <w:tab w:val="num" w:pos="5040"/>
+        </w:tabs>
+        <w:ind w:left="5040" w:hanging="360"/>
+      </w:pPr>
+      <w:rPr>
+        <w:rFonts w:ascii="Wingdings" w:hAnsi="Wingdings" w:hint="default"/>
+        <w:sz w:val="20"/>
+      </w:rPr>
+    </w:lvl>
+    <w:lvl w:ilvl="7" w:tentative="1">
+      <w:start w:val="1"/>
+      <w:numFmt w:val="bullet"/>
+      <w:lvlText w:val=""/>
+      <w:lvlJc w:val="left"/>
+      <w:pPr>
+        <w:tabs>
+          <w:tab w:val="num" w:pos="5760"/>
+        </w:tabs>
+        <w:ind w:left="5760" w:hanging="360"/>
+      </w:pPr>
+      <w:rPr>
+        <w:rFonts w:ascii="Wingdings" w:hAnsi="Wingdings" w:hint="default"/>
+        <w:sz w:val="20"/>
+      </w:rPr>
+    </w:lvl>
+    <w:lvl w:ilvl="8" w:tentative="1">
+      <w:start w:val="1"/>
+      <w:numFmt w:val="bullet"/>
+      <w:lvlText w:val=""/>
+      <w:lvlJc w:val="left"/>
+      <w:pPr>
+        <w:tabs>
+          <w:tab w:val="num" w:pos="6480"/>
+        </w:tabs>
+        <w:ind w:left="6480" w:hanging="360"/>
+      </w:pPr>
+      <w:rPr>
+        <w:rFonts w:ascii="Wingdings" w:hAnsi="Wingdings" w:hint="default"/>
+        <w:sz w:val="20"/>
+      </w:rPr>
+    </w:lvl>
+  </w:abstractNum>
+  <w:abstractNum w:abstractNumId="14" w15:restartNumberingAfterBreak="0">
+    <w:nsid w:val="7BB403BB"/>
+    <w:multiLevelType w:val="multilevel"/>
+    <w:tmpl w:val="738EAC5E"/>
+    <w:lvl w:ilvl="0">
+      <w:start w:val="1"/>
+      <w:numFmt w:val="decimal"/>
+      <w:lvlText w:val="%1."/>
+      <w:lvlJc w:val="left"/>
+      <w:pPr>
+        <w:tabs>
+          <w:tab w:val="num" w:pos="720"/>
+        </w:tabs>
+        <w:ind w:left="720" w:hanging="360"/>
+      </w:pPr>
+    </w:lvl>
+    <w:lvl w:ilvl="1" w:tentative="1">
+      <w:start w:val="1"/>
+      <w:numFmt w:val="decimal"/>
+      <w:lvlText w:val="%2."/>
+      <w:lvlJc w:val="left"/>
+      <w:pPr>
+        <w:tabs>
+          <w:tab w:val="num" w:pos="1440"/>
+        </w:tabs>
+        <w:ind w:left="1440" w:hanging="360"/>
+      </w:pPr>
+    </w:lvl>
+    <w:lvl w:ilvl="2" w:tentative="1">
+      <w:start w:val="1"/>
+      <w:numFmt w:val="decimal"/>
+      <w:lvlText w:val="%3."/>
+      <w:lvlJc w:val="left"/>
+      <w:pPr>
+        <w:tabs>
+          <w:tab w:val="num" w:pos="2160"/>
+        </w:tabs>
+        <w:ind w:left="2160" w:hanging="360"/>
+      </w:pPr>
+    </w:lvl>
+    <w:lvl w:ilvl="3" w:tentative="1">
+      <w:start w:val="1"/>
+      <w:numFmt w:val="decimal"/>
+      <w:lvlText w:val="%4."/>
+      <w:lvlJc w:val="left"/>
+      <w:pPr>
+        <w:tabs>
+          <w:tab w:val="num" w:pos="2880"/>
+        </w:tabs>
+        <w:ind w:left="2880" w:hanging="360"/>
+      </w:pPr>
+    </w:lvl>
+    <w:lvl w:ilvl="4" w:tentative="1">
+      <w:start w:val="1"/>
+      <w:numFmt w:val="decimal"/>
+      <w:lvlText w:val="%5."/>
+      <w:lvlJc w:val="left"/>
+      <w:pPr>
+        <w:tabs>
+          <w:tab w:val="num" w:pos="3600"/>
+        </w:tabs>
+        <w:ind w:left="3600" w:hanging="360"/>
+      </w:pPr>
+    </w:lvl>
+    <w:lvl w:ilvl="5" w:tentative="1">
+      <w:start w:val="1"/>
+      <w:numFmt w:val="decimal"/>
+      <w:lvlText w:val="%6."/>
+      <w:lvlJc w:val="left"/>
+      <w:pPr>
+        <w:tabs>
+          <w:tab w:val="num" w:pos="4320"/>
+        </w:tabs>
+        <w:ind w:left="4320" w:hanging="360"/>
+      </w:pPr>
+    </w:lvl>
+    <w:lvl w:ilvl="6" w:tentative="1">
+      <w:start w:val="1"/>
+      <w:numFmt w:val="decimal"/>
+      <w:lvlText w:val="%7."/>
+      <w:lvlJc w:val="left"/>
+      <w:pPr>
+        <w:tabs>
+          <w:tab w:val="num" w:pos="5040"/>
+        </w:tabs>
+        <w:ind w:left="5040" w:hanging="360"/>
+      </w:pPr>
+    </w:lvl>
+    <w:lvl w:ilvl="7" w:tentative="1">
+      <w:start w:val="1"/>
+      <w:numFmt w:val="decimal"/>
+      <w:lvlText w:val="%8."/>
+      <w:lvlJc w:val="left"/>
+      <w:pPr>
+        <w:tabs>
+          <w:tab w:val="num" w:pos="5760"/>
+        </w:tabs>
+        <w:ind w:left="5760" w:hanging="360"/>
+      </w:pPr>
+    </w:lvl>
+    <w:lvl w:ilvl="8" w:tentative="1">
+      <w:start w:val="1"/>
+      <w:numFmt w:val="decimal"/>
+      <w:lvlText w:val="%9."/>
+      <w:lvlJc w:val="left"/>
+      <w:pPr>
+        <w:tabs>
+          <w:tab w:val="num" w:pos="6480"/>
+        </w:tabs>
+        <w:ind w:left="6480" w:hanging="360"/>
+      </w:pPr>
+    </w:lvl>
+  </w:abstractNum>
+  <w:num w:numId="1">
+    <w:abstractNumId w:val="8"/>
+  </w:num>
+  <w:num w:numId="2">
+    <w:abstractNumId w:val="3"/>
+  </w:num>
+  <w:num w:numId="3">
+    <w:abstractNumId w:val="4"/>
+  </w:num>
+  <w:num w:numId="4">
+    <w:abstractNumId w:val="11"/>
+  </w:num>
+  <w:num w:numId="5">
+    <w:abstractNumId w:val="2"/>
+  </w:num>
+  <w:num w:numId="6">
+    <w:abstractNumId w:val="12"/>
+  </w:num>
+  <w:num w:numId="7">
+    <w:abstractNumId w:val="6"/>
+  </w:num>
+  <w:num w:numId="8">
+    <w:abstractNumId w:val="13"/>
+  </w:num>
+  <w:num w:numId="9">
+    <w:abstractNumId w:val="5"/>
+  </w:num>
+  <w:num w:numId="10">
+    <w:abstractNumId w:val="10"/>
+  </w:num>
+  <w:num w:numId="11">
+    <w:abstractNumId w:val="7"/>
+  </w:num>
+  <w:num w:numId="12">
+    <w:abstractNumId w:val="9"/>
+  </w:num>
+  <w:num w:numId="13">
+    <w:abstractNumId w:val="0"/>
+  </w:num>
+  <w:num w:numId="14">
+    <w:abstractNumId w:val="14"/>
+  </w:num>
+  <w:num w:numId="15">
+    <w:abstractNumId w:val="1"/>
+  </w:num>
+</w:numbering>
 </file>
 
 <file path=word/styles.xml><?xml version="1.0" encoding="utf-8"?>
@@ -3302,6 +7127,68 @@
       <w:spacing w:line="256" w:lineRule="auto"/>
     </w:pPr>
   </w:style>
+  <w:style w:type="paragraph" w:styleId="Heading1">
+    <w:name w:val="heading 1"/>
+    <w:basedOn w:val="Normal"/>
+    <w:link w:val="Heading1Char"/>
+    <w:uiPriority w:val="9"/>
+    <w:qFormat/>
+    <w:rsid w:val="00E31E78"/>
+    <w:pPr>
+      <w:spacing w:before="100" w:beforeAutospacing="1" w:after="100" w:afterAutospacing="1" w:line="240" w:lineRule="auto"/>
+      <w:outlineLvl w:val="0"/>
+    </w:pPr>
+    <w:rPr>
+      <w:rFonts w:ascii="Times New Roman" w:eastAsia="Times New Roman" w:hAnsi="Times New Roman" w:cs="Times New Roman"/>
+      <w:b/>
+      <w:bCs/>
+      <w:kern w:val="36"/>
+      <w:sz w:val="48"/>
+      <w:szCs w:val="48"/>
+    </w:rPr>
+  </w:style>
+  <w:style w:type="paragraph" w:styleId="Heading2">
+    <w:name w:val="heading 2"/>
+    <w:basedOn w:val="Normal"/>
+    <w:link w:val="Heading2Char"/>
+    <w:uiPriority w:val="9"/>
+    <w:qFormat/>
+    <w:rsid w:val="00E31E78"/>
+    <w:pPr>
+      <w:spacing w:before="100" w:beforeAutospacing="1" w:after="100" w:afterAutospacing="1" w:line="240" w:lineRule="auto"/>
+      <w:outlineLvl w:val="1"/>
+    </w:pPr>
+    <w:rPr>
+      <w:rFonts w:ascii="Times New Roman" w:eastAsia="Times New Roman" w:hAnsi="Times New Roman" w:cs="Times New Roman"/>
+      <w:b/>
+      <w:bCs/>
+      <w:sz w:val="36"/>
+      <w:szCs w:val="36"/>
+    </w:rPr>
+  </w:style>
+  <w:style w:type="paragraph" w:styleId="Heading3">
+    <w:name w:val="heading 3"/>
+    <w:basedOn w:val="Normal"/>
+    <w:next w:val="Normal"/>
+    <w:link w:val="Heading3Char"/>
+    <w:uiPriority w:val="9"/>
+    <w:semiHidden/>
+    <w:unhideWhenUsed/>
+    <w:qFormat/>
+    <w:rsid w:val="00E31E78"/>
+    <w:pPr>
+      <w:keepNext/>
+      <w:keepLines/>
+      <w:spacing w:before="40" w:after="0"/>
+      <w:outlineLvl w:val="2"/>
+    </w:pPr>
+    <w:rPr>
+      <w:rFonts w:asciiTheme="majorHAnsi" w:eastAsiaTheme="majorEastAsia" w:hAnsiTheme="majorHAnsi" w:cstheme="majorBidi"/>
+      <w:color w:val="1F4D78" w:themeColor="accent1" w:themeShade="7F"/>
+      <w:sz w:val="24"/>
+      <w:szCs w:val="24"/>
+    </w:rPr>
+  </w:style>
   <w:style w:type="character" w:default="1" w:styleId="DefaultParagraphFont">
     <w:name w:val="Default Paragraph Font"/>
     <w:uiPriority w:val="1"/>
@@ -3343,6 +7230,89 @@
       <w:color w:val="000000"/>
       <w:sz w:val="24"/>
       <w:szCs w:val="24"/>
+    </w:rPr>
+  </w:style>
+  <w:style w:type="character" w:customStyle="1" w:styleId="Heading1Char">
+    <w:name w:val="Heading 1 Char"/>
+    <w:basedOn w:val="DefaultParagraphFont"/>
+    <w:link w:val="Heading1"/>
+    <w:uiPriority w:val="9"/>
+    <w:rsid w:val="00E31E78"/>
+    <w:rPr>
+      <w:rFonts w:ascii="Times New Roman" w:eastAsia="Times New Roman" w:hAnsi="Times New Roman" w:cs="Times New Roman"/>
+      <w:b/>
+      <w:bCs/>
+      <w:kern w:val="36"/>
+      <w:sz w:val="48"/>
+      <w:szCs w:val="48"/>
+    </w:rPr>
+  </w:style>
+  <w:style w:type="character" w:customStyle="1" w:styleId="Heading2Char">
+    <w:name w:val="Heading 2 Char"/>
+    <w:basedOn w:val="DefaultParagraphFont"/>
+    <w:link w:val="Heading2"/>
+    <w:uiPriority w:val="9"/>
+    <w:rsid w:val="00E31E78"/>
+    <w:rPr>
+      <w:rFonts w:ascii="Times New Roman" w:eastAsia="Times New Roman" w:hAnsi="Times New Roman" w:cs="Times New Roman"/>
+      <w:b/>
+      <w:bCs/>
+      <w:sz w:val="36"/>
+      <w:szCs w:val="36"/>
+    </w:rPr>
+  </w:style>
+  <w:style w:type="paragraph" w:styleId="NormalWeb">
+    <w:name w:val="Normal (Web)"/>
+    <w:basedOn w:val="Normal"/>
+    <w:uiPriority w:val="99"/>
+    <w:semiHidden/>
+    <w:unhideWhenUsed/>
+    <w:rsid w:val="00E31E78"/>
+    <w:pPr>
+      <w:spacing w:before="100" w:beforeAutospacing="1" w:after="100" w:afterAutospacing="1" w:line="240" w:lineRule="auto"/>
+    </w:pPr>
+    <w:rPr>
+      <w:rFonts w:ascii="Times New Roman" w:eastAsia="Times New Roman" w:hAnsi="Times New Roman" w:cs="Times New Roman"/>
+      <w:sz w:val="24"/>
+      <w:szCs w:val="24"/>
+    </w:rPr>
+  </w:style>
+  <w:style w:type="character" w:styleId="Strong">
+    <w:name w:val="Strong"/>
+    <w:basedOn w:val="DefaultParagraphFont"/>
+    <w:uiPriority w:val="22"/>
+    <w:qFormat/>
+    <w:rsid w:val="00E31E78"/>
+    <w:rPr>
+      <w:b/>
+      <w:bCs/>
+    </w:rPr>
+  </w:style>
+  <w:style w:type="character" w:customStyle="1" w:styleId="Heading3Char">
+    <w:name w:val="Heading 3 Char"/>
+    <w:basedOn w:val="DefaultParagraphFont"/>
+    <w:link w:val="Heading3"/>
+    <w:uiPriority w:val="9"/>
+    <w:semiHidden/>
+    <w:rsid w:val="00E31E78"/>
+    <w:rPr>
+      <w:rFonts w:asciiTheme="majorHAnsi" w:eastAsiaTheme="majorEastAsia" w:hAnsiTheme="majorHAnsi" w:cstheme="majorBidi"/>
+      <w:color w:val="1F4D78" w:themeColor="accent1" w:themeShade="7F"/>
+      <w:sz w:val="24"/>
+      <w:szCs w:val="24"/>
+    </w:rPr>
+  </w:style>
+  <w:style w:type="character" w:styleId="HTMLCode">
+    <w:name w:val="HTML Code"/>
+    <w:basedOn w:val="DefaultParagraphFont"/>
+    <w:uiPriority w:val="99"/>
+    <w:semiHidden/>
+    <w:unhideWhenUsed/>
+    <w:rsid w:val="00E31E78"/>
+    <w:rPr>
+      <w:rFonts w:ascii="Courier New" w:eastAsia="Times New Roman" w:hAnsi="Courier New" w:cs="Courier New"/>
+      <w:sz w:val="20"/>
+      <w:szCs w:val="20"/>
     </w:rPr>
   </w:style>
 </w:styles>

</xml_diff>